<commit_message>
Fix RSI/DBI nomenclature in user manual
- RSI = Ransomware Susceptibility Index (was incorrectly "Risk Severity Index")
- DBI = Data Breach Index (was incorrectly "Digital Business Index")

Co-Authored-By: Claude Opus 4.6 (1M context) <noreply@anthropic.com>
</commit_message>
<xml_diff>
--- a/security_scanner/Phishield_Cyber_Risk_Scanner_User_Manual.docx
+++ b/security_scanner/Phishield_Cyber_Risk_Scanner_User_Manual.docx
@@ -319,7 +319,7 @@
         <w:ind w:left="576"/>
       </w:pPr>
       <w:r>
-        <w:t>5.1  Risk Severity Index (RSI)</w:t>
+        <w:t>5.1  Ransomware Susceptibility Index (RSI)</w:t>
       </w:r>
     </w:p>
     <w:p>
@@ -335,7 +335,7 @@
         <w:ind w:left="576"/>
       </w:pPr>
       <w:r>
-        <w:t>5.3  Digital Business Index (DBI)</w:t>
+        <w:t>5.3  Data Breach Index (DBI)</w:t>
       </w:r>
     </w:p>
     <w:p>
@@ -575,7 +575,7 @@
         <w:pStyle w:val="ListParagraph"/>
       </w:pPr>
       <w:r>
-        <w:t>Premium Calibration -- Feed the scanner's Risk Severity Index (RSI), FAIR-model financial impact estimates, and Digital Business Index (DBI) into the premium calculation workflow so that pricing reflects actual technical risk rather than self-reported questionnaire answers alone.</w:t>
+        <w:t>Premium Calibration -- Feed the scanner's Ransomware Susceptibility Index (RSI), FAIR-model financial impact estimates, and Data Breach Index (DBI) into the premium calculation workflow so that pricing reflects actual technical risk rather than self-reported questionnaire answers alone.</w:t>
       </w:r>
     </w:p>
     <w:p>
@@ -755,7 +755,7 @@
         <w:t xml:space="preserve">Phase 6 -- Insurance Analytics. </w:t>
       </w:r>
       <w:r>
-        <w:t>The scanner calculates three insurance-specific metrics: the Risk Severity Index (RSI), which adjusts the technical score for industry risk and organisational size; FAIR-model financial impact estimates using Monte Carlo simulation with 10,000 iterations; and the Digital Business Index (DBI), which estimates the organisation's digital dependency. These analytics feed directly into premium calculation and underwriting decision-making.</w:t>
+        <w:t>The scanner calculates three insurance-specific metrics: the Ransomware Susceptibility Index (RSI), which adjusts the technical score for industry risk and organisational size; FAIR-model financial impact estimates using Monte Carlo simulation with 10,000 iterations; and the Data Breach Index (DBI), which estimates the organisation's digital dependency. These analytics feed directly into premium calculation and underwriting decision-making.</w:t>
       </w:r>
     </w:p>
     <w:p>
@@ -1294,7 +1294,7 @@
         <w:t xml:space="preserve">Industry (dropdown). </w:t>
       </w:r>
       <w:r>
-        <w:t>Select the industry that best describes the target organisation. The industry selection affects two important calculations: the Risk Severity Index (RSI) multiplier, which adjusts the risk score based on the threat landscape for that industry (financial services and healthcare face higher threat levels than agriculture, for example); and the FAIR model's threat event frequency and loss magnitude parameters, which vary significantly by sector. Available industries include Agriculture, Communications, Consumer, Education, Energy, Entertainment, Financial Services, Healthcare, Hospitality, Industrial/Manufacturing, Legal, Media, Pharmaceuticals, Public Sector, Research, Retail, Services, Technology, Transportation, Government, and Other.</w:t>
+        <w:t>Select the industry that best describes the target organisation. The industry selection affects two important calculations: the Ransomware Susceptibility Index (RSI) multiplier, which adjusts the risk score based on the threat landscape for that industry (financial services and healthcare face higher threat levels than agriculture, for example); and the FAIR model's threat event frequency and loss magnitude parameters, which vary significantly by sector. Available industries include Agriculture, Communications, Consumer, Education, Energy, Entertainment, Financial Services, Healthcare, Hospitality, Industrial/Manufacturing, Legal, Media, Pharmaceuticals, Public Sector, Research, Retail, Services, Technology, Transportation, Government, and Other.</w:t>
       </w:r>
     </w:p>
     <w:p>

</xml_diff>

<commit_message>
Fix manual formatting: consistent spacing, prevent orphaning
- Added keep_with_next on all headings and callouts to prevent
  orphaning across page breaks
- Added widow_control on all body text and bullets
- Consistent space_before on headings (h1=12pt, h2=10pt, h3=8pt)
- Consistent space_after throughout
- Font colours applied consistently in both helpers.py and
  generate_manual.py
- PDF regenerated with fixes

Co-Authored-By: Claude Opus 4.6 (1M context) <noreply@anthropic.com>
</commit_message>
<xml_diff>
--- a/security_scanner/Phishield_Cyber_Risk_Scanner_User_Manual.docx
+++ b/security_scanner/Phishield_Cyber_Risk_Scanner_User_Manual.docx
@@ -111,6 +111,10 @@
       </w:r>
     </w:p>
     <w:p>
+      <w:pPr>
+        <w:keepNext/>
+        <w:spacing w:before="240" w:after="80"/>
+      </w:pPr>
       <w:r>
         <w:rPr>
           <w:b/>
@@ -610,6 +614,10 @@
       </w:r>
     </w:p>
     <w:p>
+      <w:pPr>
+        <w:keepNext/>
+        <w:spacing w:before="240" w:after="80"/>
+      </w:pPr>
       <w:r>
         <w:rPr>
           <w:b/>
@@ -620,6 +628,10 @@
       </w:r>
     </w:p>
     <w:p>
+      <w:pPr>
+        <w:keepNext/>
+        <w:spacing w:before="200" w:after="60"/>
+      </w:pPr>
       <w:r>
         <w:rPr>
           <w:b/>
@@ -631,6 +643,7 @@
     </w:p>
     <w:p>
       <w:pPr>
+        <w:widowControl/>
         <w:spacing w:after="80"/>
       </w:pPr>
       <w:r>
@@ -639,6 +652,7 @@
     </w:p>
     <w:p>
       <w:pPr>
+        <w:widowControl/>
         <w:spacing w:after="80"/>
       </w:pPr>
       <w:r>
@@ -648,6 +662,7 @@
     <w:p>
       <w:pPr>
         <w:pStyle w:val="ListParagraph"/>
+        <w:widowControl/>
         <w:spacing w:after="40"/>
       </w:pPr>
       <w:r>
@@ -657,6 +672,7 @@
     <w:p>
       <w:pPr>
         <w:pStyle w:val="ListParagraph"/>
+        <w:widowControl/>
         <w:spacing w:after="40"/>
       </w:pPr>
       <w:r>
@@ -666,6 +682,7 @@
     <w:p>
       <w:pPr>
         <w:pStyle w:val="ListParagraph"/>
+        <w:widowControl/>
         <w:spacing w:after="40"/>
       </w:pPr>
       <w:r>
@@ -675,6 +692,7 @@
     <w:p>
       <w:pPr>
         <w:pStyle w:val="ListParagraph"/>
+        <w:widowControl/>
         <w:spacing w:after="40"/>
       </w:pPr>
       <w:r>
@@ -682,6 +700,10 @@
       </w:r>
     </w:p>
     <w:p>
+      <w:pPr>
+        <w:keepNext/>
+        <w:spacing w:before="200" w:after="60"/>
+      </w:pPr>
       <w:r>
         <w:rPr>
           <w:b/>
@@ -693,6 +715,7 @@
     </w:p>
     <w:p>
       <w:pPr>
+        <w:widowControl/>
         <w:spacing w:after="80"/>
       </w:pPr>
       <w:r>
@@ -702,6 +725,7 @@
     <w:p>
       <w:pPr>
         <w:pStyle w:val="ListParagraph"/>
+        <w:widowControl/>
         <w:spacing w:after="40"/>
       </w:pPr>
       <w:r>
@@ -711,6 +735,7 @@
     <w:p>
       <w:pPr>
         <w:pStyle w:val="ListParagraph"/>
+        <w:widowControl/>
         <w:spacing w:after="40"/>
       </w:pPr>
       <w:r>
@@ -720,6 +745,7 @@
     <w:p>
       <w:pPr>
         <w:pStyle w:val="ListParagraph"/>
+        <w:widowControl/>
         <w:spacing w:after="40"/>
       </w:pPr>
       <w:r>
@@ -729,6 +755,7 @@
     <w:p>
       <w:pPr>
         <w:pStyle w:val="ListParagraph"/>
+        <w:widowControl/>
         <w:spacing w:after="40"/>
       </w:pPr>
       <w:r>
@@ -737,6 +764,8 @@
     </w:p>
     <w:p>
       <w:pPr>
+        <w:keepNext/>
+        <w:widowControl/>
         <w:spacing w:after="80"/>
       </w:pPr>
       <w:r>
@@ -751,6 +780,10 @@
       </w:r>
     </w:p>
     <w:p>
+      <w:pPr>
+        <w:keepNext/>
+        <w:spacing w:before="200" w:after="60"/>
+      </w:pPr>
       <w:r>
         <w:rPr>
           <w:b/>
@@ -762,6 +795,7 @@
     </w:p>
     <w:p>
       <w:pPr>
+        <w:widowControl/>
         <w:spacing w:after="80"/>
       </w:pPr>
       <w:r>
@@ -771,6 +805,7 @@
     <w:p>
       <w:pPr>
         <w:pStyle w:val="ListParagraph"/>
+        <w:widowControl/>
         <w:spacing w:after="40"/>
       </w:pPr>
       <w:r>
@@ -780,6 +815,7 @@
     <w:p>
       <w:pPr>
         <w:pStyle w:val="ListParagraph"/>
+        <w:widowControl/>
         <w:spacing w:after="40"/>
       </w:pPr>
       <w:r>
@@ -789,6 +825,7 @@
     <w:p>
       <w:pPr>
         <w:pStyle w:val="ListParagraph"/>
+        <w:widowControl/>
         <w:spacing w:after="40"/>
       </w:pPr>
       <w:r>
@@ -798,6 +835,7 @@
     <w:p>
       <w:pPr>
         <w:pStyle w:val="ListParagraph"/>
+        <w:widowControl/>
         <w:spacing w:after="40"/>
       </w:pPr>
       <w:r>
@@ -806,6 +844,7 @@
     </w:p>
     <w:p>
       <w:pPr>
+        <w:widowControl/>
         <w:spacing w:after="80"/>
       </w:pPr>
       <w:r>
@@ -815,6 +854,7 @@
     <w:p>
       <w:pPr>
         <w:pStyle w:val="ListParagraph"/>
+        <w:widowControl/>
         <w:spacing w:after="40"/>
       </w:pPr>
       <w:r>
@@ -824,6 +864,7 @@
     <w:p>
       <w:pPr>
         <w:pStyle w:val="ListParagraph"/>
+        <w:widowControl/>
         <w:spacing w:after="40"/>
       </w:pPr>
       <w:r>
@@ -833,6 +874,7 @@
     <w:p>
       <w:pPr>
         <w:pStyle w:val="ListParagraph"/>
+        <w:widowControl/>
         <w:spacing w:after="40"/>
       </w:pPr>
       <w:r>
@@ -842,6 +884,7 @@
     <w:p>
       <w:pPr>
         <w:pStyle w:val="ListParagraph"/>
+        <w:widowControl/>
         <w:spacing w:after="40"/>
       </w:pPr>
       <w:r>
@@ -851,6 +894,7 @@
     <w:p>
       <w:pPr>
         <w:pStyle w:val="ListParagraph"/>
+        <w:widowControl/>
         <w:spacing w:after="40"/>
       </w:pPr>
       <w:r>
@@ -860,6 +904,7 @@
     <w:p>
       <w:pPr>
         <w:pStyle w:val="ListParagraph"/>
+        <w:widowControl/>
         <w:spacing w:after="40"/>
       </w:pPr>
       <w:r>
@@ -868,6 +913,8 @@
     </w:p>
     <w:p>
       <w:pPr>
+        <w:keepNext/>
+        <w:widowControl/>
         <w:spacing w:after="80"/>
       </w:pPr>
       <w:r>
@@ -882,6 +929,10 @@
       </w:r>
     </w:p>
     <w:p>
+      <w:pPr>
+        <w:keepNext/>
+        <w:spacing w:before="200" w:after="60"/>
+      </w:pPr>
       <w:r>
         <w:rPr>
           <w:b/>
@@ -893,6 +944,7 @@
     </w:p>
     <w:p>
       <w:pPr>
+        <w:widowControl/>
         <w:spacing w:after="80"/>
       </w:pPr>
       <w:r>
@@ -901,6 +953,7 @@
     </w:p>
     <w:p>
       <w:pPr>
+        <w:widowControl/>
         <w:spacing w:after="80"/>
       </w:pPr>
       <w:r>
@@ -1293,6 +1346,10 @@
     </w:tbl>
     <w:p/>
     <w:p>
+      <w:pPr>
+        <w:keepNext/>
+        <w:spacing w:before="200" w:after="60"/>
+      </w:pPr>
       <w:r>
         <w:rPr>
           <w:b/>
@@ -1304,6 +1361,7 @@
     </w:p>
     <w:p>
       <w:pPr>
+        <w:widowControl/>
         <w:spacing w:after="80"/>
       </w:pPr>
       <w:r>
@@ -1313,6 +1371,7 @@
     <w:p>
       <w:pPr>
         <w:pStyle w:val="ListParagraph"/>
+        <w:widowControl/>
         <w:spacing w:after="40"/>
       </w:pPr>
       <w:r>
@@ -1322,6 +1381,7 @@
     <w:p>
       <w:pPr>
         <w:pStyle w:val="ListParagraph"/>
+        <w:widowControl/>
         <w:spacing w:after="40"/>
       </w:pPr>
       <w:r>
@@ -1331,6 +1391,7 @@
     <w:p>
       <w:pPr>
         <w:pStyle w:val="ListParagraph"/>
+        <w:widowControl/>
         <w:spacing w:after="40"/>
       </w:pPr>
       <w:r>
@@ -1340,6 +1401,7 @@
     <w:p>
       <w:pPr>
         <w:pStyle w:val="ListParagraph"/>
+        <w:widowControl/>
         <w:spacing w:after="40"/>
       </w:pPr>
       <w:r>
@@ -1349,6 +1411,7 @@
     <w:p>
       <w:pPr>
         <w:pStyle w:val="ListParagraph"/>
+        <w:widowControl/>
         <w:spacing w:after="40"/>
       </w:pPr>
       <w:r>
@@ -1358,6 +1421,7 @@
     <w:p>
       <w:pPr>
         <w:pStyle w:val="ListParagraph"/>
+        <w:widowControl/>
         <w:spacing w:after="40"/>
       </w:pPr>
       <w:r>
@@ -1366,6 +1430,8 @@
     </w:p>
     <w:p>
       <w:pPr>
+        <w:keepNext/>
+        <w:widowControl/>
         <w:spacing w:after="80"/>
       </w:pPr>
       <w:r>
@@ -1385,6 +1451,10 @@
       </w:r>
     </w:p>
     <w:p>
+      <w:pPr>
+        <w:keepNext/>
+        <w:spacing w:before="240" w:after="80"/>
+      </w:pPr>
       <w:r>
         <w:rPr>
           <w:b/>
@@ -1395,6 +1465,10 @@
       </w:r>
     </w:p>
     <w:p>
+      <w:pPr>
+        <w:keepNext/>
+        <w:spacing w:before="200" w:after="60"/>
+      </w:pPr>
       <w:r>
         <w:rPr>
           <w:b/>
@@ -1406,6 +1480,7 @@
     </w:p>
     <w:p>
       <w:pPr>
+        <w:widowControl/>
         <w:spacing w:after="80"/>
       </w:pPr>
       <w:r>
@@ -1415,6 +1490,7 @@
     <w:p>
       <w:pPr>
         <w:pStyle w:val="ListParagraph"/>
+        <w:widowControl/>
         <w:spacing w:after="40"/>
       </w:pPr>
       <w:r>
@@ -1424,6 +1500,7 @@
     <w:p>
       <w:pPr>
         <w:pStyle w:val="ListParagraph"/>
+        <w:widowControl/>
         <w:spacing w:after="40"/>
       </w:pPr>
       <w:r>
@@ -1432,6 +1509,7 @@
     </w:p>
     <w:p>
       <w:pPr>
+        <w:widowControl/>
         <w:spacing w:after="80"/>
       </w:pPr>
       <w:r>
@@ -1439,6 +1517,10 @@
       </w:r>
     </w:p>
     <w:p>
+      <w:pPr>
+        <w:keepNext/>
+        <w:spacing w:before="200" w:after="60"/>
+      </w:pPr>
       <w:r>
         <w:rPr>
           <w:b/>
@@ -1450,6 +1532,7 @@
     </w:p>
     <w:p>
       <w:pPr>
+        <w:widowControl/>
         <w:spacing w:after="80"/>
       </w:pPr>
       <w:r>
@@ -1459,6 +1542,7 @@
     <w:p>
       <w:pPr>
         <w:pStyle w:val="ListParagraph"/>
+        <w:widowControl/>
         <w:spacing w:after="40"/>
       </w:pPr>
       <w:r>
@@ -1468,6 +1552,7 @@
     <w:p>
       <w:pPr>
         <w:pStyle w:val="ListParagraph"/>
+        <w:widowControl/>
         <w:spacing w:after="40"/>
       </w:pPr>
       <w:r>
@@ -1477,6 +1562,7 @@
     <w:p>
       <w:pPr>
         <w:pStyle w:val="ListParagraph"/>
+        <w:widowControl/>
         <w:spacing w:after="40"/>
       </w:pPr>
       <w:r>
@@ -1486,6 +1572,7 @@
     <w:p>
       <w:pPr>
         <w:pStyle w:val="ListParagraph"/>
+        <w:widowControl/>
         <w:spacing w:after="40"/>
       </w:pPr>
       <w:r>
@@ -1494,6 +1581,8 @@
     </w:p>
     <w:p>
       <w:pPr>
+        <w:keepNext/>
+        <w:widowControl/>
         <w:spacing w:after="80"/>
       </w:pPr>
       <w:r>
@@ -1508,6 +1597,10 @@
       </w:r>
     </w:p>
     <w:p>
+      <w:pPr>
+        <w:keepNext/>
+        <w:spacing w:before="200" w:after="60"/>
+      </w:pPr>
       <w:r>
         <w:rPr>
           <w:b/>
@@ -1519,6 +1612,7 @@
     </w:p>
     <w:p>
       <w:pPr>
+        <w:widowControl/>
         <w:spacing w:after="80"/>
       </w:pPr>
       <w:r>
@@ -1528,6 +1622,7 @@
     <w:p>
       <w:pPr>
         <w:pStyle w:val="ListParagraph"/>
+        <w:widowControl/>
         <w:spacing w:after="40"/>
       </w:pPr>
       <w:r>
@@ -1537,6 +1632,7 @@
     <w:p>
       <w:pPr>
         <w:pStyle w:val="ListParagraph"/>
+        <w:widowControl/>
         <w:spacing w:after="40"/>
       </w:pPr>
       <w:r>
@@ -1546,6 +1642,7 @@
     <w:p>
       <w:pPr>
         <w:pStyle w:val="ListParagraph"/>
+        <w:widowControl/>
         <w:spacing w:after="40"/>
       </w:pPr>
       <w:r>
@@ -1554,6 +1651,7 @@
     </w:p>
     <w:p>
       <w:pPr>
+        <w:widowControl/>
         <w:spacing w:after="80"/>
       </w:pPr>
       <w:r>
@@ -1561,6 +1659,10 @@
       </w:r>
     </w:p>
     <w:p>
+      <w:pPr>
+        <w:keepNext/>
+        <w:spacing w:before="200" w:after="60"/>
+      </w:pPr>
       <w:r>
         <w:rPr>
           <w:b/>
@@ -1572,6 +1674,7 @@
     </w:p>
     <w:p>
       <w:pPr>
+        <w:widowControl/>
         <w:spacing w:after="80"/>
       </w:pPr>
       <w:r>
@@ -2047,6 +2150,8 @@
     <w:p/>
     <w:p>
       <w:pPr>
+        <w:keepNext/>
+        <w:widowControl/>
         <w:spacing w:after="80"/>
       </w:pPr>
       <w:r>
@@ -2062,6 +2167,8 @@
     </w:p>
     <w:p>
       <w:pPr>
+        <w:keepNext/>
+        <w:widowControl/>
         <w:spacing w:after="80"/>
       </w:pPr>
       <w:r>
@@ -2081,6 +2188,10 @@
       </w:r>
     </w:p>
     <w:p>
+      <w:pPr>
+        <w:keepNext/>
+        <w:spacing w:before="240" w:after="80"/>
+      </w:pPr>
       <w:r>
         <w:rPr>
           <w:b/>
@@ -2091,6 +2202,10 @@
       </w:r>
     </w:p>
     <w:p>
+      <w:pPr>
+        <w:keepNext/>
+        <w:spacing w:before="200" w:after="60"/>
+      </w:pPr>
       <w:r>
         <w:rPr>
           <w:b/>
@@ -2102,6 +2217,7 @@
     </w:p>
     <w:p>
       <w:pPr>
+        <w:widowControl/>
         <w:spacing w:after="80"/>
       </w:pPr>
       <w:r>
@@ -2331,6 +2447,7 @@
     <w:p/>
     <w:p>
       <w:pPr>
+        <w:widowControl/>
         <w:spacing w:after="80"/>
       </w:pPr>
       <w:r>
@@ -2339,6 +2456,8 @@
     </w:p>
     <w:p>
       <w:pPr>
+        <w:keepNext/>
+        <w:widowControl/>
         <w:spacing w:after="80"/>
       </w:pPr>
       <w:r>
@@ -2353,6 +2472,10 @@
       </w:r>
     </w:p>
     <w:p>
+      <w:pPr>
+        <w:keepNext/>
+        <w:spacing w:before="200" w:after="60"/>
+      </w:pPr>
       <w:r>
         <w:rPr>
           <w:b/>
@@ -2364,6 +2487,7 @@
     </w:p>
     <w:p>
       <w:pPr>
+        <w:widowControl/>
         <w:spacing w:after="80"/>
       </w:pPr>
       <w:r>
@@ -2373,6 +2497,7 @@
     <w:p>
       <w:pPr>
         <w:pStyle w:val="ListParagraph"/>
+        <w:widowControl/>
         <w:spacing w:after="40"/>
       </w:pPr>
       <w:r>
@@ -2382,6 +2507,7 @@
     <w:p>
       <w:pPr>
         <w:pStyle w:val="ListParagraph"/>
+        <w:widowControl/>
         <w:spacing w:after="40"/>
       </w:pPr>
       <w:r>
@@ -2391,6 +2517,7 @@
     <w:p>
       <w:pPr>
         <w:pStyle w:val="ListParagraph"/>
+        <w:widowControl/>
         <w:spacing w:after="40"/>
       </w:pPr>
       <w:r>
@@ -2400,6 +2527,7 @@
     <w:p>
       <w:pPr>
         <w:pStyle w:val="ListParagraph"/>
+        <w:widowControl/>
         <w:spacing w:after="40"/>
       </w:pPr>
       <w:r>
@@ -2409,6 +2537,7 @@
     <w:p>
       <w:pPr>
         <w:pStyle w:val="ListParagraph"/>
+        <w:widowControl/>
         <w:spacing w:after="40"/>
       </w:pPr>
       <w:r>
@@ -2418,6 +2547,7 @@
     <w:p>
       <w:pPr>
         <w:pStyle w:val="ListParagraph"/>
+        <w:widowControl/>
         <w:spacing w:after="40"/>
       </w:pPr>
       <w:r>
@@ -2427,6 +2557,7 @@
     <w:p>
       <w:pPr>
         <w:pStyle w:val="ListParagraph"/>
+        <w:widowControl/>
         <w:spacing w:after="40"/>
       </w:pPr>
       <w:r>
@@ -2436,6 +2567,7 @@
     <w:p>
       <w:pPr>
         <w:pStyle w:val="ListParagraph"/>
+        <w:widowControl/>
         <w:spacing w:after="40"/>
       </w:pPr>
       <w:r>
@@ -2445,6 +2577,7 @@
     <w:p>
       <w:pPr>
         <w:pStyle w:val="ListParagraph"/>
+        <w:widowControl/>
         <w:spacing w:after="40"/>
       </w:pPr>
       <w:r>
@@ -2454,6 +2587,7 @@
     <w:p>
       <w:pPr>
         <w:pStyle w:val="ListParagraph"/>
+        <w:widowControl/>
         <w:spacing w:after="40"/>
       </w:pPr>
       <w:r>
@@ -2463,6 +2597,7 @@
     <w:p>
       <w:pPr>
         <w:pStyle w:val="ListParagraph"/>
+        <w:widowControl/>
         <w:spacing w:after="40"/>
       </w:pPr>
       <w:r>
@@ -2470,6 +2605,10 @@
       </w:r>
     </w:p>
     <w:p>
+      <w:pPr>
+        <w:keepNext/>
+        <w:spacing w:before="200" w:after="60"/>
+      </w:pPr>
       <w:r>
         <w:rPr>
           <w:b/>
@@ -2481,6 +2620,7 @@
     </w:p>
     <w:p>
       <w:pPr>
+        <w:widowControl/>
         <w:spacing w:after="80"/>
       </w:pPr>
       <w:r>
@@ -2490,6 +2630,7 @@
     <w:p>
       <w:pPr>
         <w:pStyle w:val="ListParagraph"/>
+        <w:widowControl/>
         <w:spacing w:after="40"/>
       </w:pPr>
       <w:r>
@@ -2499,6 +2640,7 @@
     <w:p>
       <w:pPr>
         <w:pStyle w:val="ListParagraph"/>
+        <w:widowControl/>
         <w:spacing w:after="40"/>
       </w:pPr>
       <w:r>
@@ -2508,6 +2650,7 @@
     <w:p>
       <w:pPr>
         <w:pStyle w:val="ListParagraph"/>
+        <w:widowControl/>
         <w:spacing w:after="40"/>
       </w:pPr>
       <w:r>
@@ -2517,6 +2660,7 @@
     <w:p>
       <w:pPr>
         <w:pStyle w:val="ListParagraph"/>
+        <w:widowControl/>
         <w:spacing w:after="40"/>
       </w:pPr>
       <w:r>
@@ -2526,6 +2670,7 @@
     <w:p>
       <w:pPr>
         <w:pStyle w:val="ListParagraph"/>
+        <w:widowControl/>
         <w:spacing w:after="40"/>
       </w:pPr>
       <w:r>
@@ -2535,6 +2680,7 @@
     <w:p>
       <w:pPr>
         <w:pStyle w:val="ListParagraph"/>
+        <w:widowControl/>
         <w:spacing w:after="40"/>
       </w:pPr>
       <w:r>
@@ -2543,6 +2689,8 @@
     </w:p>
     <w:p>
       <w:pPr>
+        <w:keepNext/>
+        <w:widowControl/>
         <w:spacing w:after="80"/>
       </w:pPr>
       <w:r>
@@ -2557,6 +2705,10 @@
       </w:r>
     </w:p>
     <w:p>
+      <w:pPr>
+        <w:keepNext/>
+        <w:spacing w:before="200" w:after="60"/>
+      </w:pPr>
       <w:r>
         <w:rPr>
           <w:b/>
@@ -2568,6 +2720,7 @@
     </w:p>
     <w:p>
       <w:pPr>
+        <w:widowControl/>
         <w:spacing w:after="80"/>
       </w:pPr>
       <w:r>
@@ -2577,6 +2730,7 @@
     <w:p>
       <w:pPr>
         <w:pStyle w:val="ListParagraph"/>
+        <w:widowControl/>
         <w:spacing w:after="40"/>
       </w:pPr>
       <w:r>
@@ -2586,6 +2740,7 @@
     <w:p>
       <w:pPr>
         <w:pStyle w:val="ListParagraph"/>
+        <w:widowControl/>
         <w:spacing w:after="40"/>
       </w:pPr>
       <w:r>
@@ -2595,6 +2750,7 @@
     <w:p>
       <w:pPr>
         <w:pStyle w:val="ListParagraph"/>
+        <w:widowControl/>
         <w:spacing w:after="40"/>
       </w:pPr>
       <w:r>
@@ -2604,6 +2760,7 @@
     <w:p>
       <w:pPr>
         <w:pStyle w:val="ListParagraph"/>
+        <w:widowControl/>
         <w:spacing w:after="40"/>
       </w:pPr>
       <w:r>
@@ -2613,6 +2770,7 @@
     <w:p>
       <w:pPr>
         <w:pStyle w:val="ListParagraph"/>
+        <w:widowControl/>
         <w:spacing w:after="40"/>
       </w:pPr>
       <w:r>
@@ -2620,6 +2778,10 @@
       </w:r>
     </w:p>
     <w:p>
+      <w:pPr>
+        <w:keepNext/>
+        <w:spacing w:before="200" w:after="60"/>
+      </w:pPr>
       <w:r>
         <w:rPr>
           <w:b/>
@@ -2631,6 +2793,7 @@
     </w:p>
     <w:p>
       <w:pPr>
+        <w:widowControl/>
         <w:spacing w:after="80"/>
       </w:pPr>
       <w:r>
@@ -2640,6 +2803,7 @@
     <w:p>
       <w:pPr>
         <w:pStyle w:val="ListParagraph"/>
+        <w:widowControl/>
         <w:spacing w:after="40"/>
       </w:pPr>
       <w:r>
@@ -2649,6 +2813,7 @@
     <w:p>
       <w:pPr>
         <w:pStyle w:val="ListParagraph"/>
+        <w:widowControl/>
         <w:spacing w:after="40"/>
       </w:pPr>
       <w:r>
@@ -2658,6 +2823,7 @@
     <w:p>
       <w:pPr>
         <w:pStyle w:val="ListParagraph"/>
+        <w:widowControl/>
         <w:spacing w:after="40"/>
       </w:pPr>
       <w:r>
@@ -2667,6 +2833,7 @@
     <w:p>
       <w:pPr>
         <w:pStyle w:val="ListParagraph"/>
+        <w:widowControl/>
         <w:spacing w:after="40"/>
       </w:pPr>
       <w:r>
@@ -2675,6 +2842,7 @@
     </w:p>
     <w:p>
       <w:pPr>
+        <w:widowControl/>
         <w:spacing w:after="80"/>
       </w:pPr>
       <w:r>
@@ -2687,6 +2855,10 @@
       </w:r>
     </w:p>
     <w:p>
+      <w:pPr>
+        <w:keepNext/>
+        <w:spacing w:before="240" w:after="80"/>
+      </w:pPr>
       <w:r>
         <w:rPr>
           <w:b/>
@@ -2698,6 +2870,7 @@
     </w:p>
     <w:p>
       <w:pPr>
+        <w:widowControl/>
         <w:spacing w:after="80"/>
       </w:pPr>
       <w:r>
@@ -2705,6 +2878,10 @@
       </w:r>
     </w:p>
     <w:p>
+      <w:pPr>
+        <w:keepNext/>
+        <w:spacing w:before="200" w:after="60"/>
+      </w:pPr>
       <w:r>
         <w:rPr>
           <w:b/>
@@ -2715,6 +2892,10 @@
       </w:r>
     </w:p>
     <w:p>
+      <w:pPr>
+        <w:keepNext/>
+        <w:spacing w:before="160" w:after="40"/>
+      </w:pPr>
       <w:r>
         <w:rPr>
           <w:b/>
@@ -2726,6 +2907,7 @@
     </w:p>
     <w:p>
       <w:pPr>
+        <w:widowControl/>
         <w:spacing w:after="80"/>
       </w:pPr>
       <w:r>
@@ -2734,6 +2916,7 @@
     </w:p>
     <w:p>
       <w:pPr>
+        <w:widowControl/>
         <w:spacing w:after="80"/>
       </w:pPr>
       <w:r>
@@ -2742,6 +2925,8 @@
     </w:p>
     <w:p>
       <w:pPr>
+        <w:keepNext/>
+        <w:widowControl/>
         <w:spacing w:after="80"/>
       </w:pPr>
       <w:r>
@@ -2756,6 +2941,10 @@
       </w:r>
     </w:p>
     <w:p>
+      <w:pPr>
+        <w:keepNext/>
+        <w:spacing w:before="160" w:after="40"/>
+      </w:pPr>
       <w:r>
         <w:rPr>
           <w:b/>
@@ -2767,6 +2956,7 @@
     </w:p>
     <w:p>
       <w:pPr>
+        <w:widowControl/>
         <w:spacing w:after="80"/>
       </w:pPr>
       <w:r>
@@ -2775,6 +2965,7 @@
     </w:p>
     <w:p>
       <w:pPr>
+        <w:widowControl/>
         <w:spacing w:after="80"/>
       </w:pPr>
       <w:r>
@@ -2783,6 +2974,7 @@
     </w:p>
     <w:p>
       <w:pPr>
+        <w:widowControl/>
         <w:spacing w:after="80"/>
       </w:pPr>
       <w:r>
@@ -2790,6 +2982,10 @@
       </w:r>
     </w:p>
     <w:p>
+      <w:pPr>
+        <w:keepNext/>
+        <w:spacing w:before="200" w:after="60"/>
+      </w:pPr>
       <w:r>
         <w:rPr>
           <w:b/>
@@ -2800,6 +2996,10 @@
       </w:r>
     </w:p>
     <w:p>
+      <w:pPr>
+        <w:keepNext/>
+        <w:spacing w:before="160" w:after="40"/>
+      </w:pPr>
       <w:r>
         <w:rPr>
           <w:b/>
@@ -2811,6 +3011,7 @@
     </w:p>
     <w:p>
       <w:pPr>
+        <w:widowControl/>
         <w:spacing w:after="80"/>
       </w:pPr>
       <w:r>
@@ -2820,6 +3021,7 @@
     <w:p>
       <w:pPr>
         <w:pStyle w:val="ListParagraph"/>
+        <w:widowControl/>
         <w:spacing w:after="40"/>
       </w:pPr>
       <w:r>
@@ -2829,6 +3031,7 @@
     <w:p>
       <w:pPr>
         <w:pStyle w:val="ListParagraph"/>
+        <w:widowControl/>
         <w:spacing w:after="40"/>
       </w:pPr>
       <w:r>
@@ -2838,6 +3041,7 @@
     <w:p>
       <w:pPr>
         <w:pStyle w:val="ListParagraph"/>
+        <w:widowControl/>
         <w:spacing w:after="40"/>
       </w:pPr>
       <w:r>
@@ -2847,6 +3051,7 @@
     <w:p>
       <w:pPr>
         <w:pStyle w:val="ListParagraph"/>
+        <w:widowControl/>
         <w:spacing w:after="40"/>
       </w:pPr>
       <w:r>
@@ -2856,6 +3061,7 @@
     <w:p>
       <w:pPr>
         <w:pStyle w:val="ListParagraph"/>
+        <w:widowControl/>
         <w:spacing w:after="40"/>
       </w:pPr>
       <w:r>
@@ -2865,6 +3071,7 @@
     <w:p>
       <w:pPr>
         <w:pStyle w:val="ListParagraph"/>
+        <w:widowControl/>
         <w:spacing w:after="40"/>
       </w:pPr>
       <w:r>
@@ -2874,6 +3081,7 @@
     <w:p>
       <w:pPr>
         <w:pStyle w:val="ListParagraph"/>
+        <w:widowControl/>
         <w:spacing w:after="40"/>
       </w:pPr>
       <w:r>
@@ -2883,6 +3091,7 @@
     <w:p>
       <w:pPr>
         <w:pStyle w:val="ListParagraph"/>
+        <w:widowControl/>
         <w:spacing w:after="40"/>
       </w:pPr>
       <w:r>
@@ -2891,6 +3100,7 @@
     </w:p>
     <w:p>
       <w:pPr>
+        <w:widowControl/>
         <w:spacing w:after="80"/>
       </w:pPr>
       <w:r>
@@ -2899,6 +3109,7 @@
     </w:p>
     <w:p>
       <w:pPr>
+        <w:widowControl/>
         <w:spacing w:after="80"/>
       </w:pPr>
       <w:r>
@@ -2907,6 +3118,8 @@
     </w:p>
     <w:p>
       <w:pPr>
+        <w:keepNext/>
+        <w:widowControl/>
         <w:spacing w:after="80"/>
       </w:pPr>
       <w:r>
@@ -2921,6 +3134,10 @@
       </w:r>
     </w:p>
     <w:p>
+      <w:pPr>
+        <w:keepNext/>
+        <w:spacing w:before="160" w:after="40"/>
+      </w:pPr>
       <w:r>
         <w:rPr>
           <w:b/>
@@ -2932,6 +3149,7 @@
     </w:p>
     <w:p>
       <w:pPr>
+        <w:widowControl/>
         <w:spacing w:after="80"/>
       </w:pPr>
       <w:r>
@@ -2941,6 +3159,7 @@
     <w:p>
       <w:pPr>
         <w:pStyle w:val="ListParagraph"/>
+        <w:widowControl/>
         <w:spacing w:after="40"/>
       </w:pPr>
       <w:r>
@@ -2950,6 +3169,7 @@
     <w:p>
       <w:pPr>
         <w:pStyle w:val="ListParagraph"/>
+        <w:widowControl/>
         <w:spacing w:after="40"/>
       </w:pPr>
       <w:r>
@@ -2959,6 +3179,7 @@
     <w:p>
       <w:pPr>
         <w:pStyle w:val="ListParagraph"/>
+        <w:widowControl/>
         <w:spacing w:after="40"/>
       </w:pPr>
       <w:r>
@@ -2968,6 +3189,7 @@
     <w:p>
       <w:pPr>
         <w:pStyle w:val="ListParagraph"/>
+        <w:widowControl/>
         <w:spacing w:after="40"/>
       </w:pPr>
       <w:r>
@@ -2977,6 +3199,7 @@
     <w:p>
       <w:pPr>
         <w:pStyle w:val="ListParagraph"/>
+        <w:widowControl/>
         <w:spacing w:after="40"/>
       </w:pPr>
       <w:r>
@@ -2986,6 +3209,7 @@
     <w:p>
       <w:pPr>
         <w:pStyle w:val="ListParagraph"/>
+        <w:widowControl/>
         <w:spacing w:after="40"/>
       </w:pPr>
       <w:r>
@@ -2995,6 +3219,7 @@
     <w:p>
       <w:pPr>
         <w:pStyle w:val="ListParagraph"/>
+        <w:widowControl/>
         <w:spacing w:after="40"/>
       </w:pPr>
       <w:r>
@@ -3003,6 +3228,7 @@
     </w:p>
     <w:p>
       <w:pPr>
+        <w:widowControl/>
         <w:spacing w:after="80"/>
       </w:pPr>
       <w:r>
@@ -3010,6 +3236,10 @@
       </w:r>
     </w:p>
     <w:p>
+      <w:pPr>
+        <w:keepNext/>
+        <w:spacing w:before="160" w:after="40"/>
+      </w:pPr>
       <w:r>
         <w:rPr>
           <w:b/>
@@ -3021,6 +3251,7 @@
     </w:p>
     <w:p>
       <w:pPr>
+        <w:widowControl/>
         <w:spacing w:after="80"/>
       </w:pPr>
       <w:r>
@@ -3029,6 +3260,7 @@
     </w:p>
     <w:p>
       <w:pPr>
+        <w:widowControl/>
         <w:spacing w:after="80"/>
       </w:pPr>
       <w:r>
@@ -3037,6 +3269,7 @@
     </w:p>
     <w:p>
       <w:pPr>
+        <w:widowControl/>
         <w:spacing w:after="80"/>
       </w:pPr>
       <w:r>
@@ -3044,6 +3277,10 @@
       </w:r>
     </w:p>
     <w:p>
+      <w:pPr>
+        <w:keepNext/>
+        <w:spacing w:before="160" w:after="40"/>
+      </w:pPr>
       <w:r>
         <w:rPr>
           <w:b/>
@@ -3055,6 +3292,7 @@
     </w:p>
     <w:p>
       <w:pPr>
+        <w:widowControl/>
         <w:spacing w:after="80"/>
       </w:pPr>
       <w:r>
@@ -3064,6 +3302,7 @@
     <w:p>
       <w:pPr>
         <w:pStyle w:val="ListParagraph"/>
+        <w:widowControl/>
         <w:spacing w:after="40"/>
       </w:pPr>
       <w:r>
@@ -3073,6 +3312,7 @@
     <w:p>
       <w:pPr>
         <w:pStyle w:val="ListParagraph"/>
+        <w:widowControl/>
         <w:spacing w:after="40"/>
       </w:pPr>
       <w:r>
@@ -3082,6 +3322,7 @@
     <w:p>
       <w:pPr>
         <w:pStyle w:val="ListParagraph"/>
+        <w:widowControl/>
         <w:spacing w:after="40"/>
       </w:pPr>
       <w:r>
@@ -3090,6 +3331,7 @@
     </w:p>
     <w:p>
       <w:pPr>
+        <w:widowControl/>
         <w:spacing w:after="80"/>
       </w:pPr>
       <w:r>
@@ -3097,6 +3339,10 @@
       </w:r>
     </w:p>
     <w:p>
+      <w:pPr>
+        <w:keepNext/>
+        <w:spacing w:before="200" w:after="60"/>
+      </w:pPr>
       <w:r>
         <w:rPr>
           <w:b/>
@@ -3107,6 +3353,10 @@
       </w:r>
     </w:p>
     <w:p>
+      <w:pPr>
+        <w:keepNext/>
+        <w:spacing w:before="160" w:after="40"/>
+      </w:pPr>
       <w:r>
         <w:rPr>
           <w:b/>
@@ -3118,6 +3368,7 @@
     </w:p>
     <w:p>
       <w:pPr>
+        <w:widowControl/>
         <w:spacing w:after="80"/>
       </w:pPr>
       <w:r>
@@ -3127,6 +3378,7 @@
     <w:p>
       <w:pPr>
         <w:pStyle w:val="ListParagraph"/>
+        <w:widowControl/>
         <w:spacing w:after="40"/>
       </w:pPr>
       <w:r>
@@ -3136,6 +3388,7 @@
     <w:p>
       <w:pPr>
         <w:pStyle w:val="ListParagraph"/>
+        <w:widowControl/>
         <w:spacing w:after="40"/>
       </w:pPr>
       <w:r>
@@ -3145,6 +3398,7 @@
     <w:p>
       <w:pPr>
         <w:pStyle w:val="ListParagraph"/>
+        <w:widowControl/>
         <w:spacing w:after="40"/>
       </w:pPr>
       <w:r>
@@ -3154,6 +3408,7 @@
     <w:p>
       <w:pPr>
         <w:pStyle w:val="ListParagraph"/>
+        <w:widowControl/>
         <w:spacing w:after="40"/>
       </w:pPr>
       <w:r>
@@ -3163,6 +3418,7 @@
     <w:p>
       <w:pPr>
         <w:pStyle w:val="ListParagraph"/>
+        <w:widowControl/>
         <w:spacing w:after="40"/>
       </w:pPr>
       <w:r>
@@ -3171,6 +3427,7 @@
     </w:p>
     <w:p>
       <w:pPr>
+        <w:widowControl/>
         <w:spacing w:after="80"/>
       </w:pPr>
       <w:r>
@@ -3179,6 +3436,8 @@
     </w:p>
     <w:p>
       <w:pPr>
+        <w:keepNext/>
+        <w:widowControl/>
         <w:spacing w:after="80"/>
       </w:pPr>
       <w:r>
@@ -3193,6 +3452,10 @@
       </w:r>
     </w:p>
     <w:p>
+      <w:pPr>
+        <w:keepNext/>
+        <w:spacing w:before="200" w:after="60"/>
+      </w:pPr>
       <w:r>
         <w:rPr>
           <w:b/>
@@ -3203,6 +3466,10 @@
       </w:r>
     </w:p>
     <w:p>
+      <w:pPr>
+        <w:keepNext/>
+        <w:spacing w:before="160" w:after="40"/>
+      </w:pPr>
       <w:r>
         <w:rPr>
           <w:b/>
@@ -3214,6 +3481,7 @@
     </w:p>
     <w:p>
       <w:pPr>
+        <w:widowControl/>
         <w:spacing w:after="80"/>
       </w:pPr>
       <w:r>
@@ -3223,6 +3491,7 @@
     <w:p>
       <w:pPr>
         <w:pStyle w:val="ListParagraph"/>
+        <w:widowControl/>
         <w:spacing w:after="40"/>
       </w:pPr>
       <w:r>
@@ -3232,6 +3501,7 @@
     <w:p>
       <w:pPr>
         <w:pStyle w:val="ListParagraph"/>
+        <w:widowControl/>
         <w:spacing w:after="40"/>
       </w:pPr>
       <w:r>
@@ -3241,6 +3511,7 @@
     <w:p>
       <w:pPr>
         <w:pStyle w:val="ListParagraph"/>
+        <w:widowControl/>
         <w:spacing w:after="40"/>
       </w:pPr>
       <w:r>
@@ -3249,6 +3520,7 @@
     </w:p>
     <w:p>
       <w:pPr>
+        <w:widowControl/>
         <w:spacing w:after="80"/>
       </w:pPr>
       <w:r>
@@ -3257,6 +3529,7 @@
     </w:p>
     <w:p>
       <w:pPr>
+        <w:widowControl/>
         <w:spacing w:after="80"/>
       </w:pPr>
       <w:r>
@@ -3266,6 +3539,7 @@
     <w:p>
       <w:pPr>
         <w:pStyle w:val="ListParagraph"/>
+        <w:widowControl/>
         <w:spacing w:after="40"/>
       </w:pPr>
       <w:r>
@@ -3275,6 +3549,7 @@
     <w:p>
       <w:pPr>
         <w:pStyle w:val="ListParagraph"/>
+        <w:widowControl/>
         <w:spacing w:after="40"/>
       </w:pPr>
       <w:r>
@@ -3284,6 +3559,7 @@
     <w:p>
       <w:pPr>
         <w:pStyle w:val="ListParagraph"/>
+        <w:widowControl/>
         <w:spacing w:after="40"/>
       </w:pPr>
       <w:r>
@@ -3293,6 +3569,7 @@
     <w:p>
       <w:pPr>
         <w:pStyle w:val="ListParagraph"/>
+        <w:widowControl/>
         <w:spacing w:after="40"/>
       </w:pPr>
       <w:r>
@@ -3301,6 +3578,8 @@
     </w:p>
     <w:p>
       <w:pPr>
+        <w:keepNext/>
+        <w:widowControl/>
         <w:spacing w:after="80"/>
       </w:pPr>
       <w:r>
@@ -3315,6 +3594,10 @@
       </w:r>
     </w:p>
     <w:p>
+      <w:pPr>
+        <w:keepNext/>
+        <w:spacing w:before="160" w:after="40"/>
+      </w:pPr>
       <w:r>
         <w:rPr>
           <w:b/>
@@ -3326,6 +3609,7 @@
     </w:p>
     <w:p>
       <w:pPr>
+        <w:widowControl/>
         <w:spacing w:after="80"/>
       </w:pPr>
       <w:r>
@@ -3335,6 +3619,7 @@
     <w:p>
       <w:pPr>
         <w:pStyle w:val="ListParagraph"/>
+        <w:widowControl/>
         <w:spacing w:after="40"/>
       </w:pPr>
       <w:r>
@@ -3344,6 +3629,7 @@
     <w:p>
       <w:pPr>
         <w:pStyle w:val="ListParagraph"/>
+        <w:widowControl/>
         <w:spacing w:after="40"/>
       </w:pPr>
       <w:r>
@@ -3353,6 +3639,7 @@
     <w:p>
       <w:pPr>
         <w:pStyle w:val="ListParagraph"/>
+        <w:widowControl/>
         <w:spacing w:after="40"/>
       </w:pPr>
       <w:r>
@@ -3362,6 +3649,7 @@
     <w:p>
       <w:pPr>
         <w:pStyle w:val="ListParagraph"/>
+        <w:widowControl/>
         <w:spacing w:after="40"/>
       </w:pPr>
       <w:r>
@@ -3370,6 +3658,7 @@
     </w:p>
     <w:p>
       <w:pPr>
+        <w:widowControl/>
         <w:spacing w:after="80"/>
       </w:pPr>
       <w:r>
@@ -3377,6 +3666,10 @@
       </w:r>
     </w:p>
     <w:p>
+      <w:pPr>
+        <w:keepNext/>
+        <w:spacing w:before="200" w:after="60"/>
+      </w:pPr>
       <w:r>
         <w:rPr>
           <w:b/>
@@ -3387,6 +3680,10 @@
       </w:r>
     </w:p>
     <w:p>
+      <w:pPr>
+        <w:keepNext/>
+        <w:spacing w:before="160" w:after="40"/>
+      </w:pPr>
       <w:r>
         <w:rPr>
           <w:b/>
@@ -3398,6 +3695,7 @@
     </w:p>
     <w:p>
       <w:pPr>
+        <w:widowControl/>
         <w:spacing w:after="80"/>
       </w:pPr>
       <w:r>
@@ -3407,6 +3705,7 @@
     <w:p>
       <w:pPr>
         <w:pStyle w:val="ListParagraph"/>
+        <w:widowControl/>
         <w:spacing w:after="40"/>
       </w:pPr>
       <w:r>
@@ -3416,6 +3715,7 @@
     <w:p>
       <w:pPr>
         <w:pStyle w:val="ListParagraph"/>
+        <w:widowControl/>
         <w:spacing w:after="40"/>
       </w:pPr>
       <w:r>
@@ -3425,6 +3725,7 @@
     <w:p>
       <w:pPr>
         <w:pStyle w:val="ListParagraph"/>
+        <w:widowControl/>
         <w:spacing w:after="40"/>
       </w:pPr>
       <w:r>
@@ -3434,6 +3735,7 @@
     <w:p>
       <w:pPr>
         <w:pStyle w:val="ListParagraph"/>
+        <w:widowControl/>
         <w:spacing w:after="40"/>
       </w:pPr>
       <w:r>
@@ -3443,6 +3745,7 @@
     <w:p>
       <w:pPr>
         <w:pStyle w:val="ListParagraph"/>
+        <w:widowControl/>
         <w:spacing w:after="40"/>
       </w:pPr>
       <w:r>
@@ -3451,6 +3754,7 @@
     </w:p>
     <w:p>
       <w:pPr>
+        <w:widowControl/>
         <w:spacing w:after="80"/>
       </w:pPr>
       <w:r>
@@ -3459,6 +3763,8 @@
     </w:p>
     <w:p>
       <w:pPr>
+        <w:keepNext/>
+        <w:widowControl/>
         <w:spacing w:after="80"/>
       </w:pPr>
       <w:r>
@@ -3473,6 +3779,10 @@
       </w:r>
     </w:p>
     <w:p>
+      <w:pPr>
+        <w:keepNext/>
+        <w:spacing w:before="160" w:after="40"/>
+      </w:pPr>
       <w:r>
         <w:rPr>
           <w:b/>
@@ -3484,6 +3794,7 @@
     </w:p>
     <w:p>
       <w:pPr>
+        <w:widowControl/>
         <w:spacing w:after="80"/>
       </w:pPr>
       <w:r>
@@ -4123,6 +4434,7 @@
     <w:p/>
     <w:p>
       <w:pPr>
+        <w:widowControl/>
         <w:spacing w:after="80"/>
       </w:pPr>
       <w:r>
@@ -4130,6 +4442,10 @@
       </w:r>
     </w:p>
     <w:p>
+      <w:pPr>
+        <w:keepNext/>
+        <w:spacing w:before="160" w:after="40"/>
+      </w:pPr>
       <w:r>
         <w:rPr>
           <w:b/>
@@ -4141,6 +4457,7 @@
     </w:p>
     <w:p>
       <w:pPr>
+        <w:widowControl/>
         <w:spacing w:after="80"/>
       </w:pPr>
       <w:r>
@@ -4148,6 +4465,10 @@
       </w:r>
     </w:p>
     <w:p>
+      <w:pPr>
+        <w:keepNext/>
+        <w:spacing w:before="160" w:after="40"/>
+      </w:pPr>
       <w:r>
         <w:rPr>
           <w:b/>
@@ -4159,6 +4480,7 @@
     </w:p>
     <w:p>
       <w:pPr>
+        <w:widowControl/>
         <w:spacing w:after="80"/>
       </w:pPr>
       <w:r>
@@ -4167,6 +4489,7 @@
     </w:p>
     <w:p>
       <w:pPr>
+        <w:widowControl/>
         <w:spacing w:after="80"/>
       </w:pPr>
       <w:r>
@@ -4174,6 +4497,10 @@
       </w:r>
     </w:p>
     <w:p>
+      <w:pPr>
+        <w:keepNext/>
+        <w:spacing w:before="160" w:after="40"/>
+      </w:pPr>
       <w:r>
         <w:rPr>
           <w:b/>
@@ -4185,6 +4512,7 @@
     </w:p>
     <w:p>
       <w:pPr>
+        <w:widowControl/>
         <w:spacing w:after="80"/>
       </w:pPr>
       <w:r>
@@ -4193,6 +4521,7 @@
     </w:p>
     <w:p>
       <w:pPr>
+        <w:widowControl/>
         <w:spacing w:after="80"/>
       </w:pPr>
       <w:r>
@@ -4200,6 +4529,10 @@
       </w:r>
     </w:p>
     <w:p>
+      <w:pPr>
+        <w:keepNext/>
+        <w:spacing w:before="160" w:after="40"/>
+      </w:pPr>
       <w:r>
         <w:rPr>
           <w:b/>
@@ -4211,6 +4544,7 @@
     </w:p>
     <w:p>
       <w:pPr>
+        <w:widowControl/>
         <w:spacing w:after="80"/>
       </w:pPr>
       <w:r>
@@ -4220,6 +4554,7 @@
     <w:p>
       <w:pPr>
         <w:pStyle w:val="ListParagraph"/>
+        <w:widowControl/>
         <w:spacing w:after="40"/>
       </w:pPr>
       <w:r>
@@ -4229,6 +4564,7 @@
     <w:p>
       <w:pPr>
         <w:pStyle w:val="ListParagraph"/>
+        <w:widowControl/>
         <w:spacing w:after="40"/>
       </w:pPr>
       <w:r>
@@ -4238,6 +4574,7 @@
     <w:p>
       <w:pPr>
         <w:pStyle w:val="ListParagraph"/>
+        <w:widowControl/>
         <w:spacing w:after="40"/>
       </w:pPr>
       <w:r>
@@ -4247,6 +4584,7 @@
     <w:p>
       <w:pPr>
         <w:pStyle w:val="ListParagraph"/>
+        <w:widowControl/>
         <w:spacing w:after="40"/>
       </w:pPr>
       <w:r>
@@ -4256,6 +4594,7 @@
     <w:p>
       <w:pPr>
         <w:pStyle w:val="ListParagraph"/>
+        <w:widowControl/>
         <w:spacing w:after="40"/>
       </w:pPr>
       <w:r>
@@ -4265,6 +4604,7 @@
     <w:p>
       <w:pPr>
         <w:pStyle w:val="ListParagraph"/>
+        <w:widowControl/>
         <w:spacing w:after="40"/>
       </w:pPr>
       <w:r>
@@ -4274,6 +4614,7 @@
     <w:p>
       <w:pPr>
         <w:pStyle w:val="ListParagraph"/>
+        <w:widowControl/>
         <w:spacing w:after="40"/>
       </w:pPr>
       <w:r>
@@ -4282,6 +4623,7 @@
     </w:p>
     <w:p>
       <w:pPr>
+        <w:widowControl/>
         <w:spacing w:after="80"/>
       </w:pPr>
       <w:r>
@@ -4289,6 +4631,10 @@
       </w:r>
     </w:p>
     <w:p>
+      <w:pPr>
+        <w:keepNext/>
+        <w:spacing w:before="200" w:after="60"/>
+      </w:pPr>
       <w:r>
         <w:rPr>
           <w:b/>
@@ -4299,6 +4645,10 @@
       </w:r>
     </w:p>
     <w:p>
+      <w:pPr>
+        <w:keepNext/>
+        <w:spacing w:before="160" w:after="40"/>
+      </w:pPr>
       <w:r>
         <w:rPr>
           <w:b/>
@@ -4310,6 +4660,7 @@
     </w:p>
     <w:p>
       <w:pPr>
+        <w:widowControl/>
         <w:spacing w:after="80"/>
       </w:pPr>
       <w:r>
@@ -4318,6 +4669,7 @@
     </w:p>
     <w:p>
       <w:pPr>
+        <w:widowControl/>
         <w:spacing w:after="80"/>
       </w:pPr>
       <w:r>
@@ -4325,6 +4677,10 @@
       </w:r>
     </w:p>
     <w:p>
+      <w:pPr>
+        <w:keepNext/>
+        <w:spacing w:before="160" w:after="40"/>
+      </w:pPr>
       <w:r>
         <w:rPr>
           <w:b/>
@@ -4336,6 +4692,7 @@
     </w:p>
     <w:p>
       <w:pPr>
+        <w:widowControl/>
         <w:spacing w:after="80"/>
       </w:pPr>
       <w:r>
@@ -4343,6 +4700,10 @@
       </w:r>
     </w:p>
     <w:p>
+      <w:pPr>
+        <w:keepNext/>
+        <w:spacing w:before="160" w:after="40"/>
+      </w:pPr>
       <w:r>
         <w:rPr>
           <w:b/>
@@ -4354,6 +4715,7 @@
     </w:p>
     <w:p>
       <w:pPr>
+        <w:widowControl/>
         <w:spacing w:after="80"/>
       </w:pPr>
       <w:r>
@@ -4362,6 +4724,7 @@
     </w:p>
     <w:p>
       <w:pPr>
+        <w:widowControl/>
         <w:spacing w:after="80"/>
       </w:pPr>
       <w:r>
@@ -4369,6 +4732,10 @@
       </w:r>
     </w:p>
     <w:p>
+      <w:pPr>
+        <w:keepNext/>
+        <w:spacing w:before="160" w:after="40"/>
+      </w:pPr>
       <w:r>
         <w:rPr>
           <w:b/>
@@ -4380,6 +4747,7 @@
     </w:p>
     <w:p>
       <w:pPr>
+        <w:widowControl/>
         <w:spacing w:after="80"/>
       </w:pPr>
       <w:r>
@@ -4389,6 +4757,7 @@
     <w:p>
       <w:pPr>
         <w:pStyle w:val="ListParagraph"/>
+        <w:widowControl/>
         <w:spacing w:after="40"/>
       </w:pPr>
       <w:r>
@@ -4398,6 +4767,7 @@
     <w:p>
       <w:pPr>
         <w:pStyle w:val="ListParagraph"/>
+        <w:widowControl/>
         <w:spacing w:after="40"/>
       </w:pPr>
       <w:r>
@@ -4406,6 +4776,7 @@
     </w:p>
     <w:p>
       <w:pPr>
+        <w:widowControl/>
         <w:spacing w:after="80"/>
       </w:pPr>
       <w:r>
@@ -4414,6 +4785,7 @@
     </w:p>
     <w:p>
       <w:pPr>
+        <w:widowControl/>
         <w:spacing w:after="80"/>
       </w:pPr>
       <w:r>
@@ -4422,6 +4794,8 @@
     </w:p>
     <w:p>
       <w:pPr>
+        <w:keepNext/>
+        <w:widowControl/>
         <w:spacing w:after="80"/>
       </w:pPr>
       <w:r>
@@ -4436,6 +4810,10 @@
       </w:r>
     </w:p>
     <w:p>
+      <w:pPr>
+        <w:keepNext/>
+        <w:spacing w:before="160" w:after="40"/>
+      </w:pPr>
       <w:r>
         <w:rPr>
           <w:b/>
@@ -4447,6 +4825,7 @@
     </w:p>
     <w:p>
       <w:pPr>
+        <w:widowControl/>
         <w:spacing w:after="80"/>
       </w:pPr>
       <w:r>
@@ -4454,6 +4833,10 @@
       </w:r>
     </w:p>
     <w:p>
+      <w:pPr>
+        <w:keepNext/>
+        <w:spacing w:before="160" w:after="40"/>
+      </w:pPr>
       <w:r>
         <w:rPr>
           <w:b/>
@@ -4465,6 +4848,7 @@
     </w:p>
     <w:p>
       <w:pPr>
+        <w:widowControl/>
         <w:spacing w:after="80"/>
       </w:pPr>
       <w:r>
@@ -4474,6 +4858,7 @@
     <w:p>
       <w:pPr>
         <w:pStyle w:val="ListParagraph"/>
+        <w:widowControl/>
         <w:spacing w:after="40"/>
       </w:pPr>
       <w:r>
@@ -4483,6 +4868,7 @@
     <w:p>
       <w:pPr>
         <w:pStyle w:val="ListParagraph"/>
+        <w:widowControl/>
         <w:spacing w:after="40"/>
       </w:pPr>
       <w:r>
@@ -4492,6 +4878,7 @@
     <w:p>
       <w:pPr>
         <w:pStyle w:val="ListParagraph"/>
+        <w:widowControl/>
         <w:spacing w:after="40"/>
       </w:pPr>
       <w:r>
@@ -4500,6 +4887,7 @@
     </w:p>
     <w:p>
       <w:pPr>
+        <w:widowControl/>
         <w:spacing w:after="80"/>
       </w:pPr>
       <w:r>
@@ -4508,6 +4896,7 @@
     </w:p>
     <w:p>
       <w:pPr>
+        <w:widowControl/>
         <w:spacing w:after="80"/>
       </w:pPr>
       <w:r>
@@ -4515,6 +4904,10 @@
       </w:r>
     </w:p>
     <w:p>
+      <w:pPr>
+        <w:keepNext/>
+        <w:spacing w:before="160" w:after="40"/>
+      </w:pPr>
       <w:r>
         <w:rPr>
           <w:b/>
@@ -4526,6 +4919,7 @@
     </w:p>
     <w:p>
       <w:pPr>
+        <w:widowControl/>
         <w:spacing w:after="80"/>
       </w:pPr>
       <w:r>
@@ -4534,6 +4928,7 @@
     </w:p>
     <w:p>
       <w:pPr>
+        <w:widowControl/>
         <w:spacing w:after="80"/>
       </w:pPr>
       <w:r>
@@ -4541,6 +4936,10 @@
       </w:r>
     </w:p>
     <w:p>
+      <w:pPr>
+        <w:keepNext/>
+        <w:spacing w:before="160" w:after="40"/>
+      </w:pPr>
       <w:r>
         <w:rPr>
           <w:b/>
@@ -4552,6 +4951,7 @@
     </w:p>
     <w:p>
       <w:pPr>
+        <w:widowControl/>
         <w:spacing w:after="80"/>
       </w:pPr>
       <w:r>
@@ -4560,6 +4960,7 @@
     </w:p>
     <w:p>
       <w:pPr>
+        <w:widowControl/>
         <w:spacing w:after="80"/>
       </w:pPr>
       <w:r>
@@ -4567,6 +4968,10 @@
       </w:r>
     </w:p>
     <w:p>
+      <w:pPr>
+        <w:keepNext/>
+        <w:spacing w:before="160" w:after="40"/>
+      </w:pPr>
       <w:r>
         <w:rPr>
           <w:b/>
@@ -4578,6 +4983,7 @@
     </w:p>
     <w:p>
       <w:pPr>
+        <w:widowControl/>
         <w:spacing w:after="80"/>
       </w:pPr>
       <w:r>
@@ -4587,6 +4993,7 @@
     <w:p>
       <w:pPr>
         <w:pStyle w:val="ListParagraph"/>
+        <w:widowControl/>
         <w:spacing w:after="40"/>
       </w:pPr>
       <w:r>
@@ -4596,6 +5003,7 @@
     <w:p>
       <w:pPr>
         <w:pStyle w:val="ListParagraph"/>
+        <w:widowControl/>
         <w:spacing w:after="40"/>
       </w:pPr>
       <w:r>
@@ -4605,6 +5013,7 @@
     <w:p>
       <w:pPr>
         <w:pStyle w:val="ListParagraph"/>
+        <w:widowControl/>
         <w:spacing w:after="40"/>
       </w:pPr>
       <w:r>
@@ -4614,6 +5023,7 @@
     <w:p>
       <w:pPr>
         <w:pStyle w:val="ListParagraph"/>
+        <w:widowControl/>
         <w:spacing w:after="40"/>
       </w:pPr>
       <w:r>
@@ -4623,6 +5033,7 @@
     <w:p>
       <w:pPr>
         <w:pStyle w:val="ListParagraph"/>
+        <w:widowControl/>
         <w:spacing w:after="40"/>
       </w:pPr>
       <w:r>
@@ -4630,6 +5041,10 @@
       </w:r>
     </w:p>
     <w:p>
+      <w:pPr>
+        <w:keepNext/>
+        <w:spacing w:before="160" w:after="40"/>
+      </w:pPr>
       <w:r>
         <w:rPr>
           <w:b/>
@@ -4641,6 +5056,7 @@
     </w:p>
     <w:p>
       <w:pPr>
+        <w:widowControl/>
         <w:spacing w:after="80"/>
       </w:pPr>
       <w:r>
@@ -4649,6 +5065,7 @@
     </w:p>
     <w:p>
       <w:pPr>
+        <w:widowControl/>
         <w:spacing w:after="80"/>
       </w:pPr>
       <w:r>
@@ -4656,6 +5073,10 @@
       </w:r>
     </w:p>
     <w:p>
+      <w:pPr>
+        <w:keepNext/>
+        <w:spacing w:before="160" w:after="40"/>
+      </w:pPr>
       <w:r>
         <w:rPr>
           <w:b/>
@@ -4667,6 +5088,7 @@
     </w:p>
     <w:p>
       <w:pPr>
+        <w:widowControl/>
         <w:spacing w:after="80"/>
       </w:pPr>
       <w:r>
@@ -4675,6 +5097,7 @@
     </w:p>
     <w:p>
       <w:pPr>
+        <w:widowControl/>
         <w:spacing w:after="80"/>
       </w:pPr>
       <w:r>
@@ -4682,6 +5105,10 @@
       </w:r>
     </w:p>
     <w:p>
+      <w:pPr>
+        <w:keepNext/>
+        <w:spacing w:before="200" w:after="60"/>
+      </w:pPr>
       <w:r>
         <w:rPr>
           <w:b/>
@@ -4692,6 +5119,10 @@
       </w:r>
     </w:p>
     <w:p>
+      <w:pPr>
+        <w:keepNext/>
+        <w:spacing w:before="160" w:after="40"/>
+      </w:pPr>
       <w:r>
         <w:rPr>
           <w:b/>
@@ -4703,6 +5134,7 @@
     </w:p>
     <w:p>
       <w:pPr>
+        <w:widowControl/>
         <w:spacing w:after="80"/>
       </w:pPr>
       <w:r>
@@ -4712,6 +5144,7 @@
     <w:p>
       <w:pPr>
         <w:pStyle w:val="ListParagraph"/>
+        <w:widowControl/>
         <w:spacing w:after="40"/>
       </w:pPr>
       <w:r>
@@ -4721,6 +5154,7 @@
     <w:p>
       <w:pPr>
         <w:pStyle w:val="ListParagraph"/>
+        <w:widowControl/>
         <w:spacing w:after="40"/>
       </w:pPr>
       <w:r>
@@ -4730,6 +5164,7 @@
     <w:p>
       <w:pPr>
         <w:pStyle w:val="ListParagraph"/>
+        <w:widowControl/>
         <w:spacing w:after="40"/>
       </w:pPr>
       <w:r>
@@ -4739,6 +5174,7 @@
     <w:p>
       <w:pPr>
         <w:pStyle w:val="ListParagraph"/>
+        <w:widowControl/>
         <w:spacing w:after="40"/>
       </w:pPr>
       <w:r>
@@ -4748,6 +5184,7 @@
     <w:p>
       <w:pPr>
         <w:pStyle w:val="ListParagraph"/>
+        <w:widowControl/>
         <w:spacing w:after="40"/>
       </w:pPr>
       <w:r>
@@ -4756,6 +5193,7 @@
     </w:p>
     <w:p>
       <w:pPr>
+        <w:widowControl/>
         <w:spacing w:after="80"/>
       </w:pPr>
       <w:r>
@@ -4763,6 +5201,10 @@
       </w:r>
     </w:p>
     <w:p>
+      <w:pPr>
+        <w:keepNext/>
+        <w:spacing w:before="160" w:after="40"/>
+      </w:pPr>
       <w:r>
         <w:rPr>
           <w:b/>
@@ -4774,6 +5216,7 @@
     </w:p>
     <w:p>
       <w:pPr>
+        <w:widowControl/>
         <w:spacing w:after="80"/>
       </w:pPr>
       <w:r>
@@ -4781,6 +5224,10 @@
       </w:r>
     </w:p>
     <w:p>
+      <w:pPr>
+        <w:keepNext/>
+        <w:spacing w:before="160" w:after="40"/>
+      </w:pPr>
       <w:r>
         <w:rPr>
           <w:b/>
@@ -4792,6 +5239,7 @@
     </w:p>
     <w:p>
       <w:pPr>
+        <w:widowControl/>
         <w:spacing w:after="80"/>
       </w:pPr>
       <w:r>
@@ -4800,6 +5248,7 @@
     </w:p>
     <w:p>
       <w:pPr>
+        <w:widowControl/>
         <w:spacing w:after="80"/>
       </w:pPr>
       <w:r>
@@ -4807,6 +5256,10 @@
       </w:r>
     </w:p>
     <w:p>
+      <w:pPr>
+        <w:keepNext/>
+        <w:spacing w:before="160" w:after="40"/>
+      </w:pPr>
       <w:r>
         <w:rPr>
           <w:b/>
@@ -4818,6 +5271,7 @@
     </w:p>
     <w:p>
       <w:pPr>
+        <w:widowControl/>
         <w:spacing w:after="80"/>
       </w:pPr>
       <w:r>
@@ -4826,6 +5280,7 @@
     </w:p>
     <w:p>
       <w:pPr>
+        <w:widowControl/>
         <w:spacing w:after="80"/>
       </w:pPr>
       <w:r>
@@ -4833,6 +5288,10 @@
       </w:r>
     </w:p>
     <w:p>
+      <w:pPr>
+        <w:keepNext/>
+        <w:spacing w:before="160" w:after="40"/>
+      </w:pPr>
       <w:r>
         <w:rPr>
           <w:b/>
@@ -4844,6 +5303,7 @@
     </w:p>
     <w:p>
       <w:pPr>
+        <w:widowControl/>
         <w:spacing w:after="80"/>
       </w:pPr>
       <w:r>
@@ -4851,6 +5311,10 @@
       </w:r>
     </w:p>
     <w:p>
+      <w:pPr>
+        <w:keepNext/>
+        <w:spacing w:before="160" w:after="40"/>
+      </w:pPr>
       <w:r>
         <w:rPr>
           <w:b/>
@@ -4862,6 +5326,7 @@
     </w:p>
     <w:p>
       <w:pPr>
+        <w:widowControl/>
         <w:spacing w:after="80"/>
       </w:pPr>
       <w:r>
@@ -4871,6 +5336,7 @@
     <w:p>
       <w:pPr>
         <w:pStyle w:val="ListParagraph"/>
+        <w:widowControl/>
         <w:spacing w:after="40"/>
       </w:pPr>
       <w:r>
@@ -4880,6 +5346,7 @@
     <w:p>
       <w:pPr>
         <w:pStyle w:val="ListParagraph"/>
+        <w:widowControl/>
         <w:spacing w:after="40"/>
       </w:pPr>
       <w:r>
@@ -4889,6 +5356,7 @@
     <w:p>
       <w:pPr>
         <w:pStyle w:val="ListParagraph"/>
+        <w:widowControl/>
         <w:spacing w:after="40"/>
       </w:pPr>
       <w:r>
@@ -4897,6 +5365,7 @@
     </w:p>
     <w:p>
       <w:pPr>
+        <w:widowControl/>
         <w:spacing w:after="80"/>
       </w:pPr>
       <w:r>
@@ -4904,6 +5373,10 @@
       </w:r>
     </w:p>
     <w:p>
+      <w:pPr>
+        <w:keepNext/>
+        <w:spacing w:before="200" w:after="60"/>
+      </w:pPr>
       <w:r>
         <w:rPr>
           <w:b/>
@@ -4915,6 +5388,7 @@
     </w:p>
     <w:p>
       <w:pPr>
+        <w:widowControl/>
         <w:spacing w:after="80"/>
       </w:pPr>
       <w:r>
@@ -4922,6 +5396,10 @@
       </w:r>
     </w:p>
     <w:p>
+      <w:pPr>
+        <w:keepNext/>
+        <w:spacing w:before="160" w:after="40"/>
+      </w:pPr>
       <w:r>
         <w:rPr>
           <w:b/>
@@ -4933,6 +5411,7 @@
     </w:p>
     <w:p>
       <w:pPr>
+        <w:widowControl/>
         <w:spacing w:after="80"/>
       </w:pPr>
       <w:r>
@@ -4940,6 +5419,10 @@
       </w:r>
     </w:p>
     <w:p>
+      <w:pPr>
+        <w:keepNext/>
+        <w:spacing w:before="160" w:after="40"/>
+      </w:pPr>
       <w:r>
         <w:rPr>
           <w:b/>
@@ -4951,6 +5434,7 @@
     </w:p>
     <w:p>
       <w:pPr>
+        <w:widowControl/>
         <w:spacing w:after="80"/>
       </w:pPr>
       <w:r>
@@ -4958,6 +5442,10 @@
       </w:r>
     </w:p>
     <w:p>
+      <w:pPr>
+        <w:keepNext/>
+        <w:spacing w:before="160" w:after="40"/>
+      </w:pPr>
       <w:r>
         <w:rPr>
           <w:b/>
@@ -4969,6 +5457,7 @@
     </w:p>
     <w:p>
       <w:pPr>
+        <w:widowControl/>
         <w:spacing w:after="80"/>
       </w:pPr>
       <w:r>
@@ -4976,6 +5465,10 @@
       </w:r>
     </w:p>
     <w:p>
+      <w:pPr>
+        <w:keepNext/>
+        <w:spacing w:before="160" w:after="40"/>
+      </w:pPr>
       <w:r>
         <w:rPr>
           <w:b/>
@@ -4987,6 +5480,7 @@
     </w:p>
     <w:p>
       <w:pPr>
+        <w:widowControl/>
         <w:spacing w:after="80"/>
       </w:pPr>
       <w:r>
@@ -4995,6 +5489,8 @@
     </w:p>
     <w:p>
       <w:pPr>
+        <w:keepNext/>
+        <w:widowControl/>
         <w:spacing w:after="80"/>
       </w:pPr>
       <w:r>
@@ -5014,6 +5510,10 @@
       </w:r>
     </w:p>
     <w:p>
+      <w:pPr>
+        <w:keepNext/>
+        <w:spacing w:before="240" w:after="80"/>
+      </w:pPr>
       <w:r>
         <w:rPr>
           <w:b/>
@@ -5024,6 +5524,10 @@
       </w:r>
     </w:p>
     <w:p>
+      <w:pPr>
+        <w:keepNext/>
+        <w:spacing w:before="200" w:after="60"/>
+      </w:pPr>
       <w:r>
         <w:rPr>
           <w:b/>
@@ -5035,6 +5539,7 @@
     </w:p>
     <w:p>
       <w:pPr>
+        <w:widowControl/>
         <w:spacing w:after="80"/>
       </w:pPr>
       <w:r>
@@ -5264,6 +5769,7 @@
     <w:p/>
     <w:p>
       <w:pPr>
+        <w:widowControl/>
         <w:spacing w:after="80"/>
       </w:pPr>
       <w:r>
@@ -5273,6 +5779,7 @@
     <w:p>
       <w:pPr>
         <w:pStyle w:val="ListParagraph"/>
+        <w:widowControl/>
         <w:spacing w:after="40"/>
       </w:pPr>
       <w:r>
@@ -5282,6 +5789,7 @@
     <w:p>
       <w:pPr>
         <w:pStyle w:val="ListParagraph"/>
+        <w:widowControl/>
         <w:spacing w:after="40"/>
       </w:pPr>
       <w:r>
@@ -5291,6 +5799,7 @@
     <w:p>
       <w:pPr>
         <w:pStyle w:val="ListParagraph"/>
+        <w:widowControl/>
         <w:spacing w:after="40"/>
       </w:pPr>
       <w:r>
@@ -5300,6 +5809,7 @@
     <w:p>
       <w:pPr>
         <w:pStyle w:val="ListParagraph"/>
+        <w:widowControl/>
         <w:spacing w:after="40"/>
       </w:pPr>
       <w:r>
@@ -5308,6 +5818,7 @@
     </w:p>
     <w:p>
       <w:pPr>
+        <w:widowControl/>
         <w:spacing w:after="80"/>
       </w:pPr>
       <w:r>
@@ -5316,6 +5827,7 @@
     </w:p>
     <w:p>
       <w:pPr>
+        <w:widowControl/>
         <w:spacing w:after="80"/>
       </w:pPr>
       <w:r>
@@ -5325,6 +5837,7 @@
     <w:p>
       <w:pPr>
         <w:pStyle w:val="ListParagraph"/>
+        <w:widowControl/>
         <w:spacing w:after="40"/>
       </w:pPr>
       <w:r>
@@ -5334,6 +5847,7 @@
     <w:p>
       <w:pPr>
         <w:pStyle w:val="ListParagraph"/>
+        <w:widowControl/>
         <w:spacing w:after="40"/>
       </w:pPr>
       <w:r>
@@ -5342,6 +5856,8 @@
     </w:p>
     <w:p>
       <w:pPr>
+        <w:keepNext/>
+        <w:widowControl/>
         <w:spacing w:after="80"/>
       </w:pPr>
       <w:r>
@@ -5356,6 +5872,10 @@
       </w:r>
     </w:p>
     <w:p>
+      <w:pPr>
+        <w:keepNext/>
+        <w:spacing w:before="200" w:after="60"/>
+      </w:pPr>
       <w:r>
         <w:rPr>
           <w:b/>
@@ -5367,6 +5887,7 @@
     </w:p>
     <w:p>
       <w:pPr>
+        <w:widowControl/>
         <w:spacing w:after="80"/>
       </w:pPr>
       <w:r>
@@ -5637,6 +6158,7 @@
     <w:p/>
     <w:p>
       <w:pPr>
+        <w:widowControl/>
         <w:spacing w:after="80"/>
       </w:pPr>
       <w:r>
@@ -5645,6 +6167,7 @@
     </w:p>
     <w:p>
       <w:pPr>
+        <w:widowControl/>
         <w:spacing w:after="80"/>
       </w:pPr>
       <w:r>
@@ -5652,6 +6175,10 @@
       </w:r>
     </w:p>
     <w:p>
+      <w:pPr>
+        <w:keepNext/>
+        <w:spacing w:before="200" w:after="60"/>
+      </w:pPr>
       <w:r>
         <w:rPr>
           <w:b/>
@@ -5663,6 +6190,7 @@
     </w:p>
     <w:p>
       <w:pPr>
+        <w:widowControl/>
         <w:spacing w:after="80"/>
       </w:pPr>
       <w:r>
@@ -5670,6 +6198,10 @@
       </w:r>
     </w:p>
     <w:p>
+      <w:pPr>
+        <w:keepNext/>
+        <w:spacing w:before="160" w:after="40"/>
+      </w:pPr>
       <w:r>
         <w:rPr>
           <w:b/>
@@ -5681,6 +6213,7 @@
     </w:p>
     <w:p>
       <w:pPr>
+        <w:widowControl/>
         <w:spacing w:after="80"/>
       </w:pPr>
       <w:r>
@@ -5689,6 +6222,7 @@
     </w:p>
     <w:p>
       <w:pPr>
+        <w:widowControl/>
         <w:spacing w:after="80"/>
       </w:pPr>
       <w:r>
@@ -5698,6 +6232,7 @@
     <w:p>
       <w:pPr>
         <w:pStyle w:val="ListParagraph"/>
+        <w:widowControl/>
         <w:spacing w:after="40"/>
       </w:pPr>
       <w:r>
@@ -5707,6 +6242,7 @@
     <w:p>
       <w:pPr>
         <w:pStyle w:val="ListParagraph"/>
+        <w:widowControl/>
         <w:spacing w:after="40"/>
       </w:pPr>
       <w:r>
@@ -5716,6 +6252,7 @@
     <w:p>
       <w:pPr>
         <w:pStyle w:val="ListParagraph"/>
+        <w:widowControl/>
         <w:spacing w:after="40"/>
       </w:pPr>
       <w:r>
@@ -5725,6 +6262,7 @@
     <w:p>
       <w:pPr>
         <w:pStyle w:val="ListParagraph"/>
+        <w:widowControl/>
         <w:spacing w:after="40"/>
       </w:pPr>
       <w:r>
@@ -5734,6 +6272,7 @@
     <w:p>
       <w:pPr>
         <w:pStyle w:val="ListParagraph"/>
+        <w:widowControl/>
         <w:spacing w:after="40"/>
       </w:pPr>
       <w:r>
@@ -5741,6 +6280,10 @@
       </w:r>
     </w:p>
     <w:p>
+      <w:pPr>
+        <w:keepNext/>
+        <w:spacing w:before="160" w:after="40"/>
+      </w:pPr>
       <w:r>
         <w:rPr>
           <w:b/>
@@ -5752,6 +6295,7 @@
     </w:p>
     <w:p>
       <w:pPr>
+        <w:widowControl/>
         <w:spacing w:after="80"/>
       </w:pPr>
       <w:r>
@@ -5761,6 +6305,7 @@
     <w:p>
       <w:pPr>
         <w:pStyle w:val="ListParagraph"/>
+        <w:widowControl/>
         <w:spacing w:after="40"/>
       </w:pPr>
       <w:r>
@@ -5770,6 +6315,7 @@
     <w:p>
       <w:pPr>
         <w:pStyle w:val="ListParagraph"/>
+        <w:widowControl/>
         <w:spacing w:after="40"/>
       </w:pPr>
       <w:r>
@@ -5779,6 +6325,7 @@
     <w:p>
       <w:pPr>
         <w:pStyle w:val="ListParagraph"/>
+        <w:widowControl/>
         <w:spacing w:after="40"/>
       </w:pPr>
       <w:r>
@@ -5788,6 +6335,7 @@
     <w:p>
       <w:pPr>
         <w:pStyle w:val="ListParagraph"/>
+        <w:widowControl/>
         <w:spacing w:after="40"/>
       </w:pPr>
       <w:r>
@@ -5795,6 +6343,10 @@
       </w:r>
     </w:p>
     <w:p>
+      <w:pPr>
+        <w:keepNext/>
+        <w:spacing w:before="160" w:after="40"/>
+      </w:pPr>
       <w:r>
         <w:rPr>
           <w:b/>
@@ -5806,6 +6358,7 @@
     </w:p>
     <w:p>
       <w:pPr>
+        <w:widowControl/>
         <w:spacing w:after="80"/>
       </w:pPr>
       <w:r>
@@ -5814,6 +6367,7 @@
     </w:p>
     <w:p>
       <w:pPr>
+        <w:widowControl/>
         <w:spacing w:after="80"/>
       </w:pPr>
       <w:r>
@@ -5821,6 +6375,10 @@
       </w:r>
     </w:p>
     <w:p>
+      <w:pPr>
+        <w:keepNext/>
+        <w:spacing w:before="160" w:after="40"/>
+      </w:pPr>
       <w:r>
         <w:rPr>
           <w:b/>
@@ -5832,6 +6390,7 @@
     </w:p>
     <w:p>
       <w:pPr>
+        <w:widowControl/>
         <w:spacing w:after="80"/>
       </w:pPr>
       <w:r>
@@ -5841,6 +6400,7 @@
     <w:p>
       <w:pPr>
         <w:pStyle w:val="ListParagraph"/>
+        <w:widowControl/>
         <w:spacing w:after="40"/>
       </w:pPr>
       <w:r>
@@ -5850,6 +6410,7 @@
     <w:p>
       <w:pPr>
         <w:pStyle w:val="ListParagraph"/>
+        <w:widowControl/>
         <w:spacing w:after="40"/>
       </w:pPr>
       <w:r>
@@ -5859,6 +6420,7 @@
     <w:p>
       <w:pPr>
         <w:pStyle w:val="ListParagraph"/>
+        <w:widowControl/>
         <w:spacing w:after="40"/>
       </w:pPr>
       <w:r>
@@ -5868,6 +6430,7 @@
     <w:p>
       <w:pPr>
         <w:pStyle w:val="ListParagraph"/>
+        <w:widowControl/>
         <w:spacing w:after="40"/>
       </w:pPr>
       <w:r>
@@ -5877,6 +6440,7 @@
     <w:p>
       <w:pPr>
         <w:pStyle w:val="ListParagraph"/>
+        <w:widowControl/>
         <w:spacing w:after="40"/>
       </w:pPr>
       <w:r>
@@ -5885,6 +6449,7 @@
     </w:p>
     <w:p>
       <w:pPr>
+        <w:widowControl/>
         <w:spacing w:after="80"/>
       </w:pPr>
       <w:r>
@@ -5894,6 +6459,7 @@
     <w:p>
       <w:pPr>
         <w:pStyle w:val="ListParagraph"/>
+        <w:widowControl/>
         <w:spacing w:after="40"/>
       </w:pPr>
       <w:r>
@@ -5903,6 +6469,7 @@
     <w:p>
       <w:pPr>
         <w:pStyle w:val="ListParagraph"/>
+        <w:widowControl/>
         <w:spacing w:after="40"/>
       </w:pPr>
       <w:r>
@@ -5912,6 +6479,7 @@
     <w:p>
       <w:pPr>
         <w:pStyle w:val="ListParagraph"/>
+        <w:widowControl/>
         <w:spacing w:after="40"/>
       </w:pPr>
       <w:r>
@@ -5920,6 +6488,7 @@
     </w:p>
     <w:p>
       <w:pPr>
+        <w:widowControl/>
         <w:spacing w:after="80"/>
       </w:pPr>
       <w:r>
@@ -5928,6 +6497,8 @@
     </w:p>
     <w:p>
       <w:pPr>
+        <w:keepNext/>
+        <w:widowControl/>
         <w:spacing w:after="80"/>
       </w:pPr>
       <w:r>
@@ -5942,6 +6513,10 @@
       </w:r>
     </w:p>
     <w:p>
+      <w:pPr>
+        <w:keepNext/>
+        <w:spacing w:before="200" w:after="60"/>
+      </w:pPr>
       <w:r>
         <w:rPr>
           <w:b/>
@@ -5953,6 +6528,7 @@
     </w:p>
     <w:p>
       <w:pPr>
+        <w:widowControl/>
         <w:spacing w:after="80"/>
       </w:pPr>
       <w:r>
@@ -5962,6 +6538,7 @@
     <w:p>
       <w:pPr>
         <w:pStyle w:val="ListParagraph"/>
+        <w:widowControl/>
         <w:spacing w:after="40"/>
       </w:pPr>
       <w:r>
@@ -5971,6 +6548,7 @@
     <w:p>
       <w:pPr>
         <w:pStyle w:val="ListParagraph"/>
+        <w:widowControl/>
         <w:spacing w:after="40"/>
       </w:pPr>
       <w:r>
@@ -5980,6 +6558,7 @@
     <w:p>
       <w:pPr>
         <w:pStyle w:val="ListParagraph"/>
+        <w:widowControl/>
         <w:spacing w:after="40"/>
       </w:pPr>
       <w:r>
@@ -5989,6 +6568,7 @@
     <w:p>
       <w:pPr>
         <w:pStyle w:val="ListParagraph"/>
+        <w:widowControl/>
         <w:spacing w:after="40"/>
       </w:pPr>
       <w:r>
@@ -5998,6 +6578,7 @@
     <w:p>
       <w:pPr>
         <w:pStyle w:val="ListParagraph"/>
+        <w:widowControl/>
         <w:spacing w:after="40"/>
       </w:pPr>
       <w:r>
@@ -6006,6 +6587,7 @@
     </w:p>
     <w:p>
       <w:pPr>
+        <w:widowControl/>
         <w:spacing w:after="80"/>
       </w:pPr>
       <w:r>
@@ -6788,6 +7370,7 @@
     <w:p/>
     <w:p>
       <w:pPr>
+        <w:widowControl/>
         <w:spacing w:after="80"/>
       </w:pPr>
       <w:r>
@@ -6796,6 +7379,8 @@
     </w:p>
     <w:p>
       <w:pPr>
+        <w:keepNext/>
+        <w:widowControl/>
         <w:spacing w:after="80"/>
       </w:pPr>
       <w:r>
@@ -6815,6 +7400,10 @@
       </w:r>
     </w:p>
     <w:p>
+      <w:pPr>
+        <w:keepNext/>
+        <w:spacing w:before="240" w:after="80"/>
+      </w:pPr>
       <w:r>
         <w:rPr>
           <w:b/>
@@ -6825,6 +7414,10 @@
       </w:r>
     </w:p>
     <w:p>
+      <w:pPr>
+        <w:keepNext/>
+        <w:spacing w:before="200" w:after="60"/>
+      </w:pPr>
       <w:r>
         <w:rPr>
           <w:b/>
@@ -6836,6 +7429,7 @@
     </w:p>
     <w:p>
       <w:pPr>
+        <w:widowControl/>
         <w:spacing w:after="80"/>
       </w:pPr>
       <w:r>
@@ -6845,6 +7439,7 @@
     <w:p>
       <w:pPr>
         <w:pStyle w:val="ListParagraph"/>
+        <w:widowControl/>
         <w:spacing w:after="40"/>
       </w:pPr>
       <w:r>
@@ -6854,6 +7449,7 @@
     <w:p>
       <w:pPr>
         <w:pStyle w:val="ListParagraph"/>
+        <w:widowControl/>
         <w:spacing w:after="40"/>
       </w:pPr>
       <w:r>
@@ -6863,6 +7459,7 @@
     <w:p>
       <w:pPr>
         <w:pStyle w:val="ListParagraph"/>
+        <w:widowControl/>
         <w:spacing w:after="40"/>
       </w:pPr>
       <w:r>
@@ -6872,6 +7469,7 @@
     <w:p>
       <w:pPr>
         <w:pStyle w:val="ListParagraph"/>
+        <w:widowControl/>
         <w:spacing w:after="40"/>
       </w:pPr>
       <w:r>
@@ -6881,6 +7479,7 @@
     <w:p>
       <w:pPr>
         <w:pStyle w:val="ListParagraph"/>
+        <w:widowControl/>
         <w:spacing w:after="40"/>
       </w:pPr>
       <w:r>
@@ -6890,6 +7489,7 @@
     <w:p>
       <w:pPr>
         <w:pStyle w:val="ListParagraph"/>
+        <w:widowControl/>
         <w:spacing w:after="40"/>
       </w:pPr>
       <w:r>
@@ -6899,6 +7499,7 @@
     <w:p>
       <w:pPr>
         <w:pStyle w:val="ListParagraph"/>
+        <w:widowControl/>
         <w:spacing w:after="40"/>
       </w:pPr>
       <w:r>
@@ -6908,6 +7509,7 @@
     <w:p>
       <w:pPr>
         <w:pStyle w:val="ListParagraph"/>
+        <w:widowControl/>
         <w:spacing w:after="40"/>
       </w:pPr>
       <w:r>
@@ -6915,6 +7517,10 @@
       </w:r>
     </w:p>
     <w:p>
+      <w:pPr>
+        <w:keepNext/>
+        <w:spacing w:before="200" w:after="60"/>
+      </w:pPr>
       <w:r>
         <w:rPr>
           <w:b/>
@@ -6926,6 +7532,7 @@
     </w:p>
     <w:p>
       <w:pPr>
+        <w:widowControl/>
         <w:spacing w:after="80"/>
       </w:pPr>
       <w:r>
@@ -6935,6 +7542,7 @@
     <w:p>
       <w:pPr>
         <w:pStyle w:val="ListParagraph"/>
+        <w:widowControl/>
         <w:spacing w:after="40"/>
       </w:pPr>
       <w:r>
@@ -6944,6 +7552,7 @@
     <w:p>
       <w:pPr>
         <w:pStyle w:val="ListParagraph"/>
+        <w:widowControl/>
         <w:spacing w:after="40"/>
       </w:pPr>
       <w:r>
@@ -6953,6 +7562,7 @@
     <w:p>
       <w:pPr>
         <w:pStyle w:val="ListParagraph"/>
+        <w:widowControl/>
         <w:spacing w:after="40"/>
       </w:pPr>
       <w:r>
@@ -6962,6 +7572,7 @@
     <w:p>
       <w:pPr>
         <w:pStyle w:val="ListParagraph"/>
+        <w:widowControl/>
         <w:spacing w:after="40"/>
       </w:pPr>
       <w:r>
@@ -6970,6 +7581,7 @@
     </w:p>
     <w:p>
       <w:pPr>
+        <w:widowControl/>
         <w:spacing w:after="80"/>
       </w:pPr>
       <w:r>
@@ -6977,6 +7589,10 @@
       </w:r>
     </w:p>
     <w:p>
+      <w:pPr>
+        <w:keepNext/>
+        <w:spacing w:before="200" w:after="60"/>
+      </w:pPr>
       <w:r>
         <w:rPr>
           <w:b/>
@@ -6988,6 +7604,7 @@
     </w:p>
     <w:p>
       <w:pPr>
+        <w:widowControl/>
         <w:spacing w:after="80"/>
       </w:pPr>
       <w:r>
@@ -6997,6 +7614,7 @@
     <w:p>
       <w:pPr>
         <w:pStyle w:val="ListParagraph"/>
+        <w:widowControl/>
         <w:spacing w:after="40"/>
       </w:pPr>
       <w:r>
@@ -7006,6 +7624,7 @@
     <w:p>
       <w:pPr>
         <w:pStyle w:val="ListParagraph"/>
+        <w:widowControl/>
         <w:spacing w:after="40"/>
       </w:pPr>
       <w:r>
@@ -7015,6 +7634,7 @@
     <w:p>
       <w:pPr>
         <w:pStyle w:val="ListParagraph"/>
+        <w:widowControl/>
         <w:spacing w:after="40"/>
       </w:pPr>
       <w:r>
@@ -7024,6 +7644,7 @@
     <w:p>
       <w:pPr>
         <w:pStyle w:val="ListParagraph"/>
+        <w:widowControl/>
         <w:spacing w:after="40"/>
       </w:pPr>
       <w:r>
@@ -7033,6 +7654,7 @@
     <w:p>
       <w:pPr>
         <w:pStyle w:val="ListParagraph"/>
+        <w:widowControl/>
         <w:spacing w:after="40"/>
       </w:pPr>
       <w:r>
@@ -7045,6 +7667,10 @@
       </w:r>
     </w:p>
     <w:p>
+      <w:pPr>
+        <w:keepNext/>
+        <w:spacing w:before="240" w:after="80"/>
+      </w:pPr>
       <w:r>
         <w:rPr>
           <w:b/>
@@ -7055,6 +7681,10 @@
       </w:r>
     </w:p>
     <w:p>
+      <w:pPr>
+        <w:keepNext/>
+        <w:spacing w:before="200" w:after="60"/>
+      </w:pPr>
       <w:r>
         <w:rPr>
           <w:b/>
@@ -7066,6 +7696,7 @@
     </w:p>
     <w:p>
       <w:pPr>
+        <w:widowControl/>
         <w:spacing w:after="80"/>
       </w:pPr>
       <w:r>
@@ -7074,6 +7705,7 @@
     </w:p>
     <w:p>
       <w:pPr>
+        <w:widowControl/>
         <w:spacing w:after="80"/>
       </w:pPr>
       <w:r>
@@ -8164,6 +8796,8 @@
     <w:p/>
     <w:p>
       <w:pPr>
+        <w:keepNext/>
+        <w:widowControl/>
         <w:spacing w:after="80"/>
       </w:pPr>
       <w:r>
@@ -8178,6 +8812,10 @@
       </w:r>
     </w:p>
     <w:p>
+      <w:pPr>
+        <w:keepNext/>
+        <w:spacing w:before="200" w:after="60"/>
+      </w:pPr>
       <w:r>
         <w:rPr>
           <w:b/>
@@ -8189,6 +8827,7 @@
     </w:p>
     <w:p>
       <w:pPr>
+        <w:widowControl/>
         <w:spacing w:after="80"/>
       </w:pPr>
       <w:r>
@@ -8197,6 +8836,7 @@
     </w:p>
     <w:p>
       <w:pPr>
+        <w:widowControl/>
         <w:spacing w:after="80"/>
       </w:pPr>
       <w:r>
@@ -8206,6 +8846,7 @@
     <w:p>
       <w:pPr>
         <w:pStyle w:val="ListParagraph"/>
+        <w:widowControl/>
         <w:spacing w:after="40"/>
       </w:pPr>
       <w:r>
@@ -8215,6 +8856,7 @@
     <w:p>
       <w:pPr>
         <w:pStyle w:val="ListParagraph"/>
+        <w:widowControl/>
         <w:spacing w:after="40"/>
       </w:pPr>
       <w:r>
@@ -8223,6 +8865,7 @@
     </w:p>
     <w:p>
       <w:pPr>
+        <w:widowControl/>
         <w:spacing w:after="80"/>
       </w:pPr>
       <w:r>
@@ -8230,6 +8873,10 @@
       </w:r>
     </w:p>
     <w:p>
+      <w:pPr>
+        <w:keepNext/>
+        <w:spacing w:before="200" w:after="60"/>
+      </w:pPr>
       <w:r>
         <w:rPr>
           <w:b/>
@@ -8241,6 +8888,7 @@
     </w:p>
     <w:p>
       <w:pPr>
+        <w:widowControl/>
         <w:spacing w:after="80"/>
       </w:pPr>
       <w:r>
@@ -8249,6 +8897,7 @@
     </w:p>
     <w:p>
       <w:pPr>
+        <w:widowControl/>
         <w:spacing w:after="80"/>
       </w:pPr>
       <w:r>
@@ -8257,6 +8906,7 @@
     </w:p>
     <w:p>
       <w:pPr>
+        <w:widowControl/>
         <w:spacing w:after="80"/>
       </w:pPr>
       <w:r>
@@ -8264,6 +8914,10 @@
       </w:r>
     </w:p>
     <w:p>
+      <w:pPr>
+        <w:keepNext/>
+        <w:spacing w:before="200" w:after="60"/>
+      </w:pPr>
       <w:r>
         <w:rPr>
           <w:b/>
@@ -8275,6 +8929,7 @@
     </w:p>
     <w:p>
       <w:pPr>
+        <w:widowControl/>
         <w:spacing w:after="80"/>
       </w:pPr>
       <w:r>
@@ -8284,6 +8939,7 @@
     <w:p>
       <w:pPr>
         <w:pStyle w:val="ListParagraph"/>
+        <w:widowControl/>
         <w:spacing w:after="40"/>
       </w:pPr>
       <w:r>
@@ -8293,6 +8949,7 @@
     <w:p>
       <w:pPr>
         <w:pStyle w:val="ListParagraph"/>
+        <w:widowControl/>
         <w:spacing w:after="40"/>
       </w:pPr>
       <w:r>
@@ -8302,6 +8959,7 @@
     <w:p>
       <w:pPr>
         <w:pStyle w:val="ListParagraph"/>
+        <w:widowControl/>
         <w:spacing w:after="40"/>
       </w:pPr>
       <w:r>
@@ -8310,6 +8968,7 @@
     </w:p>
     <w:p>
       <w:pPr>
+        <w:widowControl/>
         <w:spacing w:after="80"/>
       </w:pPr>
       <w:r>
@@ -8318,6 +8977,8 @@
     </w:p>
     <w:p>
       <w:pPr>
+        <w:keepNext/>
+        <w:widowControl/>
         <w:spacing w:after="80"/>
       </w:pPr>
       <w:r>
@@ -8337,6 +8998,10 @@
       </w:r>
     </w:p>
     <w:p>
+      <w:pPr>
+        <w:keepNext/>
+        <w:spacing w:before="240" w:after="80"/>
+      </w:pPr>
       <w:r>
         <w:rPr>
           <w:b/>
@@ -8348,6 +9013,7 @@
     </w:p>
     <w:p>
       <w:pPr>
+        <w:widowControl/>
         <w:spacing w:after="80"/>
       </w:pPr>
       <w:r>
@@ -8968,6 +9634,8 @@
     <w:p/>
     <w:p>
       <w:pPr>
+        <w:keepNext/>
+        <w:widowControl/>
         <w:spacing w:after="80"/>
       </w:pPr>
       <w:r>
@@ -8987,6 +9655,10 @@
       </w:r>
     </w:p>
     <w:p>
+      <w:pPr>
+        <w:keepNext/>
+        <w:spacing w:before="240" w:after="80"/>
+      </w:pPr>
       <w:r>
         <w:rPr>
           <w:b/>
@@ -8997,6 +9669,10 @@
       </w:r>
     </w:p>
     <w:p>
+      <w:pPr>
+        <w:keepNext/>
+        <w:spacing w:before="200" w:after="60"/>
+      </w:pPr>
       <w:r>
         <w:rPr>
           <w:b/>
@@ -9009,6 +9685,7 @@
     <w:p>
       <w:pPr>
         <w:pStyle w:val="ListParagraph"/>
+        <w:widowControl/>
         <w:spacing w:after="40"/>
       </w:pPr>
       <w:r>
@@ -9018,6 +9695,7 @@
     <w:p>
       <w:pPr>
         <w:pStyle w:val="ListParagraph"/>
+        <w:widowControl/>
         <w:spacing w:after="40"/>
       </w:pPr>
       <w:r>
@@ -9027,6 +9705,7 @@
     <w:p>
       <w:pPr>
         <w:pStyle w:val="ListParagraph"/>
+        <w:widowControl/>
         <w:spacing w:after="40"/>
       </w:pPr>
       <w:r>
@@ -9036,6 +9715,7 @@
     <w:p>
       <w:pPr>
         <w:pStyle w:val="ListParagraph"/>
+        <w:widowControl/>
         <w:spacing w:after="40"/>
       </w:pPr>
       <w:r>
@@ -9045,6 +9725,7 @@
     <w:p>
       <w:pPr>
         <w:pStyle w:val="ListParagraph"/>
+        <w:widowControl/>
         <w:spacing w:after="40"/>
       </w:pPr>
       <w:r>
@@ -9054,6 +9735,7 @@
     <w:p>
       <w:pPr>
         <w:pStyle w:val="ListParagraph"/>
+        <w:widowControl/>
         <w:spacing w:after="40"/>
       </w:pPr>
       <w:r>
@@ -9063,6 +9745,7 @@
     <w:p>
       <w:pPr>
         <w:pStyle w:val="ListParagraph"/>
+        <w:widowControl/>
         <w:spacing w:after="40"/>
       </w:pPr>
       <w:r>
@@ -9072,6 +9755,7 @@
     <w:p>
       <w:pPr>
         <w:pStyle w:val="ListParagraph"/>
+        <w:widowControl/>
         <w:spacing w:after="40"/>
       </w:pPr>
       <w:r>
@@ -9079,6 +9763,10 @@
       </w:r>
     </w:p>
     <w:p>
+      <w:pPr>
+        <w:keepNext/>
+        <w:spacing w:before="200" w:after="60"/>
+      </w:pPr>
       <w:r>
         <w:rPr>
           <w:b/>
@@ -9090,6 +9778,7 @@
     </w:p>
     <w:p>
       <w:pPr>
+        <w:widowControl/>
         <w:spacing w:after="80"/>
       </w:pPr>
       <w:r>
@@ -9099,6 +9788,7 @@
     <w:p>
       <w:pPr>
         <w:pStyle w:val="ListParagraph"/>
+        <w:widowControl/>
         <w:spacing w:after="40"/>
       </w:pPr>
       <w:r>
@@ -9108,6 +9798,7 @@
     <w:p>
       <w:pPr>
         <w:pStyle w:val="ListParagraph"/>
+        <w:widowControl/>
         <w:spacing w:after="40"/>
       </w:pPr>
       <w:r>
@@ -9117,6 +9808,7 @@
     <w:p>
       <w:pPr>
         <w:pStyle w:val="ListParagraph"/>
+        <w:widowControl/>
         <w:spacing w:after="40"/>
       </w:pPr>
       <w:r>
@@ -9126,6 +9818,7 @@
     <w:p>
       <w:pPr>
         <w:pStyle w:val="ListParagraph"/>
+        <w:widowControl/>
         <w:spacing w:after="40"/>
       </w:pPr>
       <w:r>
@@ -9135,6 +9828,7 @@
     <w:p>
       <w:pPr>
         <w:pStyle w:val="ListParagraph"/>
+        <w:widowControl/>
         <w:spacing w:after="40"/>
       </w:pPr>
       <w:r>
@@ -9144,6 +9838,7 @@
     <w:p>
       <w:pPr>
         <w:pStyle w:val="ListParagraph"/>
+        <w:widowControl/>
         <w:spacing w:after="40"/>
       </w:pPr>
       <w:r>
@@ -9153,6 +9848,7 @@
     <w:p>
       <w:pPr>
         <w:pStyle w:val="ListParagraph"/>
+        <w:widowControl/>
         <w:spacing w:after="40"/>
       </w:pPr>
       <w:r>
@@ -9165,6 +9861,10 @@
       </w:r>
     </w:p>
     <w:p>
+      <w:pPr>
+        <w:keepNext/>
+        <w:spacing w:before="240" w:after="80"/>
+      </w:pPr>
       <w:r>
         <w:rPr>
           <w:b/>
@@ -10146,6 +10846,10 @@
       </w:r>
     </w:p>
     <w:p>
+      <w:pPr>
+        <w:keepNext/>
+        <w:spacing w:before="240" w:after="80"/>
+      </w:pPr>
       <w:r>
         <w:rPr>
           <w:b/>
@@ -10157,6 +10861,7 @@
     </w:p>
     <w:p>
       <w:pPr>
+        <w:widowControl/>
         <w:spacing w:after="80"/>
       </w:pPr>
       <w:r>
@@ -10263,11 +10968,13 @@
     <w:p/>
     <w:p>
       <w:pPr>
+        <w:widowControl/>
         <w:spacing w:after="80"/>
       </w:pPr>
     </w:p>
     <w:p>
       <w:pPr>
+        <w:widowControl/>
         <w:spacing w:after="80"/>
       </w:pPr>
     </w:p>

</xml_diff>

<commit_message>
Security Scanner: update user manual for RDP/origin, B2C/PCI, P50 headline fixes
- §4.5.4 RDP: now reconciled across all discovered IPs (not just the apex)
  + coverage note on the CDN-edge false-negative.
- §4.5.5 NEW Origin IP Discovery (CDN Bypass): historical-DNS candidates,
  TLS cert-match verification, verified-vs-candidate handling, autonomous
  (no broker confirmation), requirements/limitations.
- Flag auto-detection (×2 sections): B2C/PCI broadened to SA gateways,
  card-field markers, storefront/structured-data signals, and e-commerce
  platform fingerprints.
- Loss Exposure: note clarifying the single "Estimated Annual Loss" headline
  is the Median (P50), not the probability-weighted mean (ALE).

Regenerated Phishield_Cyber_Risk_Scanner_User_Manual.docx (blank-page gate passed).

Co-Authored-By: Claude Opus 4.7 <noreply@anthropic.com>
</commit_message>
<xml_diff>
--- a/security_scanner/Phishield_Cyber_Risk_Scanner_User_Manual.docx
+++ b/security_scanner/Phishield_Cyber_Risk_Scanner_User_Manual.docx
@@ -5197,7 +5197,23 @@
         <w:t xml:space="preserve">RDP Exposure (Port 3389): </w:t>
       </w:r>
       <w:r>
-        <w:t>The Remote Desktop Protocol is the single most exploited initial access vector for ransomware. The scanner checks whether port 3389 is open on your public IP addresses. An exposed RDP service is rated as a critical finding because automated attack tools continuously scan the entire internet for open RDP, and compromised RDP credentials are bought and sold on criminal marketplaces.</w:t>
+        <w:t>The Remote Desktop Protocol is the single most exploited initial access vector for ransomware. The scanner checks whether port 3389 is open on every discovered IP address — not only the IP your domain name resolves to, but also subdomain IPs and any verified origin servers found behind a CDN (see Origin IP Discovery below). If RDP is open on any of these, the headline ‘RDP Exposed’ finding is raised and the specific IP(s) are listed. An exposed RDP service is rated as a critical finding because automated attack tools continuously scan the entire internet for open RDP, and compromised RDP credentials are bought and sold on criminal marketplaces.</w:t>
+      </w:r>
+    </w:p>
+    <w:p>
+      <w:pPr>
+        <w:widowControl/>
+        <w:spacing w:after="80"/>
+      </w:pPr>
+      <w:r>
+        <w:rPr>
+          <w:b/>
+          <w:color w:val="003399"/>
+        </w:rPr>
+        <w:t xml:space="preserve">NOTE: </w:t>
+      </w:r>
+      <w:r>
+        <w:t>Coverage note: a domain behind Cloudflare or another CDN resolves only to the CDN’s edge IPs, where port 3389 is always closed. A naive check of the domain name alone would therefore report ‘RDP Exposed: No’ even when the real origin server has RDP open. The scanner reconciles the RDP finding across all discovered IPs and attempts to locate the hidden origin (see below) so this exposure is not missed.</w:t>
       </w:r>
     </w:p>
     <w:p>
@@ -5346,6 +5362,90 @@
       </w:r>
       <w:r>
         <w:t>VPN detection relies on network signatures that may not be present if the VPN terminates on a different IP address or subdomain than the one being scanned. Cloud-based VPN solutions (such as Zscaler or Cloudflare Access) operate at the DNS or application layer and may not be detectable via port scanning. The scanner does not test VPN authentication strength or check for known vulnerabilities in the detected VPN product.</w:t>
+      </w:r>
+    </w:p>
+    <w:p>
+      <w:pPr>
+        <w:keepNext/>
+        <w:spacing w:before="200" w:after="60"/>
+      </w:pPr>
+      <w:r>
+        <w:rPr>
+          <w:b/>
+          <w:color w:val="003366"/>
+          <w:sz w:val="26"/>
+        </w:rPr>
+        <w:t>4.5.5  Origin IP Discovery (CDN Bypass)</w:t>
+      </w:r>
+    </w:p>
+    <w:p>
+      <w:pPr>
+        <w:widowControl/>
+        <w:spacing w:after="80"/>
+      </w:pPr>
+      <w:r>
+        <w:t>When a domain sits behind a CDN or WAF such as Cloudflare, it resolves only to the provider’s edge IP addresses. The organisation’s real server — the ‘origin’ — is hidden. This is good for DDoS protection, but it also means a scan of the domain name alone never sees services running directly on the origin (RDP, databases, admin panels), because those ports are closed on the CDN edge. Attackers routinely locate the origin and connect to it directly, bypassing the CDN entirely.</w:t>
+      </w:r>
+    </w:p>
+    <w:p>
+      <w:pPr>
+        <w:widowControl/>
+        <w:spacing w:after="80"/>
+      </w:pPr>
+      <w:r>
+        <w:rPr>
+          <w:b/>
+        </w:rPr>
+        <w:t xml:space="preserve">How the scanner finds the origin: </w:t>
+      </w:r>
+      <w:r>
+        <w:t>Candidate origin IPs are gathered from historical DNS records (via SecurityTrails — the pre-CDN origin is usually still in the history). Each candidate is then automatically verified: the scanner opens a TLS connection to the candidate IP presenting the target domain name and checks that the certificate it serves actually covers that domain. Only IPs that pass this certificate match are treated as confirmed origins and added to the scan — so an exposed service on the real server surfaces in the report even though the domain is CDN-fronted.</w:t>
+      </w:r>
+    </w:p>
+    <w:p>
+      <w:pPr>
+        <w:widowControl/>
+        <w:spacing w:after="80"/>
+      </w:pPr>
+      <w:r>
+        <w:rPr>
+          <w:b/>
+        </w:rPr>
+        <w:t xml:space="preserve">Verified vs candidate: </w:t>
+      </w:r>
+      <w:r>
+        <w:t>Confirmed origins are labelled ‘verified’ and are scanned in full. IPs that appear in historical DNS but do not currently serve the domain’s certificate are listed as ‘candidate (unverified)’ and are deliberately NOT scanned — they may since have been reassigned to an unrelated third party, and scanning them would be both inaccurate and inappropriate. Both lists appear in the report’s Origin IP Discovery card for transparency.</w:t>
+      </w:r>
+    </w:p>
+    <w:p>
+      <w:pPr>
+        <w:widowControl/>
+        <w:spacing w:after="80"/>
+      </w:pPr>
+      <w:r>
+        <w:rPr>
+          <w:b/>
+          <w:color w:val="003399"/>
+        </w:rPr>
+        <w:t xml:space="preserve">NOTE: </w:t>
+      </w:r>
+      <w:r>
+        <w:t>This check is fully automated and requires no broker or analyst confirmation. The certificate match is the proof of ownership, so the scanner can act on a discovered origin on its own — while still never actively scanning an IP it cannot tie back to the target domain.</w:t>
+      </w:r>
+    </w:p>
+    <w:p>
+      <w:pPr>
+        <w:widowControl/>
+        <w:spacing w:after="80"/>
+      </w:pPr>
+      <w:r>
+        <w:rPr>
+          <w:b/>
+        </w:rPr>
+        <w:t xml:space="preserve">Requirements &amp; limitations: </w:t>
+      </w:r>
+      <w:r>
+        <w:t>Origin discovery runs only when a SecurityTrails API key is configured; without it the step is skipped silently. Historical DNS does not always contain the current origin, and an origin that terminates TLS with a different certificate (or no public certificate) will not be verified. Absence of a discovered origin is therefore not proof that none exists.</w:t>
       </w:r>
     </w:p>
     <w:p>
@@ -10104,6 +10204,22 @@
         <w:spacing w:after="80"/>
       </w:pPr>
       <w:r>
+        <w:rPr>
+          <w:b/>
+          <w:color w:val="003399"/>
+        </w:rPr>
+        <w:t xml:space="preserve">NOTE: </w:t>
+      </w:r>
+      <w:r>
+        <w:t>Headline consistency: wherever a single 'Estimated Annual Loss' figure is shown (the broker-summary tile, the executive deck headline, and the Attacker's-View data-impact line), it is the Median (P50) — the same value as the Median row above. It is NOT the probability-weighted mean (expected annual loss / ALE), which for a right-skewed loss distribution sits below the median and would otherwise disagree with every other headline figure.</w:t>
+      </w:r>
+    </w:p>
+    <w:p>
+      <w:pPr>
+        <w:widowControl/>
+        <w:spacing w:after="80"/>
+      </w:pPr>
+      <w:r>
         <w:t>Selection of the appropriate cover limit from these scenarios is the responsibility of the insured in consultation with the broker. The report presents the analysis; the broker structures the cover.</w:t>
       </w:r>
     </w:p>
@@ -10272,7 +10388,7 @@
         <w:spacing w:after="40"/>
       </w:pPr>
       <w:r>
-        <w:t>Step 1 - Pre-flight auto-detection. When the broker enters a domain and sub-industry in the scan form, the /api/preflight endpoint runs a lightweight detection pass (typically 3-8 seconds): JSE-listed status from a curated list and homepage footer ticker scrape; B2C from sub-industry rules and payment-form signals on the homepage; accountable institution from FS / Legal Services / Real Estate sub-industry mapping; healthcare sub-detail (medical_scheme / pharmacy / pharma / hospital_clinic) from domain and page-title keywords; GDPR and PCI from page content hints. Results return as a dict of {flag_name: {auto_detected: bool, evidence: str}}.</w:t>
+        <w:t>Step 1 - Pre-flight auto-detection. When the broker enters a domain and sub-industry in the scan form, the /api/preflight endpoint runs a lightweight detection pass (typically 3-8 seconds): JSE-listed status from a curated list and homepage footer ticker scrape; B2C and PCI from a broadened commerce-signal pass over the homepage (payment-gateway names including SA-local gateways, card-input field markers, storefront / checkout UI text, structured-data product markers, and e-commerce platform fingerprints such as Shopify / WooCommerce / Magento); accountable institution from FS / Legal Services / Real Estate sub-industry mapping; healthcare sub-detail (medical_scheme / pharmacy / pharma / hospital_clinic) from domain and page-title keywords; GDPR from page content hints. Results return as a dict of {flag_name: {auto_detected: bool, evidence: str}}.</w:t>
       </w:r>
     </w:p>
     <w:p>
@@ -10849,7 +10965,7 @@
         <w:spacing w:after="80"/>
       </w:pPr>
       <w:r>
-        <w:t>Auto-detection sources: JSE-listed company is detected from a curated list of ~50 JSE-listed entities plus a footer ticker scrape ('JSE: TICKER' pattern). Accountable institution is inferred from the FS / Legal Services / Real Estate sub-industry mapping (per FIC Act Schedule 1). B2C is inferred from consumer-facing sub-industry labels plus payment-form signals from the homepage probe. Healthcare sub-detail is keyword-classified from domain and page title (medical_scheme / pharmacy / pharma / hospital_clinic).</w:t>
+        <w:t>Auto-detection sources: JSE-listed company is detected from a curated list of ~50 JSE-listed entities plus a footer ticker scrape ('JSE: TICKER' pattern). Accountable institution is inferred from the FS / Legal Services / Real Estate sub-industry mapping (per FIC Act Schedule 1). B2C and PCI are inferred from consumer-facing sub-industry labels plus a broad commerce-signal pass over the homepage — payment-gateway names (incl. SA-local gateways), card-input field markers, storefront / checkout UI text, structured-data product markers, and e-commerce platform fingerprints (an e-commerce platform implies card processing, so it satisfies PCI as well as B2C). Healthcare sub-detail is keyword-classified from domain and page title (medical_scheme / pharmacy / pharma / hospital_clinic).</w:t>
       </w:r>
     </w:p>
     <w:p>

</xml_diff>

<commit_message>
Docs: reconcile user manual for recent changes (2026-07-03)
Content update to manual_parts + regenerated docx:
- 4.6.4 Subdomain: now describes the dual-source CT enumeration (crt.sh +
  certspotter queried in parallel and unioned) and the low-coverage flag when
  both CT providers fail (#7).
- 4.6.5 CVE: added a version-confirmation gating note (port/template CVEs shown
  as potential/unconfirmed; dropped when a banner names a different product; KEV
  badge only on surviving CVEs) (#3/#4).
- Production access URL: Render -> the Google Cloud VM (veilguard.phishield.com/
  scanner), persistent Postgres, no spin-down; Render noted as legacy/being
  retired. TOC + intro + the MC memory note updated to match.

New edits are em-dash-free (rule #13); the manual's pre-existing em-dashes remain
(separate cleanup decision). Manual is third-person (rule #10) and is a docx
(rule #14 PDF font-embedding N/A).

Co-Authored-By: Claude Opus 4.8 <noreply@anthropic.com>
</commit_message>
<xml_diff>
--- a/security_scanner/Phishield_Cyber_Risk_Scanner_User_Manual.docx
+++ b/security_scanner/Phishield_Cyber_Risk_Scanner_User_Manual.docx
@@ -504,7 +504,7 @@
         <w:ind w:left="576"/>
       </w:pPr>
       <w:r>
-        <w:t>9.4  Deployment on Render</w:t>
+        <w:t>9.4  Deployment (Google Cloud VM)</w:t>
       </w:r>
     </w:p>
     <w:p>
@@ -714,7 +714,7 @@
         <w:t xml:space="preserve">Technical Staff </w:t>
       </w:r>
       <w:r>
-        <w:t>responsible for deploying, configuring, or maintaining the scanner. The manual covers environment variables, API key management, deployment on Render, the REST API, and troubleshooting guidance. Technical staff should read the full manual, paying particular attention to the Configuration &amp; Deployment and API Reference sections.</w:t>
+        <w:t>responsible for deploying, configuring, or maintaining the scanner. The manual covers environment variables, API key management, deployment on the Google Cloud VM, the REST API, and troubleshooting guidance. Technical staff should read the full manual, paying particular attention to the Configuration &amp; Deployment and API Reference sections.</w:t>
       </w:r>
     </w:p>
     <w:p>
@@ -1367,7 +1367,7 @@
         <w:t xml:space="preserve">Production Instance: </w:t>
       </w:r>
       <w:r>
-        <w:t>https://phishield-scanner.onrender.com. This is the hosted version used by underwriters and brokers for day-to-day scanning. It is deployed on Render and is accessible from any internet-connected device.</w:t>
+        <w:t>https://veilguard.phishield.com/scanner/. This is the hosted version used by underwriters and brokers for day-to-day scanning. It runs on a dedicated Google Cloud VM with a persistent Postgres database, and is accessible from any internet-connected device. An earlier free-tier deployment at phishield-scanner.onrender.com is legacy and is being retired.</w:t>
       </w:r>
     </w:p>
     <w:p>
@@ -1383,7 +1383,7 @@
         <w:t xml:space="preserve">NOTE: </w:t>
       </w:r>
       <w:r>
-        <w:t>The production instance may take 30-60 seconds to respond on the first request if it has been idle, because the Render free tier spins down inactive services. Subsequent requests will respond immediately.</w:t>
+        <w:t>The production instance runs continuously as a managed service on the Google Cloud VM, so it does not spin down and there is no first-request delay. Scan results are held in a persistent Postgres database and survive redeployments (the earlier Render free tier used an ephemeral disk that wiped stored scans on each deploy).</w:t>
       </w:r>
     </w:p>
     <w:p>
@@ -1400,7 +1400,7 @@
         <w:t xml:space="preserve">TIP: </w:t>
       </w:r>
       <w:r>
-        <w:t>Bookmark the production URL for quick access. If you experience slow loading, simply wait for the initial spin-up to complete and then refresh the page.</w:t>
+        <w:t>Bookmark the production URL for quick access.</w:t>
       </w:r>
     </w:p>
     <w:p/>
@@ -4054,7 +4054,7 @@
         <w:spacing w:after="40"/>
       </w:pPr>
       <w:r>
-        <w:t>The scanner scores the SPF qualifier, not merely the record's presence. A terminal -all (fail) is the secure target; ~all (soft-fail) and ?all (neutral) do not instruct receivers to reject spoofed mail (RFC 7208; NIST SP 800-177 Trustworthy Email; M3AAWG). Because a DMARC policy of quarantine or reject governs the disposition of failing mail regardless of the SPF qualifier, the soft-qualifier penalty is applied only when DMARC is not at enforcement - so a deliberate ~all paired with an enforcing DMARC policy, a common and valid configuration for large senders, is not penalised. A bare all is treated as +all (Pass) per RFC 7208. The penalty magnitudes are conservative and calibration-gated. Where a non-enforcing soft-fail or neutral SPF is found, the report's remediation recommends hardening the policy to a terminal -all and includes it in the expected-loss mitigation estimate.</w:t>
+        <w:t>The scanner scores the SPF qualifier, not merely the record's presence. A terminal -all (fail) is the secure target; ~all (soft-fail) and ?all (neutral) do not instruct receivers to reject spoofed mail (RFC 7208; NIST SP 800-177 Trustworthy Email; M3AAWG). Because a DMARC policy of quarantine or reject governs the disposition of failing mail regardless of the SPF qualifier, the soft-qualifier penalty is applied only when DMARC is not at enforcement - so a deliberate ~all paired with an enforcing DMARC policy, a common and valid configuration for large senders, is not penalised. A bare all is treated as +all (Pass) per RFC 7208. The qualifier score penalties are unchanged; the expected-loss remediation credit for hardening a soft-fail or neutral SPF was recalibrated on 5 June 2026 - trimmed about a quarter (keeping the email-authentication credits in a four-to-two-to-one ratio) because DMARC and SPF enforcement block only exact-domain spoofing, a minority of the phishing and business-email-compromise surface (the 2025 Verizon DBIR puts phishing at about 16 percent of breaches). Where a non-enforcing soft-fail or neutral SPF is found, the report's remediation recommends hardening the policy to a terminal -all and includes it in the expected-loss mitigation estimate.</w:t>
       </w:r>
     </w:p>
     <w:p>
@@ -6008,7 +6008,7 @@
         <w:t xml:space="preserve">What it checks: </w:t>
       </w:r>
       <w:r>
-        <w:t>The scanner discovers subdomains through two methods. Certificate Transparency (CT) log scanning via crt.sh is the PRIMARY source — it reveals every subdomain that has ever had a public certificate issued. DNS brute-force resolution of 50+ common prefixes (www, mail, vpn, dev, staging, test, admin, api, beta, backup, jenkins, gitlab, jira, grafana, kibana, phpmyadmin, cpanel, owa, exchange, and many more) is the secondary source, used to catch subdomains that have no certificate. Discovered subdomains are classified as 'risky' when a risk keyword (dev, staging, admin, backup, etc.) appears as a distinct label — the apex itself and the ordinary www host are excluded from the risky count.</w:t>
+        <w:t>The scanner discovers subdomains through two methods. Certificate Transparency (CT) log scanning is the PRIMARY source: it reveals every subdomain that has ever had a public certificate issued. The scanner queries TWO independent CT-log providers, crt.sh and certspotter, in parallel and merges (unions) their results, so a slow or failed response from one provider does not lose coverage. DNS brute-force resolution of 50+ common prefixes (www, mail, vpn, dev, staging, test, admin, api, beta, backup, jenkins, gitlab, jira, grafana, kibana, phpmyadmin, cpanel, owa, exchange, and many more) is the secondary source, used to catch subdomains that have no certificate. Discovered subdomains are classified as 'risky' when a risk keyword (dev, staging, admin, backup, and similar) appears as a distinct label; the apex itself and the ordinary www host are excluded from the risky count.</w:t>
       </w:r>
     </w:p>
     <w:p>
@@ -6023,7 +6023,7 @@
         <w:t xml:space="preserve">How it works: </w:t>
       </w:r>
       <w:r>
-        <w:t>First, a query to crt.sh retrieves all certificates ever issued for the domain and its subdomains from public Certificate Transparency logs (the query is retried once before giving up). This reveals subdomains the organisation may have forgotten about — old staging servers, decommissioned APIs, and test environments. The report only narrates results as discovered 'via Certificate Transparency' when this crt.sh query actually succeeded; if CT is unavailable the card does not claim a CT source. Second, the scanner resolves each of the 50+ brute-force prefixes via DNS. Before doing so it runs a wildcard-DNS guard: two random non-existent labels are resolved, and if they answer (meaning *.domain is a catch-all wildcard) brute-force discovery is suppressed, because every guessed prefix would otherwise appear to resolve and fabricate subdomains that do not exist. Each genuinely discovered subdomain is tagged with risk keywords (dev, staging, test, admin, backup, database, internal, vpn, etc.).</w:t>
+        <w:t>First, the scanner queries both CT-log providers (crt.sh and certspotter) in parallel and unions the subdomains they return. Certificate Transparency reveals subdomains the organisation may have forgotten about, such as old staging servers, decommissioned APIs, and test environments. Querying two providers matters because crt.sh in particular is prone to timeouts and rate-limiting under load; when it fails, certspotter still supplies CT coverage, so enumeration does not silently collapse to the brute-force list alone. If BOTH CT providers are unreachable on a given scan, the card is flagged low-coverage: the report states plainly that the external attack surface is likely under-reported, and that a fall in subdomain count versus a prior scan should be read as missing data rather than as the organisation having removed subdomains. Second, the scanner resolves each of the 50+ brute-force prefixes via DNS. Before doing so it runs a wildcard-DNS guard: two random non-existent labels are resolved, and if they answer (meaning *.domain is a catch-all wildcard) brute-force discovery is suppressed, because every guessed prefix would otherwise appear to resolve and fabricate subdomains that do not exist.</w:t>
       </w:r>
     </w:p>
     <w:p>
@@ -6223,6 +6223,22 @@
         <w:spacing w:after="80"/>
       </w:pPr>
       <w:r>
+        <w:rPr>
+          <w:b/>
+          <w:color w:val="003399"/>
+        </w:rPr>
+        <w:t xml:space="preserve">NOTE: </w:t>
+      </w:r>
+      <w:r>
+        <w:t>Version-confirmation gating. Where a CVE is inferred from an open port or a service template rather than from a confirmed software version, the scanner marks it as version-unconfirmed and the report presents it as a potential, unconfirmed finding. When a detected service banner names a different product than a templated CVE assumes (for example a Pure-FTPd banner on a port whose template lists ProFTPD vulnerabilities), that CVE is dropped rather than shown. The CISA KEV 'actively exploited' badge is displayed only for CVEs that survive this gating, so a well-defended host is not tagged with exploited-CVE warnings it does not actually carry.</w:t>
+      </w:r>
+    </w:p>
+    <w:p>
+      <w:pPr>
+        <w:widowControl/>
+        <w:spacing w:after="80"/>
+      </w:pPr>
+      <w:r>
         <w:t>Common findings include:</w:t>
       </w:r>
     </w:p>
@@ -10090,17 +10106,17 @@
         <w:spacing w:after="40"/>
       </w:pPr>
       <w:r>
-        <w:t>C1: Post-breach liability - notification costs, credit monitoring, legal fees, reputational damage, and customer churn. The central (expected-loss) view computes C1 as the residual of the IBM SA breach anchor after C2-C5 are allocated. The catastrophe view computes C1 instead as a records-driven stand-alone liability: a realised catastrophe breach exposes approximately the full record base, so catastrophe-C1 equals the estimated records held multiplied by a per-record liability of R90, carrying a lognormal heavy tail, floored at the central residual. The R90 figure is the international class-action settlement anchor (Anthem approximately R27, Capital One approximately R33 and Equifax approximately R53 per affected person, plus legal and credit-monitoring load). For smaller organisations the residual floor dominates; for large consumer record-holders the records-driven term dominates.</w:t>
-      </w:r>
-    </w:p>
-    <w:p>
-      <w:pPr>
-        <w:pStyle w:val="ListParagraph"/>
-        <w:widowControl/>
-        <w:spacing w:after="40"/>
-      </w:pPr>
-      <w:r>
-        <w:t>C2: Regulatory fines per jurisdiction. The expected (P50) POPIA figure is enforcement-anchored as the probability of a fine given a breach (0.02) multiplied by the expected fine given that a fine is levied (R5 million), giving R100 000 expected. Both inputs are anchored to POPIA's entire administrative-fine record to date: two Section 109 fines (Department of Justice 2023 and Department of Basic Education 2024), each R5 million, both public-sector and both for failure to comply with an enforcement notice, with zero private-commercial fines. The catastrophe view uses the full R10 million Section 109 statutory ceiling. GDPR exposure (4% of global turnover, uncapped) and PCI DSS fines are added where the scan input toggles indicate they apply.</w:t>
+        <w:t>C1: Post-breach liability - notification costs, credit monitoring, legal fees, reputational damage, and customer churn. The central (expected-loss) view computes C1 as the residual of the IBM SA breach anchor after C2-C5 are allocated. The catastrophe view computes C1 instead as a records-driven stand-alone liability: a realised catastrophe breach exposes approximately the full record base, so catastrophe-C1 equals the estimated records held multiplied by a per-record liability of R90, carrying a lognormal heavy tail, floored at the central residual. The R90 figure is the international class-action settlement anchor (Anthem approximately R27, Capital One approximately R33 and Equifax approximately R53 per affected person, plus legal and credit-monitoring load). For smaller organisations the residual floor dominates; for large consumer record-holders the records-driven term dominates. Because the IBM SA figure is an all-sizes AVERAGE (skewed upward by large-organisation breaches), that residual floor is tapered down for sub-large-cap entities - from about 30 percent of the modelled residual at R10 million of revenue, rising smoothly to the full residual by about R2 billion - so a smaller organisation's catastrophe is not over-stated by an average that does not fit its size. There is no cap: a small entity's modelled catastrophe can still exceed its annual revenue. The taper bounds are calibration parameters, configurable without redeployment.</w:t>
+      </w:r>
+    </w:p>
+    <w:p>
+      <w:pPr>
+        <w:pStyle w:val="ListParagraph"/>
+        <w:widowControl/>
+        <w:spacing w:after="40"/>
+      </w:pPr>
+      <w:r>
+        <w:t>C2: Regulatory fines per jurisdiction. The expected (P50) POPIA figure is enforcement-anchored as the probability of a fine given a breach (0.02) multiplied by the expected fine given that a fine is levied (R5 million), giving R100 000 expected. Both inputs are anchored to POPIA's entire administrative-fine record to date: two Section 109 fines (Department of Justice 2023 and Department of Basic Education 2024), each R5 million, both public-sector and both for failure to comply with an enforcement notice, with zero private-commercial fines. The catastrophe view uses the full R10 million Section 109 statutory ceiling, scaled by the enterprise capacity factor - but that factor is floored (at 0.80) for the POPIA and ECTA fixed-cap ceilings only, because a serious breach at even a small qualifying entity can attract most of those broadly-applicable statutory ceilings, so the fine is not discounted away by company size. The high discretionary sector ceilings (such as FSCA R100M and FIC R50M) keep scaling by the un-floored capacity factor, so a small qualifying entity is not modelled as facing most of a R100M sector ceiling. GDPR exposure (4% of global turnover, uncapped) and PCI DSS fines are added where the scan input toggles indicate they apply.</w:t>
       </w:r>
     </w:p>
     <w:p>
@@ -10111,6 +10127,16 @@
       </w:pPr>
       <w:r>
         <w:t>C3: Business interruption - revenue loss during recovery. The Monte Carlo recovery-time distribution is PERT(2, 14, 90) days (mode 14, mean approximately 24.7, maximum 90): the 14-day mode reflects a good incident-response / Sophos Rapid Response recovery, the approximately 25-day mean matches the Coveware and IBM 2025 average of around 24 days, and the 90-day maximum is the insurance indemnity-period cap. The central business-interruption figure retains a 25-day point estimate, equal to the new distribution mean.</w:t>
+      </w:r>
+    </w:p>
+    <w:p>
+      <w:pPr>
+        <w:pStyle w:val="ListParagraph"/>
+        <w:widowControl/>
+        <w:spacing w:after="40"/>
+      </w:pPr>
+      <w:r>
+        <w:t>C3 distinguishes two outage regimes. A ransomware or breach REBUILD recovers gradually - revenue loss easing from roughly 90 percent on day one to about 10 percent by the end of recovery - which averages to 50 percent over the recovery period regardless of how long that period runs (a linear 90-to-10 curve averages 50 percent whether recovery takes 25 days or 80, so this figure does not drift as recovery times change). An ACUTE outage such as a denial-of-service attack is a different regime: while it is live the service is simply down, at near-full revenue loss throughout, with no gradual-recovery tail to average against. Acute events (denial-of-service and the short opportunistic, silent and extortion legs) therefore use a flat 85 percent daily impact, independent of the average recovery period, while the longer rebuilds retain the 50 percent recovery average. Corrected on 5 June 2026; previously a single flat 50 percent had under-counted short, sharp outages.</w:t>
       </w:r>
     </w:p>
     <w:p>
@@ -10333,7 +10359,7 @@
         <w:spacing w:after="80"/>
       </w:pPr>
       <w:r>
-        <w:t>The model runs 50,000 Monte Carlo iterations using PERT distributions (lambda = 4) for all uncertain parameters. PERT distributions are preferred over triangular distributions because they concentrate more probability around the most likely value while still allowing for tail events. The 50,000 iteration count gives stable tail estimation at the longest return period (P99.6, ~200 tail samples) without breaching the Render free-tier memory limit.</w:t>
+        <w:t>The model runs 50,000 Monte Carlo iterations using PERT distributions (lambda = 4) for all uncertain parameters. PERT distributions are preferred over triangular distributions because they concentrate more probability around the most likely value while still allowing for tail events. The 50,000 iteration count gives stable tail estimation at the longest return period (P99.6, ~200 tail samples) while keeping memory use modest.</w:t>
       </w:r>
     </w:p>
     <w:p>
@@ -10569,16 +10595,16 @@
         <w:spacing w:after="40"/>
       </w:pPr>
       <w:r>
-        <w:t>The total cyber-incident probability is graded on a separate, provisional multi-channel band set: below 5% Low, 5 to 15% Typical, 15 to 30% Elevated, and above 30% High. These bands are provisional pending a dedicated multi-channel calibration and are labelled as provisional in the report.</w:t>
-      </w:r>
-    </w:p>
-    <w:p>
-      <w:pPr>
-        <w:widowControl/>
-        <w:spacing w:after="80"/>
-      </w:pPr>
-      <w:r>
-        <w:t>A third and separate line reports an availability resilience indicator. It spans outage and availability risk arising from both denial-of-service and system or infrastructure-failure causes, and is derived heuristically from the WAF, CDN, hosting-concentration (single autonomous system) and DNS-blocklist signals. It is reported as an indicative measure only: it is not a calibrated probability, and because outage and system-failure cover varies between policies and over time it carries no statement of policy coverage. It describes the risk - the stable and prevalent fact - and is kept on its own line because it is a different risk type (availability rather than breach or extortion) measured on different signals.</w:t>
+        <w:t>The total cyber-incident probability is graded on a separate, relative multi-channel posture band set: below 8% Low, 8 to 18% Typical, 18 to 28% Elevated, and above 28% High (re-fit from 5/15/30 on 5 June 2026 so a genuinely low-risk posture can reach Low). These are relative-posture bands: the combined breach-and-ransomware rate sits above the per-organisation material-incident claims frequency reported by cyber insurers (Coalition's 2025 study: 1.2 percent a year below 25 million dollars of revenue, rising to 5.7 percent above 100 million; Cyentia IRIS under 2 percent for small and medium business), because it aggregates both channels as an index. They should be read as relative posture rather than a calibrated annual claim rate; a dedicated frequency-calibration pass on the ransomware loss-event frequency is a recorded next step.</w:t>
+      </w:r>
+    </w:p>
+    <w:p>
+      <w:pPr>
+        <w:widowControl/>
+        <w:spacing w:after="80"/>
+      </w:pPr>
+      <w:r>
+        <w:t>A third and separate line reports an availability resilience indicator. It spans outage and availability risk arising from both denial-of-service and system or infrastructure-failure causes. Its base rate is FAIR-anchored to the Uptime Institute's annual outage analysis (the serious-or-severe outage rate, roughly 3 percent a year), with additive increments for the availability-relevant control gaps: absence of a CDN or DDoS-mitigation service (the primary lever), single-homed hosting on one autonomous system (secondary), and absence of a web application firewall (a smaller, layer-7-flood-only contribution, since most volumetric denial-of-service is absorbed at the CDN edge rather than the firewall). Because outage and system-failure cover varies between policies and over time it carries no statement of policy coverage. It describes the risk - the stable and prevalent fact - and is kept on its own line because it is a different risk type (availability rather than breach or extortion) measured on different signals.</w:t>
       </w:r>
     </w:p>
     <w:p>
@@ -10594,7 +10620,7 @@
         <w:t xml:space="preserve">NOTE: </w:t>
       </w:r>
       <w:r>
-        <w:t>The availability resilience indicator is flagged in the JSON output as not calibrated. A FAIR re-anchoring of this figure is a recorded future step and is required before it is ever presented as a calibrated rate.</w:t>
+        <w:t>The availability resilience indicator's base rate is now FAIR-anchored to published outage-frequency data; the per-control increments remain directional and the JSON output still flags the figure as not fully calibrated. It describes availability risk and is not presented as a coverage statement.</w:t>
       </w:r>
     </w:p>
     <w:p>
@@ -10747,7 +10773,7 @@
         <w:spacing w:after="80"/>
       </w:pPr>
       <w:r>
-        <w:t>Worked example - R200M listed FS broker (B2C, accountable institution), capacity factor 0.65: POPIA R10M x 0.65 = R6.5M; ECTA R1M x 0.65 = R0.65M; CPA 10% x R200M = R20M (no factor - percentage already scales); FSCA R100M x 0.65 = R65M; FIC R50M x 0.65 = R32.5M; JSE R7.5M x 0.65 = R4.875M. Total cat stack: approximately R129.5M. The same entity at R10M revenue (capacity factor 0.15) would face approximately R24M total.</w:t>
+        <w:t>Worked example - R200M listed FS broker (B2C, accountable institution), capacity factor 0.65: POPIA R10M x 0.80 (floored) = R8M; ECTA R1M x 0.80 (floored) = R0.8M; CPA 10% x R200M = R20M (no factor - percentage already scales); FSCA R100M x 0.65 = R65M; FIC R50M x 0.65 = R32.5M; JSE R7.5M x 0.65 = R4.875M. Total cat stack: approximately R131.2M. The same entity at R10M revenue (capacity factor 0.15, with POPIA/ECTA still floored to 0.80 but the sector lines scaling at 0.15) would face approximately R33.4M total.</w:t>
       </w:r>
     </w:p>
     <w:p>

</xml_diff>

<commit_message>
Docs: em-dash / double-hyphen cleanup in user manual (rule #13)
Replace every em-dash (literal and —-escaped) and prose double-hyphen across
manual_parts/part1-6 with the punctuation each context needs: colon for label
lead-ins, commas for asides and appositives, and "X to Y" for numeric ranges.
Verified zero em-dashes in the rebuilt .docx; the two remaining "--" are the
xn-- punycode prefix and the one en-dash is a rand range (R0-R3,600), both
permitted typography. No wording/content changes.

Co-Authored-By: Claude Opus 4.8 <noreply@anthropic.com>
</commit_message>
<xml_diff>
--- a/security_scanner/Phishield_Cyber_Risk_Scanner_User_Manual.docx
+++ b/security_scanner/Phishield_Cyber_Risk_Scanner_User_Manual.docx
@@ -581,7 +581,7 @@
         <w:spacing w:after="80"/>
       </w:pPr>
       <w:r>
-        <w:t>The Phishield Cyber Risk Scanner is an external, passive security evaluation tool designed specifically for cyber insurance underwriting. It examines the publicly observable digital infrastructure of an organisation -- DNS records, SSL certificates, HTTP headers, open ports, email authentication, credential leaks, dark-web exposure, and reputation data -- without ever sending a single intrusive packet to the target.</w:t>
+        <w:t>The Phishield Cyber Risk Scanner is an external, passive security evaluation tool designed specifically for cyber insurance underwriting. It examines the publicly observable digital infrastructure of an organisation, DNS records, SSL certificates, HTTP headers, open ports, email authentication, credential leaks, dark-web exposure, and reputation data, without ever sending a single intrusive packet to the target.</w:t>
       </w:r>
     </w:p>
     <w:p>
@@ -600,27 +600,27 @@
         <w:spacing w:after="40"/>
       </w:pPr>
       <w:r>
-        <w:t>Risk Assessment -- Produce a quantitative risk profile of a prospective policyholder before the policy is bound, giving underwriters an objective, data-driven view of the organisation's external security posture.</w:t>
-      </w:r>
-    </w:p>
-    <w:p>
-      <w:pPr>
-        <w:pStyle w:val="ListParagraph"/>
-        <w:widowControl/>
-        <w:spacing w:after="40"/>
-      </w:pPr>
-      <w:r>
-        <w:t>Premium Calibration -- Feed the scanner's Ransomware Susceptibility Index (RSI), FAIR-model financial impact estimates, and Data Breach Index (DBI) into the premium calculation workflow so that pricing reflects actual technical risk rather than self-reported questionnaire answers alone.</w:t>
-      </w:r>
-    </w:p>
-    <w:p>
-      <w:pPr>
-        <w:pStyle w:val="ListParagraph"/>
-        <w:widowControl/>
-        <w:spacing w:after="40"/>
-      </w:pPr>
-      <w:r>
-        <w:t>Broker Reporting -- Generate a professional PDF report that brokers can present to clients, explaining findings in plain language alongside actionable recommendations that can improve the client's risk profile and, in turn, their premium.</w:t>
+        <w:t>Risk Assessment: Produce a quantitative risk profile of a prospective policyholder before the policy is bound, giving underwriters an objective, data-driven view of the organisation's external security posture.</w:t>
+      </w:r>
+    </w:p>
+    <w:p>
+      <w:pPr>
+        <w:pStyle w:val="ListParagraph"/>
+        <w:widowControl/>
+        <w:spacing w:after="40"/>
+      </w:pPr>
+      <w:r>
+        <w:t>Premium Calibration: Feed the scanner's Ransomware Susceptibility Index (RSI), FAIR-model financial impact estimates, and Data Breach Index (DBI) into the premium calculation workflow so that pricing reflects actual technical risk rather than self-reported questionnaire answers alone.</w:t>
+      </w:r>
+    </w:p>
+    <w:p>
+      <w:pPr>
+        <w:pStyle w:val="ListParagraph"/>
+        <w:widowControl/>
+        <w:spacing w:after="40"/>
+      </w:pPr>
+      <w:r>
+        <w:t>Broker Reporting: Generate a professional PDF report that brokers can present to clients, explaining findings in plain language alongside actionable recommendations that can improve the client's risk profile and, in turn, their premium.</w:t>
       </w:r>
     </w:p>
     <w:p>
@@ -776,7 +776,7 @@
         <w:rPr>
           <w:b/>
         </w:rPr>
-        <w:t xml:space="preserve">Phase 1 -- IP Discovery. </w:t>
+        <w:t xml:space="preserve">Phase 1: IP Discovery. </w:t>
       </w:r>
       <w:r>
         <w:t>The scanner resolves the domain's DNS A records to obtain all public IP addresses associated with the domain. If additional client-supplied IP addresses are provided (for example, known mail server IPs or secondary data-centre addresses), these are merged into the scan scope. Every subsequent checker operates against either the domain name itself or the discovered IP addresses.</w:t>
@@ -791,7 +791,7 @@
         <w:rPr>
           <w:b/>
         </w:rPr>
-        <w:t xml:space="preserve">Phase 2a -- Lightweight Domain Checkers (Concurrent). </w:t>
+        <w:t xml:space="preserve">Phase 2a: Lightweight Domain Checkers (Concurrent). </w:t>
       </w:r>
       <w:r>
         <w:t>Approximately 20 checkers run simultaneously against the domain. These include email authentication (SPF, DKIM, DMARC), HTTP header analysis, WAF detection, technology stack fingerprinting, breach database lookups, credential leak checks, dark-web exposure searches, admin panel detection, domain intelligence, privacy compliance analysis, and more. Running these concurrently keeps total scan time under control.</w:t>
@@ -806,7 +806,7 @@
         <w:rPr>
           <w:b/>
         </w:rPr>
-        <w:t xml:space="preserve">Phase 2b -- Heavy Checkers (Sequential). </w:t>
+        <w:t xml:space="preserve">Phase 2b: Heavy Checkers (Sequential). </w:t>
       </w:r>
       <w:r>
         <w:t>A small number of resource-intensive checkers run one at a time after the concurrent batch completes. These include the SSL/TLS deep analysis (which spawns a subprocess to evaluate cipher suites, certificate chains, and protocol support) and subdomain reconnaissance (which queries Certificate Transparency logs and resolves large numbers of hostnames). Running these sequentially prevents memory exhaustion on resource-constrained hosting environments.</w:t>
@@ -821,7 +821,7 @@
         <w:rPr>
           <w:b/>
         </w:rPr>
-        <w:t xml:space="preserve">Phase 3 -- IP-Level Checkers. </w:t>
+        <w:t xml:space="preserve">Phase 3: IP-Level Checkers. </w:t>
       </w:r>
       <w:r>
         <w:t>For each discovered IP address, the scanner runs a set of IP-specific checkers: DNS infrastructure and open port scanning, high-risk protocol detection (RDP, Telnet, FTP, SMB), Shodan vulnerability lookups, and DNSBL blacklist checks. Results from multiple IPs are merged into a single aggregate view, preserving per-IP detail for the technical report.</w:t>
@@ -836,7 +836,7 @@
         <w:rPr>
           <w:b/>
         </w:rPr>
-        <w:t xml:space="preserve">Phase 4 -- OSV Enrichment. </w:t>
+        <w:t xml:space="preserve">Phase 4: OSV Enrichment. </w:t>
       </w:r>
       <w:r>
         <w:t>Any technologies or software versions detected during earlier phases are cross-referenced against the OSV.dev vulnerability database (which includes the National Vulnerability Database / NVD). This enrichment step attaches known CVEs to detected software, enabling the report to highlight specific, exploitable vulnerabilities rather than generic warnings.</w:t>
@@ -851,7 +851,7 @@
         <w:rPr>
           <w:b/>
         </w:rPr>
-        <w:t xml:space="preserve">Phase 5 -- Scoring. </w:t>
+        <w:t xml:space="preserve">Phase 5: Scoring. </w:t>
       </w:r>
       <w:r>
         <w:t>Each checker produces a normalised score. These are combined using category-level weighting to produce an overall risk score from 0 (critical risk) to 100 (excellent posture). The risk level is then classified as Critical, High, Medium, Low, or Excellent based on defined thresholds.</w:t>
@@ -866,7 +866,7 @@
         <w:rPr>
           <w:b/>
         </w:rPr>
-        <w:t xml:space="preserve">Phase 6 -- Insurance Analytics. </w:t>
+        <w:t xml:space="preserve">Phase 6: Insurance Analytics. </w:t>
       </w:r>
       <w:r>
         <w:t>The scanner calculates three insurance-specific metrics: the Ransomware Susceptibility Index (RSI), which adjusts the technical score for industry risk and organisational size; FAIR-model financial impact estimates using Monte Carlo simulation with 10,000 iterations; and the Data Breach Index (DBI), which estimates the organisation's digital dependency. These analytics feed directly into premium calculation and underwriting decision-making.</w:t>
@@ -1048,97 +1048,97 @@
         <w:spacing w:after="40"/>
       </w:pPr>
       <w:r>
-        <w:t>Shodan -- Internet-wide port and service scanning data, vulnerability lookups</w:t>
-      </w:r>
-    </w:p>
-    <w:p>
-      <w:pPr>
-        <w:pStyle w:val="ListParagraph"/>
-        <w:widowControl/>
-        <w:spacing w:after="40"/>
-      </w:pPr>
-      <w:r>
-        <w:t>Have I Been Pwned (HIBP) -- Breach database for domain-level email exposure</w:t>
-      </w:r>
-    </w:p>
-    <w:p>
-      <w:pPr>
-        <w:pStyle w:val="ListParagraph"/>
-        <w:widowControl/>
-        <w:spacing w:after="40"/>
-      </w:pPr>
-      <w:r>
-        <w:t>Dehashed -- Credential leak database with password hash and plaintext detection</w:t>
-      </w:r>
-    </w:p>
-    <w:p>
-      <w:pPr>
-        <w:pStyle w:val="ListParagraph"/>
-        <w:widowControl/>
-        <w:spacing w:after="40"/>
-      </w:pPr>
-      <w:r>
-        <w:t>VirusTotal -- Malware, phishing, and reputation intelligence</w:t>
-      </w:r>
-    </w:p>
-    <w:p>
-      <w:pPr>
-        <w:pStyle w:val="ListParagraph"/>
-        <w:widowControl/>
-        <w:spacing w:after="40"/>
-      </w:pPr>
-      <w:r>
-        <w:t>SecurityTrails -- Historical DNS records, domain ownership changes</w:t>
-      </w:r>
-    </w:p>
-    <w:p>
-      <w:pPr>
-        <w:pStyle w:val="ListParagraph"/>
-        <w:widowControl/>
-        <w:spacing w:after="40"/>
-      </w:pPr>
-      <w:r>
-        <w:t>IntelX (Intelligence X) -- Dark-web and paste-site exposure monitoring</w:t>
-      </w:r>
-    </w:p>
-    <w:p>
-      <w:pPr>
-        <w:pStyle w:val="ListParagraph"/>
-        <w:widowControl/>
-        <w:spacing w:after="40"/>
-      </w:pPr>
-      <w:r>
-        <w:t>OSV.dev / NVD -- Open-source vulnerability database for CVE enrichment</w:t>
-      </w:r>
-    </w:p>
-    <w:p>
-      <w:pPr>
-        <w:pStyle w:val="ListParagraph"/>
-        <w:widowControl/>
-        <w:spacing w:after="40"/>
-      </w:pPr>
-      <w:r>
-        <w:t>HudsonRock -- Infostealer malware credential compromise data</w:t>
-      </w:r>
-    </w:p>
-    <w:p>
-      <w:pPr>
-        <w:pStyle w:val="ListParagraph"/>
-        <w:widowControl/>
-        <w:spacing w:after="40"/>
-      </w:pPr>
-      <w:r>
-        <w:t>Certificate Transparency Logs -- Subdomain enumeration via issued certificates</w:t>
-      </w:r>
-    </w:p>
-    <w:p>
-      <w:pPr>
-        <w:pStyle w:val="ListParagraph"/>
-        <w:widowControl/>
-        <w:spacing w:after="40"/>
-      </w:pPr>
-      <w:r>
-        <w:t>Multiple DNSBL providers -- IP and domain blacklist status checks</w:t>
+        <w:t>Shodan: Internet-wide port and service scanning data, vulnerability lookups</w:t>
+      </w:r>
+    </w:p>
+    <w:p>
+      <w:pPr>
+        <w:pStyle w:val="ListParagraph"/>
+        <w:widowControl/>
+        <w:spacing w:after="40"/>
+      </w:pPr>
+      <w:r>
+        <w:t>Have I Been Pwned (HIBP): Breach database for domain-level email exposure</w:t>
+      </w:r>
+    </w:p>
+    <w:p>
+      <w:pPr>
+        <w:pStyle w:val="ListParagraph"/>
+        <w:widowControl/>
+        <w:spacing w:after="40"/>
+      </w:pPr>
+      <w:r>
+        <w:t>Dehashed: Credential leak database with password hash and plaintext detection</w:t>
+      </w:r>
+    </w:p>
+    <w:p>
+      <w:pPr>
+        <w:pStyle w:val="ListParagraph"/>
+        <w:widowControl/>
+        <w:spacing w:after="40"/>
+      </w:pPr>
+      <w:r>
+        <w:t>VirusTotal: Malware, phishing, and reputation intelligence</w:t>
+      </w:r>
+    </w:p>
+    <w:p>
+      <w:pPr>
+        <w:pStyle w:val="ListParagraph"/>
+        <w:widowControl/>
+        <w:spacing w:after="40"/>
+      </w:pPr>
+      <w:r>
+        <w:t>SecurityTrails: Historical DNS records, domain ownership changes</w:t>
+      </w:r>
+    </w:p>
+    <w:p>
+      <w:pPr>
+        <w:pStyle w:val="ListParagraph"/>
+        <w:widowControl/>
+        <w:spacing w:after="40"/>
+      </w:pPr>
+      <w:r>
+        <w:t>IntelX (Intelligence X): Dark-web and paste-site exposure monitoring</w:t>
+      </w:r>
+    </w:p>
+    <w:p>
+      <w:pPr>
+        <w:pStyle w:val="ListParagraph"/>
+        <w:widowControl/>
+        <w:spacing w:after="40"/>
+      </w:pPr>
+      <w:r>
+        <w:t>OSV.dev / NVD: Open-source vulnerability database for CVE enrichment</w:t>
+      </w:r>
+    </w:p>
+    <w:p>
+      <w:pPr>
+        <w:pStyle w:val="ListParagraph"/>
+        <w:widowControl/>
+        <w:spacing w:after="40"/>
+      </w:pPr>
+      <w:r>
+        <w:t>HudsonRock: Infostealer malware credential compromise data</w:t>
+      </w:r>
+    </w:p>
+    <w:p>
+      <w:pPr>
+        <w:pStyle w:val="ListParagraph"/>
+        <w:widowControl/>
+        <w:spacing w:after="40"/>
+      </w:pPr>
+      <w:r>
+        <w:t>Certificate Transparency Logs: Subdomain enumeration via issued certificates</w:t>
+      </w:r>
+    </w:p>
+    <w:p>
+      <w:pPr>
+        <w:pStyle w:val="ListParagraph"/>
+        <w:widowControl/>
+        <w:spacing w:after="40"/>
+      </w:pPr>
+      <w:r>
+        <w:t>Multiple DNSBL providers: IP and domain blacklist status checks</w:t>
       </w:r>
     </w:p>
     <w:p>
@@ -1434,7 +1434,7 @@
         <w:spacing w:after="40"/>
       </w:pPr>
       <w:r>
-        <w:t>Google Chrome (version 90 or later) -- recommended</w:t>
+        <w:t>Google Chrome (version 90 or later), recommended</w:t>
       </w:r>
     </w:p>
     <w:p>
@@ -1839,27 +1839,27 @@
         <w:spacing w:after="40"/>
       </w:pPr>
       <w:r>
-        <w:t>Running -- A spinning indicator shows that the checker is currently executing. Multiple checkers run concurrently during Phase 2a.</w:t>
-      </w:r>
-    </w:p>
-    <w:p>
-      <w:pPr>
-        <w:pStyle w:val="ListParagraph"/>
-        <w:widowControl/>
-        <w:spacing w:after="40"/>
-      </w:pPr>
-      <w:r>
-        <w:t>Done -- A green tick indicates successful completion. The checker's score or grade appears next to its name.</w:t>
-      </w:r>
-    </w:p>
-    <w:p>
-      <w:pPr>
-        <w:pStyle w:val="ListParagraph"/>
-        <w:widowControl/>
-        <w:spacing w:after="40"/>
-      </w:pPr>
-      <w:r>
-        <w:t>Error -- A red cross indicates that the checker encountered an error, typically a timeout or API failure. The affected data will be missing from the results.</w:t>
+        <w:t>Running: A spinning indicator shows that the checker is currently executing. Multiple checkers run concurrently during Phase 2a.</w:t>
+      </w:r>
+    </w:p>
+    <w:p>
+      <w:pPr>
+        <w:pStyle w:val="ListParagraph"/>
+        <w:widowControl/>
+        <w:spacing w:after="40"/>
+      </w:pPr>
+      <w:r>
+        <w:t>Done: A green tick indicates successful completion. The checker's score or grade appears next to its name.</w:t>
+      </w:r>
+    </w:p>
+    <w:p>
+      <w:pPr>
+        <w:pStyle w:val="ListParagraph"/>
+        <w:widowControl/>
+        <w:spacing w:after="40"/>
+      </w:pPr>
+      <w:r>
+        <w:t>Error: A red cross indicates that the checker encountered an error, typically a timeout or API failure. The affected data will be missing from the results.</w:t>
       </w:r>
     </w:p>
     <w:p>
@@ -2155,37 +2155,37 @@
         <w:spacing w:after="40"/>
       </w:pPr>
       <w:r>
-        <w:t>Rank 1 -- 1 000:  Score 100.  Among the most visited sites on the internet.</w:t>
-      </w:r>
-    </w:p>
-    <w:p>
-      <w:pPr>
-        <w:pStyle w:val="ListParagraph"/>
-        <w:widowControl/>
-        <w:spacing w:after="40"/>
-      </w:pPr>
-      <w:r>
-        <w:t>Rank 1 001 -- 10 000:  Score 90.  High-traffic, well-known domain.</w:t>
-      </w:r>
-    </w:p>
-    <w:p>
-      <w:pPr>
-        <w:pStyle w:val="ListParagraph"/>
-        <w:widowControl/>
-        <w:spacing w:after="40"/>
-      </w:pPr>
-      <w:r>
-        <w:t>Rank 10 001 -- 100 000:  Score 70.  Moderate traffic, established online presence.</w:t>
-      </w:r>
-    </w:p>
-    <w:p>
-      <w:pPr>
-        <w:pStyle w:val="ListParagraph"/>
-        <w:widowControl/>
-        <w:spacing w:after="40"/>
-      </w:pPr>
-      <w:r>
-        <w:t>Rank 100 001 -- 1 000 000:  Score 50.  Lower traffic but still in the top million.</w:t>
+        <w:t>Rank 1 to 1 000:  Score 100.  Among the most visited sites on the internet.</w:t>
+      </w:r>
+    </w:p>
+    <w:p>
+      <w:pPr>
+        <w:pStyle w:val="ListParagraph"/>
+        <w:widowControl/>
+        <w:spacing w:after="40"/>
+      </w:pPr>
+      <w:r>
+        <w:t>Rank 1 001 to 10 000:  Score 90.  High-traffic, well-known domain.</w:t>
+      </w:r>
+    </w:p>
+    <w:p>
+      <w:pPr>
+        <w:pStyle w:val="ListParagraph"/>
+        <w:widowControl/>
+        <w:spacing w:after="40"/>
+      </w:pPr>
+      <w:r>
+        <w:t>Rank 10 001 to 100 000:  Score 70.  Moderate traffic, established online presence.</w:t>
+      </w:r>
+    </w:p>
+    <w:p>
+      <w:pPr>
+        <w:pStyle w:val="ListParagraph"/>
+        <w:widowControl/>
+        <w:spacing w:after="40"/>
+      </w:pPr>
+      <w:r>
+        <w:t>Rank 100 001 to 1 000 000:  Score 50.  Lower traffic but still in the top million.</w:t>
       </w:r>
     </w:p>
     <w:p>
@@ -2465,57 +2465,57 @@
         <w:spacing w:after="40"/>
       </w:pPr>
       <w:r>
-        <w:t>Grade A+ (score 95--100):  Excellent. Modern TLS only, strong ciphers, valid certificate with adequate key size, HSTS enabled, OCSP stapling active, valid chain, and restrictive CAA records. This is the gold standard.</w:t>
-      </w:r>
-    </w:p>
-    <w:p>
-      <w:pPr>
-        <w:pStyle w:val="ListParagraph"/>
-        <w:widowControl/>
-        <w:spacing w:after="40"/>
-      </w:pPr>
-      <w:r>
-        <w:t>Grade A (score 85--94):  Very good. One or two minor items may be missing (for example, OCSP stapling or CAA records) but overall configuration is strong.</w:t>
-      </w:r>
-    </w:p>
-    <w:p>
-      <w:pPr>
-        <w:pStyle w:val="ListParagraph"/>
-        <w:widowControl/>
-        <w:spacing w:after="40"/>
-      </w:pPr>
-      <w:r>
-        <w:t>Grade B (score 70--84):  Acceptable. The certificate is valid and modern TLS is supported, but there may be a deprecated TLS version still enabled or HSTS may be missing. Remediation is recommended.</w:t>
-      </w:r>
-    </w:p>
-    <w:p>
-      <w:pPr>
-        <w:pStyle w:val="ListParagraph"/>
-        <w:widowControl/>
-        <w:spacing w:after="40"/>
-      </w:pPr>
-      <w:r>
-        <w:t>Grade C (score 55--69):  Weak. Multiple issues are present. Commonly this means legacy TLS versions are enabled alongside weak ciphers or a certificate approaching expiry. Remediation should be prioritised.</w:t>
-      </w:r>
-    </w:p>
-    <w:p>
-      <w:pPr>
-        <w:pStyle w:val="ListParagraph"/>
-        <w:widowControl/>
-        <w:spacing w:after="40"/>
-      </w:pPr>
-      <w:r>
-        <w:t>Grade D (score 40--54):  Poor. Serious configuration weaknesses are present. This may include an expiring certificate combined with deprecated protocols and missing HSTS.</w:t>
-      </w:r>
-    </w:p>
-    <w:p>
-      <w:pPr>
-        <w:pStyle w:val="ListParagraph"/>
-        <w:widowControl/>
-        <w:spacing w:after="40"/>
-      </w:pPr>
-      <w:r>
-        <w:t>Grade F (score 0--39):  Critical. The certificate may be expired or invalid, extremely insecure protocols may be enabled, or the chain of trust is broken. Immediate remediation is required.</w:t>
+        <w:t>Grade A+ (score 95 to 100):  Excellent. Modern TLS only, strong ciphers, valid certificate with adequate key size, HSTS enabled, OCSP stapling active, valid chain, and restrictive CAA records. This is the gold standard.</w:t>
+      </w:r>
+    </w:p>
+    <w:p>
+      <w:pPr>
+        <w:pStyle w:val="ListParagraph"/>
+        <w:widowControl/>
+        <w:spacing w:after="40"/>
+      </w:pPr>
+      <w:r>
+        <w:t>Grade A (score 85 to 94):  Very good. One or two minor items may be missing (for example, OCSP stapling or CAA records) but overall configuration is strong.</w:t>
+      </w:r>
+    </w:p>
+    <w:p>
+      <w:pPr>
+        <w:pStyle w:val="ListParagraph"/>
+        <w:widowControl/>
+        <w:spacing w:after="40"/>
+      </w:pPr>
+      <w:r>
+        <w:t>Grade B (score 70 to 84):  Acceptable. The certificate is valid and modern TLS is supported, but there may be a deprecated TLS version still enabled or HSTS may be missing. Remediation is recommended.</w:t>
+      </w:r>
+    </w:p>
+    <w:p>
+      <w:pPr>
+        <w:pStyle w:val="ListParagraph"/>
+        <w:widowControl/>
+        <w:spacing w:after="40"/>
+      </w:pPr>
+      <w:r>
+        <w:t>Grade C (score 55 to 69):  Weak. Multiple issues are present. Commonly this means legacy TLS versions are enabled alongside weak ciphers or a certificate approaching expiry. Remediation should be prioritised.</w:t>
+      </w:r>
+    </w:p>
+    <w:p>
+      <w:pPr>
+        <w:pStyle w:val="ListParagraph"/>
+        <w:widowControl/>
+        <w:spacing w:after="40"/>
+      </w:pPr>
+      <w:r>
+        <w:t>Grade D (score 40 to 54):  Poor. Serious configuration weaknesses are present. This may include an expiring certificate combined with deprecated protocols and missing HSTS.</w:t>
+      </w:r>
+    </w:p>
+    <w:p>
+      <w:pPr>
+        <w:pStyle w:val="ListParagraph"/>
+        <w:widowControl/>
+        <w:spacing w:after="40"/>
+      </w:pPr>
+      <w:r>
+        <w:t>Grade F (score 0 to 39):  Critical. The certificate may be expired or invalid, extremely insecure protocols may be enabled, or the chain of trust is broken. Immediate remediation is required.</w:t>
       </w:r>
     </w:p>
     <w:p>
@@ -2766,7 +2766,7 @@
         <w:t xml:space="preserve">What it checks:  </w:t>
       </w:r>
       <w:r>
-        <w:t>The scanner requests the domain's home page over HTTPS and inspects the HTTP response headers for six security-critical headers. Each header carries a weighted score that reflects its relative importance. The overall score is expressed as a percentage (0--100%) of the maximum achievable weight.</w:t>
+        <w:t>The scanner requests the domain's home page over HTTPS and inspects the HTTP response headers for six security-critical headers. Each header carries a weighted score that reflects its relative importance. The overall score is expressed as a percentage (0 to 100%) of the maximum achievable weight.</w:t>
       </w:r>
     </w:p>
     <w:p>
@@ -2787,7 +2787,7 @@
         <w:rPr>
           <w:b/>
         </w:rPr>
-        <w:t xml:space="preserve">Strict-Transport-Security (HSTS) -- weight 20:  </w:t>
+        <w:t xml:space="preserve">Strict-Transport-Security (HSTS), weight 20:  </w:t>
       </w:r>
       <w:r>
         <w:t>Instructs the browser to only communicate over HTTPS for a specified duration. This prevents protocol-downgrade attacks and cookie hijacking. It is the highest-weighted header because without it, even a site with a valid SSL certificate can be intercepted during the initial HTTP request.</w:t>
@@ -2802,7 +2802,7 @@
         <w:rPr>
           <w:b/>
         </w:rPr>
-        <w:t xml:space="preserve">X-Frame-Options -- weight 15:  </w:t>
+        <w:t xml:space="preserve">X-Frame-Options, weight 15:  </w:t>
       </w:r>
       <w:r>
         <w:t>Controls whether the page can be embedded in an iframe on another site. Without this header (or an equivalent CSP frame-ancestors directive), the site is vulnerable to clickjacking attacks, where an attacker overlays invisible frames to trick users into clicking hidden buttons.</w:t>
@@ -2817,7 +2817,7 @@
         <w:rPr>
           <w:b/>
         </w:rPr>
-        <w:t xml:space="preserve">X-Content-Type-Options -- weight 15:  </w:t>
+        <w:t xml:space="preserve">X-Content-Type-Options, weight 15:  </w:t>
       </w:r>
       <w:r>
         <w:t>When set to 'nosniff', this header prevents browsers from guessing (MIME-sniffing) the content type of a response. Without it, an attacker can upload a file that the browser incorrectly interprets as executable script, enabling cross-site scripting.</w:t>
@@ -2832,7 +2832,7 @@
         <w:rPr>
           <w:b/>
         </w:rPr>
-        <w:t xml:space="preserve">Content-Security-Policy (CSP) -- weight 10 (presence) + 10 (quality):  </w:t>
+        <w:t xml:space="preserve">Content-Security-Policy (CSP), weight 10 (presence) + 10 (quality):  </w:t>
       </w:r>
       <w:r>
         <w:t>CSP is the most powerful browser-side defence against cross-site scripting (XSS) and data injection attacks. It specifies exactly which sources are allowed to load scripts, styles, images, fonts, and other resources. Because a poorly configured CSP can be worse than no CSP at all (by giving a false sense of security), the scanner evaluates both presence and quality separately.</w:t>
@@ -2847,7 +2847,7 @@
         <w:rPr>
           <w:b/>
         </w:rPr>
-        <w:t xml:space="preserve">Referrer-Policy -- weight 15:  </w:t>
+        <w:t xml:space="preserve">Referrer-Policy, weight 15:  </w:t>
       </w:r>
       <w:r>
         <w:t>Controls how much referrer information the browser sends when navigating away from the page. Without a restrictive policy, sensitive URL parameters (such as session tokens or search queries) may leak to third-party sites.</w:t>
@@ -2862,7 +2862,7 @@
         <w:rPr>
           <w:b/>
         </w:rPr>
-        <w:t xml:space="preserve">Permissions-Policy -- weight 15:  </w:t>
+        <w:t xml:space="preserve">Permissions-Policy, weight 15:  </w:t>
       </w:r>
       <w:r>
         <w:t>Allows the site to disable browser features it does not use, such as the camera, microphone, geolocation, or payment API. This limits the damage an attacker can do even if they inject malicious script into the page.</w:t>
@@ -2897,7 +2897,7 @@
         <w:spacing w:after="80"/>
       </w:pPr>
       <w:r>
-        <w:t>When a Content-Security-Policy header is present, the scanner performs an additional quality analysis that produces a separate 0--100 score. This analysis was introduced in Phase 3 to address a common problem: many sites deploy a CSP header that technically exists but is configured so permissively that it provides little real protection.</w:t>
+        <w:t>When a Content-Security-Policy header is present, the scanner performs an additional quality analysis that produces a separate 0 to 100 score. This analysis was introduced in Phase 3 to address a common problem: many sites deploy a CSP header that technically exists but is configured so permissively that it provides little real protection.</w:t>
       </w:r>
     </w:p>
     <w:p>
@@ -2931,37 +2931,37 @@
         <w:spacing w:after="40"/>
       </w:pPr>
       <w:r>
-        <w:t>'unsafe-inline' -- Allows inline scripts and event handlers. This effectively defeats XSS protection, because an attacker who can inject HTML can also inject inline script tags.</w:t>
-      </w:r>
-    </w:p>
-    <w:p>
-      <w:pPr>
-        <w:pStyle w:val="ListParagraph"/>
-        <w:widowControl/>
-        <w:spacing w:after="40"/>
-      </w:pPr>
-      <w:r>
-        <w:t>'unsafe-eval' -- Allows the use of eval(), new Function(), and similar dynamic code execution methods. Attackers frequently exploit these functions to execute injected payloads.</w:t>
-      </w:r>
-    </w:p>
-    <w:p>
-      <w:pPr>
-        <w:pStyle w:val="ListParagraph"/>
-        <w:widowControl/>
-        <w:spacing w:after="40"/>
-      </w:pPr>
-      <w:r>
-        <w:t>Wildcard (*) in script-src -- Permits scripts from any domain. An attacker can host a malicious script on any server and it will be allowed by the policy.</w:t>
-      </w:r>
-    </w:p>
-    <w:p>
-      <w:pPr>
-        <w:pStyle w:val="ListParagraph"/>
-        <w:widowControl/>
-        <w:spacing w:after="40"/>
-      </w:pPr>
-      <w:r>
-        <w:t>data: URIs in script-src -- Allows scripts to be loaded from data: URIs, which can be used to encode and execute malicious JavaScript without an external server.</w:t>
+        <w:t>'unsafe-inline': Allows inline scripts and event handlers. This effectively defeats XSS protection, because an attacker who can inject HTML can also inject inline script tags.</w:t>
+      </w:r>
+    </w:p>
+    <w:p>
+      <w:pPr>
+        <w:pStyle w:val="ListParagraph"/>
+        <w:widowControl/>
+        <w:spacing w:after="40"/>
+      </w:pPr>
+      <w:r>
+        <w:t>'unsafe-eval': Allows the use of eval(), new Function(), and similar dynamic code execution methods. Attackers frequently exploit these functions to execute injected payloads.</w:t>
+      </w:r>
+    </w:p>
+    <w:p>
+      <w:pPr>
+        <w:pStyle w:val="ListParagraph"/>
+        <w:widowControl/>
+        <w:spacing w:after="40"/>
+      </w:pPr>
+      <w:r>
+        <w:t>Wildcard (*) in script-src: Permits scripts from any domain. An attacker can host a malicious script on any server and it will be allowed by the policy.</w:t>
+      </w:r>
+    </w:p>
+    <w:p>
+      <w:pPr>
+        <w:pStyle w:val="ListParagraph"/>
+        <w:widowControl/>
+        <w:spacing w:after="40"/>
+      </w:pPr>
+      <w:r>
+        <w:t>data: URIs in script-src, Allows scripts to be loaded from data: URIs, which can be used to encode and execute malicious JavaScript without an external server.</w:t>
       </w:r>
     </w:p>
     <w:p>
@@ -2986,47 +2986,47 @@
         <w:spacing w:after="40"/>
       </w:pPr>
       <w:r>
-        <w:t>default-src -- The fallback directive. If this is missing and a specific directive is also missing, the browser applies no restriction for that resource type.</w:t>
-      </w:r>
-    </w:p>
-    <w:p>
-      <w:pPr>
-        <w:pStyle w:val="ListParagraph"/>
-        <w:widowControl/>
-        <w:spacing w:after="40"/>
-      </w:pPr>
-      <w:r>
-        <w:t>script-src -- Controls where JavaScript can be loaded from. This is the most important directive for preventing XSS.</w:t>
-      </w:r>
-    </w:p>
-    <w:p>
-      <w:pPr>
-        <w:pStyle w:val="ListParagraph"/>
-        <w:widowControl/>
-        <w:spacing w:after="40"/>
-      </w:pPr>
-      <w:r>
-        <w:t>frame-ancestors -- Controls which sites can embed this page in a frame. This is the modern replacement for X-Frame-Options.</w:t>
-      </w:r>
-    </w:p>
-    <w:p>
-      <w:pPr>
-        <w:pStyle w:val="ListParagraph"/>
-        <w:widowControl/>
-        <w:spacing w:after="40"/>
-      </w:pPr>
-      <w:r>
-        <w:t>object-src -- Controls where plugins (Flash, Java applets) can be loaded from. Setting this to 'none' blocks legacy plugin-based attacks.</w:t>
-      </w:r>
-    </w:p>
-    <w:p>
-      <w:pPr>
-        <w:pStyle w:val="ListParagraph"/>
-        <w:widowControl/>
-        <w:spacing w:after="40"/>
-      </w:pPr>
-      <w:r>
-        <w:t>base-uri -- Controls the URL that can be used in the &lt;base&gt; element. Without this, an attacker can change the base URL to hijack relative resource paths.</w:t>
+        <w:t>default-src: The fallback directive. If this is missing and a specific directive is also missing, the browser applies no restriction for that resource type.</w:t>
+      </w:r>
+    </w:p>
+    <w:p>
+      <w:pPr>
+        <w:pStyle w:val="ListParagraph"/>
+        <w:widowControl/>
+        <w:spacing w:after="40"/>
+      </w:pPr>
+      <w:r>
+        <w:t>script-src: Controls where JavaScript can be loaded from. This is the most important directive for preventing XSS.</w:t>
+      </w:r>
+    </w:p>
+    <w:p>
+      <w:pPr>
+        <w:pStyle w:val="ListParagraph"/>
+        <w:widowControl/>
+        <w:spacing w:after="40"/>
+      </w:pPr>
+      <w:r>
+        <w:t>frame-ancestors: Controls which sites can embed this page in a frame. This is the modern replacement for X-Frame-Options.</w:t>
+      </w:r>
+    </w:p>
+    <w:p>
+      <w:pPr>
+        <w:pStyle w:val="ListParagraph"/>
+        <w:widowControl/>
+        <w:spacing w:after="40"/>
+      </w:pPr>
+      <w:r>
+        <w:t>object-src: Controls where plugins (Flash, Java applets) can be loaded from. Setting this to 'none' blocks legacy plugin-based attacks.</w:t>
+      </w:r>
+    </w:p>
+    <w:p>
+      <w:pPr>
+        <w:pStyle w:val="ListParagraph"/>
+        <w:widowControl/>
+        <w:spacing w:after="40"/>
+      </w:pPr>
+      <w:r>
+        <w:t>base-uri: Controls the URL that can be used in the &lt;base&gt; element. Without this, an attacker can change the base URL to hijack relative resource paths.</w:t>
       </w:r>
     </w:p>
     <w:p>
@@ -3090,7 +3090,7 @@
         <w:spacing w:after="80"/>
       </w:pPr>
       <w:r>
-        <w:t>The CSP quality score feeds into the overall HTTP Security Headers percentage. Specifically, the quality score (0--100) is divided by 10 to produce a 0--10 point bonus that is added to the earned header weights. This means a perfect CSP contributes up to 20 points in total (10 for presence, 10 for quality) out of the overall 100-point budget.</w:t>
+        <w:t>The CSP quality score feeds into the overall HTTP Security Headers percentage. Specifically, the quality score (0 to 100) is divided by 10 to produce a 0 to 10 point bonus that is added to the earned header weights. This means a perfect CSP contributes up to 20 points in total (10 for presence, 10 for quality) out of the overall 100-point budget.</w:t>
       </w:r>
     </w:p>
     <w:p>
@@ -3168,7 +3168,7 @@
         <w:t xml:space="preserve">NOTE: </w:t>
       </w:r>
       <w:r>
-        <w:t>Blocked or unreachable responses: if the final response to the scanner is not a success (2xx) status — for example, a WAF or CDN returns a 403 or 503 challenge/block page to the scanner's user agent — the headers on that block page do not represent the site's real configuration. In that case the check reports 'could not assess (blocked/unreachable)' and emits no header score, and scoring and remediation fall back to neutral, rather than recording every security header as missing. The renderers show this as an amber, non-penalising card.</w:t>
+        <w:t>Blocked or unreachable responses: if the final response to the scanner is not a success (2xx) status, for example, a WAF or CDN returns a 403 or 503 challenge/block page to the scanner's user agent, the headers on that block page do not represent the site's real configuration. In that case the check reports 'could not assess (blocked/unreachable)' and emits no header score, and scoring and remediation fall back to neutral, rather than recording every security header as missing. The renderers show this as an amber, non-penalising card.</w:t>
       </w:r>
     </w:p>
     <w:p>
@@ -3197,7 +3197,7 @@
         <w:t xml:space="preserve">What it checks:  </w:t>
       </w:r>
       <w:r>
-        <w:t>The scanner sends an HTTPS request to the domain and examines the response for signatures that indicate a Web Application Firewall (WAF) or DDoS protection service is in place. Detection is based strictly on transport-layer evidence: HTTP response headers unique to the WAF vendor, cookies set by the WAF, and the Server header. Vendor strings appearing in the page body are deliberately NOT used as a signal — a page that merely mentions a vendor's name (for example in marketing copy) must not be reported as protected by that vendor's WAF.</w:t>
+        <w:t>The scanner sends an HTTPS request to the domain and examines the response for signatures that indicate a Web Application Firewall (WAF) or DDoS protection service is in place. Detection is based strictly on transport-layer evidence: HTTP response headers unique to the WAF vendor, cookies set by the WAF, and the Server header. Vendor strings appearing in the page body are deliberately NOT used as a signal, a page that merely mentions a vendor's name (for example in marketing copy) must not be reported as protected by that vendor's WAF.</w:t>
       </w:r>
     </w:p>
     <w:p>
@@ -3216,67 +3216,67 @@
         <w:spacing w:after="40"/>
       </w:pPr>
       <w:r>
-        <w:t>Cloudflare -- Detected via cf-ray header, cf-cache-status header, and related cookies.</w:t>
-      </w:r>
-    </w:p>
-    <w:p>
-      <w:pPr>
-        <w:pStyle w:val="ListParagraph"/>
-        <w:widowControl/>
-        <w:spacing w:after="40"/>
-      </w:pPr>
-      <w:r>
-        <w:t>AWS WAF / CloudFront -- Detected via x-amz-cf-id header, x-amzn-requestid header, and AWS load-balancer cookies.</w:t>
-      </w:r>
-    </w:p>
-    <w:p>
-      <w:pPr>
-        <w:pStyle w:val="ListParagraph"/>
-        <w:widowControl/>
-        <w:spacing w:after="40"/>
-      </w:pPr>
-      <w:r>
-        <w:t>Imperva / Incapsula -- Detected via x-iinfo header, x-cdn header, and incapsula session cookies.</w:t>
-      </w:r>
-    </w:p>
-    <w:p>
-      <w:pPr>
-        <w:pStyle w:val="ListParagraph"/>
-        <w:widowControl/>
-        <w:spacing w:after="40"/>
-      </w:pPr>
-      <w:r>
-        <w:t>Akamai -- Detected via x-akamai-transformed header and Akamai bot-management cookies.</w:t>
-      </w:r>
-    </w:p>
-    <w:p>
-      <w:pPr>
-        <w:pStyle w:val="ListParagraph"/>
-        <w:widowControl/>
-        <w:spacing w:after="40"/>
-      </w:pPr>
-      <w:r>
-        <w:t>Sucuri -- Detected via x-sucuri-id and x-sucuri-cache headers.</w:t>
-      </w:r>
-    </w:p>
-    <w:p>
-      <w:pPr>
-        <w:pStyle w:val="ListParagraph"/>
-        <w:widowControl/>
-        <w:spacing w:after="40"/>
-      </w:pPr>
-      <w:r>
-        <w:t>F5 BIG-IP ASM -- Detected only via genuine F5 markers: the x-wa-info header, BIG-IP / TS01 / F5 session cookies, or a Server: BIG-IP header. The ubiquitous x-frame-options header is NOT treated as an F5 signal, as almost any hardened site sets it.</w:t>
-      </w:r>
-    </w:p>
-    <w:p>
-      <w:pPr>
-        <w:pStyle w:val="ListParagraph"/>
-        <w:widowControl/>
-        <w:spacing w:after="40"/>
-      </w:pPr>
-      <w:r>
-        <w:t>Barracuda -- Detected via barracuda session cookies.</w:t>
+        <w:t>Cloudflare: Detected via cf-ray header, cf-cache-status header, and related cookies.</w:t>
+      </w:r>
+    </w:p>
+    <w:p>
+      <w:pPr>
+        <w:pStyle w:val="ListParagraph"/>
+        <w:widowControl/>
+        <w:spacing w:after="40"/>
+      </w:pPr>
+      <w:r>
+        <w:t>AWS WAF / CloudFront: Detected via x-amz-cf-id header, x-amzn-requestid header, and AWS load-balancer cookies.</w:t>
+      </w:r>
+    </w:p>
+    <w:p>
+      <w:pPr>
+        <w:pStyle w:val="ListParagraph"/>
+        <w:widowControl/>
+        <w:spacing w:after="40"/>
+      </w:pPr>
+      <w:r>
+        <w:t>Imperva / Incapsula: Detected via x-iinfo header, x-cdn header, and incapsula session cookies.</w:t>
+      </w:r>
+    </w:p>
+    <w:p>
+      <w:pPr>
+        <w:pStyle w:val="ListParagraph"/>
+        <w:widowControl/>
+        <w:spacing w:after="40"/>
+      </w:pPr>
+      <w:r>
+        <w:t>Akamai: Detected via x-akamai-transformed header and Akamai bot-management cookies.</w:t>
+      </w:r>
+    </w:p>
+    <w:p>
+      <w:pPr>
+        <w:pStyle w:val="ListParagraph"/>
+        <w:widowControl/>
+        <w:spacing w:after="40"/>
+      </w:pPr>
+      <w:r>
+        <w:t>Sucuri: Detected via x-sucuri-id and x-sucuri-cache headers.</w:t>
+      </w:r>
+    </w:p>
+    <w:p>
+      <w:pPr>
+        <w:pStyle w:val="ListParagraph"/>
+        <w:widowControl/>
+        <w:spacing w:after="40"/>
+      </w:pPr>
+      <w:r>
+        <w:t>F5 BIG-IP ASM, Detected only via genuine F5 markers: the x-wa-info header, BIG-IP / TS01 / F5 session cookies, or a Server: BIG-IP header. The ubiquitous x-frame-options header is NOT treated as an F5 signal, as almost any hardened site sets it.</w:t>
+      </w:r>
+    </w:p>
+    <w:p>
+      <w:pPr>
+        <w:pStyle w:val="ListParagraph"/>
+        <w:widowControl/>
+        <w:spacing w:after="40"/>
+      </w:pPr>
+      <w:r>
+        <w:t>Barracuda: Detected via barracuda session cookies.</w:t>
       </w:r>
     </w:p>
     <w:p>
@@ -3707,7 +3707,7 @@
         <w:rPr>
           <w:b/>
         </w:rPr>
-        <w:t xml:space="preserve">.env (Environment Variables) — Critical: </w:t>
+        <w:t xml:space="preserve">.env (Environment Variables), Critical: </w:t>
       </w:r>
       <w:r>
         <w:t>This file typically stores database passwords, API keys, mail server credentials, and third-party service tokens. If exposed, an attacker gains immediate access to every connected system. This is one of the most damaging single-file exposures possible.</w:t>
@@ -3722,7 +3722,7 @@
         <w:rPr>
           <w:b/>
         </w:rPr>
-        <w:t xml:space="preserve">.git/HEAD and .git/config (Source Code Metadata) — Critical: </w:t>
+        <w:t xml:space="preserve">.git/HEAD and .git/config (Source Code Metadata), Critical: </w:t>
       </w:r>
       <w:r>
         <w:t>These files are part of the Git version-control system. When the .git directory is accessible, an attacker can reconstruct your entire source code repository, including historical commits that may contain passwords, internal comments, and proprietary business logic.</w:t>
@@ -3737,7 +3737,7 @@
         <w:rPr>
           <w:b/>
         </w:rPr>
-        <w:t xml:space="preserve">wp-config.php.bak (WordPress Configuration Backup) — Critical: </w:t>
+        <w:t xml:space="preserve">wp-config.php.bak (WordPress Configuration Backup), Critical: </w:t>
       </w:r>
       <w:r>
         <w:t>WordPress stores its database host, username, password, and secret keys in wp-config.php. Backup copies (with .bak, .old, or ~ suffixes) are served as plain text by most web servers, revealing every credential needed to take over the site and its database.</w:t>
@@ -3752,7 +3752,7 @@
         <w:rPr>
           <w:b/>
         </w:rPr>
-        <w:t xml:space="preserve">.htpasswd (Apache Password File) — Critical: </w:t>
+        <w:t xml:space="preserve">.htpasswd (Apache Password File), Critical: </w:t>
       </w:r>
       <w:r>
         <w:t>Contains hashed usernames and passwords used by the Apache web server for basic authentication. The hashes can be cracked offline in minutes with modern tools, giving an attacker valid login credentials.</w:t>
@@ -3767,7 +3767,7 @@
         <w:rPr>
           <w:b/>
         </w:rPr>
-        <w:t xml:space="preserve">backup.sql / dump.sql / db.sql (Database Dumps) — Critical: </w:t>
+        <w:t xml:space="preserve">backup.sql / dump.sql / db.sql (Database Dumps), Critical: </w:t>
       </w:r>
       <w:r>
         <w:t>SQL dump files contain a complete copy of your database, including customer records, email addresses, hashed (or sometimes plaintext) passwords, financial data, and any other information stored in your application. A single exposed dump file can constitute a full data breach.</w:t>
@@ -3782,7 +3782,7 @@
         <w:rPr>
           <w:b/>
         </w:rPr>
-        <w:t xml:space="preserve">phpinfo.php (PHP Information Page) — Medium: </w:t>
+        <w:t xml:space="preserve">phpinfo.php (PHP Information Page), Medium: </w:t>
       </w:r>
       <w:r>
         <w:t>Displays the full PHP configuration of the server, including file paths, loaded modules, environment variables, and sometimes database connection strings. Attackers use this information to tailor exploits to your exact server setup.</w:t>
@@ -3797,7 +3797,7 @@
         <w:rPr>
           <w:b/>
         </w:rPr>
-        <w:t xml:space="preserve">server-status (Apache Status Page) — Medium: </w:t>
+        <w:t xml:space="preserve">server-status (Apache Status Page), Medium: </w:t>
       </w:r>
       <w:r>
         <w:t>Exposes real-time information about every active connection to the web server, including client IP addresses, requested URLs, and virtual host names. This is useful reconnaissance for planning further attacks.</w:t>
@@ -3812,7 +3812,7 @@
         <w:rPr>
           <w:b/>
         </w:rPr>
-        <w:t xml:space="preserve">.DS_Store (macOS Directory Metadata) — Medium: </w:t>
+        <w:t xml:space="preserve">.DS_Store (macOS Directory Metadata), Medium: </w:t>
       </w:r>
       <w:r>
         <w:t>Created automatically by macOS Finder, this file lists every file and folder in the directory. Attackers parse it to discover hidden files, admin panels, or backup directories that are not linked from the website.</w:t>
@@ -3827,7 +3827,7 @@
         <w:rPr>
           <w:b/>
         </w:rPr>
-        <w:t xml:space="preserve">web.config (IIS Configuration) — Medium: </w:t>
+        <w:t xml:space="preserve">web.config (IIS Configuration), Medium: </w:t>
       </w:r>
       <w:r>
         <w:t>The configuration file for Microsoft IIS web servers. May contain connection strings, authentication settings, URL rewrite rules, and custom error pages that reveal internal architecture.</w:t>
@@ -3842,7 +3842,7 @@
         <w:rPr>
           <w:b/>
         </w:rPr>
-        <w:t xml:space="preserve">Debug Endpoints — Medium: </w:t>
+        <w:t xml:space="preserve">Debug Endpoints, Medium: </w:t>
       </w:r>
       <w:r>
         <w:t>Development and debugging endpoints (such as /debug, /trace, or framework-specific diagnostic pages) expose internal application state, stack traces, and configuration details that are invaluable to an attacker.</w:t>
@@ -3857,7 +3857,7 @@
         <w:rPr>
           <w:b/>
         </w:rPr>
-        <w:t xml:space="preserve">Spring Boot Actuator Endpoints — Critical: </w:t>
+        <w:t xml:space="preserve">Spring Boot Actuator Endpoints, Critical: </w:t>
       </w:r>
       <w:r>
         <w:t>Java Spring Boot applications expose management endpoints (such as /actuator/env, /actuator/configprops, and /actuator/heapdump) that can reveal environment variables, configuration properties, and even a full memory dump of the running application. Unsecured actuator endpoints are a well-known path to remote code execution.</w:t>
@@ -4079,7 +4079,7 @@
         <w:spacing w:after="40"/>
       </w:pPr>
       <w:r>
-        <w:t>The scanner checks up to 40 common DKIM selector names to locate your published key. A selector is only counted as a real DKIM record when its TXT value actually contains a DKIM key — that is, a v=DKIM1 tag or a p= public-key tag. A selector name that merely resolves (for example, because the domain uses a DNS wildcard) but carries no key is ignored, so a wildcard cannot inflate the DKIM result with non-existent selectors.</w:t>
+        <w:t>The scanner checks up to 40 common DKIM selector names to locate your published key. A selector is only counted as a real DKIM record when its TXT value actually contains a DKIM key, that is, a v=DKIM1 tag or a p= public-key tag. A selector name that merely resolves (for example, because the domain uses a DNS wildcard) but carries no key is ignored, so a wildcard cannot inflate the DKIM result with non-existent selectors.</w:t>
       </w:r>
     </w:p>
     <w:p>
@@ -4124,27 +4124,27 @@
         <w:spacing w:after="40"/>
       </w:pPr>
       <w:r>
-        <w:t>none — Monitor only. Failing messages are still delivered. This is a starting point for collecting data but provides no protection.</w:t>
-      </w:r>
-    </w:p>
-    <w:p>
-      <w:pPr>
-        <w:pStyle w:val="ListParagraph"/>
-        <w:widowControl/>
-        <w:spacing w:after="40"/>
-      </w:pPr>
-      <w:r>
-        <w:t>quarantine — Failing messages are sent to the recipient’s spam or junk folder. Provides moderate protection.</w:t>
-      </w:r>
-    </w:p>
-    <w:p>
-      <w:pPr>
-        <w:pStyle w:val="ListParagraph"/>
-        <w:widowControl/>
-        <w:spacing w:after="40"/>
-      </w:pPr>
-      <w:r>
-        <w:t>reject — Failing messages are blocked entirely. This is the strongest setting and the recommended target for all organisations.</w:t>
+        <w:t>none: Monitor only. Failing messages are still delivered. This is a starting point for collecting data but provides no protection.</w:t>
+      </w:r>
+    </w:p>
+    <w:p>
+      <w:pPr>
+        <w:pStyle w:val="ListParagraph"/>
+        <w:widowControl/>
+        <w:spacing w:after="40"/>
+      </w:pPr>
+      <w:r>
+        <w:t>quarantine: Failing messages are sent to the recipient’s spam or junk folder. Provides moderate protection.</w:t>
+      </w:r>
+    </w:p>
+    <w:p>
+      <w:pPr>
+        <w:pStyle w:val="ListParagraph"/>
+        <w:widowControl/>
+        <w:spacing w:after="40"/>
+      </w:pPr>
+      <w:r>
+        <w:t>reject: Failing messages are blocked entirely. This is the strongest setting and the recommended target for all organisations.</w:t>
       </w:r>
     </w:p>
     <w:p>
@@ -4431,7 +4431,7 @@
         <w:rPr>
           <w:b/>
         </w:rPr>
-        <w:t xml:space="preserve">TLS-RPT (SMTP TLS Reporting — RFC 8460): </w:t>
+        <w:t xml:space="preserve">TLS-RPT (SMTP TLS Reporting, RFC 8460): </w:t>
       </w:r>
       <w:r>
         <w:t>TLS-RPT is a DNS TXT record that tells sending mail servers where to deliver reports about TLS connection failures when delivering email to your domain. If a sending server cannot establish an encrypted connection (for example, because of a certificate mismatch or an MTA-STS policy failure), TLS-RPT ensures you receive a structured report about the failure. This is essential for monitoring and troubleshooting your MTA-STS and DANE deployments.</w:t>
@@ -4629,7 +4629,7 @@
         <w:t xml:space="preserve">How It Works: </w:t>
       </w:r>
       <w:r>
-        <w:t>The scanner performs a TCP port scan against your domain’s resolved IP addresses, checking for commonly targeted services. Each discovered open port is classified into one of three risk tiers. When a domain resolves to (or has) more than one IP address, each exposed port is attributed in the report to the specific IP it was actually found on — so, for example, an open FTP port on a real origin server is shown against that origin's address rather than against the CDN edge address the domain name points to.</w:t>
+        <w:t>The scanner performs a TCP port scan against your domain’s resolved IP addresses, checking for commonly targeted services. Each discovered open port is classified into one of three risk tiers. When a domain resolves to (or has) more than one IP address, each exposed port is attributed in the report to the specific IP it was actually found on, so, for example, an open FTP port on a real origin server is shown against that origin's address rather than against the CDN edge address the domain name points to.</w:t>
       </w:r>
     </w:p>
     <w:p>
@@ -4759,7 +4759,7 @@
         <w:rPr>
           <w:b/>
         </w:rPr>
-        <w:t xml:space="preserve">Zone Transfer (AXFR) — Phase 3: </w:t>
+        <w:t xml:space="preserve">Zone Transfer (AXFR), Phase 3: </w:t>
       </w:r>
       <w:r>
         <w:t>The scanner tests each of your domain’s authoritative name servers for DNS zone transfer vulnerability. A zone transfer (AXFR) is a mechanism designed to replicate DNS records between authorised name servers. If a name server allows zone transfers to any requester, an attacker can download the complete DNS zone file, revealing every subdomain, mail server, internal hostname, and service record for the domain.</w:t>
@@ -4918,67 +4918,67 @@
         <w:spacing w:after="40"/>
       </w:pPr>
       <w:r>
-        <w:t>MongoDB (port 27017) — NoSQL databases are frequently deployed without authentication. Tens of thousands of exposed MongoDB instances have been ransomed after attackers deleted the data and demanded payment for its return.</w:t>
-      </w:r>
-    </w:p>
-    <w:p>
-      <w:pPr>
-        <w:pStyle w:val="ListParagraph"/>
-        <w:widowControl/>
-        <w:spacing w:after="40"/>
-      </w:pPr>
-      <w:r>
-        <w:t>Redis (port 6379) — An in-memory data store often used for caching and session management. Default Redis installations have no authentication, and an exposed instance can be exploited for remote code execution via crafted commands.</w:t>
-      </w:r>
-    </w:p>
-    <w:p>
-      <w:pPr>
-        <w:pStyle w:val="ListParagraph"/>
-        <w:widowControl/>
-        <w:spacing w:after="40"/>
-      </w:pPr>
-      <w:r>
-        <w:t>Elasticsearch (port 9200) — A search and analytics engine that often contains indexed copies of sensitive business data. Exposed Elasticsearch clusters are a leading cause of large-scale data leaks.</w:t>
-      </w:r>
-    </w:p>
-    <w:p>
-      <w:pPr>
-        <w:pStyle w:val="ListParagraph"/>
-        <w:widowControl/>
-        <w:spacing w:after="40"/>
-      </w:pPr>
-      <w:r>
-        <w:t>PostgreSQL (port 5432) — A relational database that, if internet-facing, is subject to brute-force password attacks and exploitation of known vulnerabilities.</w:t>
-      </w:r>
-    </w:p>
-    <w:p>
-      <w:pPr>
-        <w:pStyle w:val="ListParagraph"/>
-        <w:widowControl/>
-        <w:spacing w:after="40"/>
-      </w:pPr>
-      <w:r>
-        <w:t>Microsoft SQL Server (port 1433) — MSSQL exposed to the internet is a common target for credential stuffing and exploitation. The xp_cmdshell stored procedure can be abused for direct operating system command execution.</w:t>
-      </w:r>
-    </w:p>
-    <w:p>
-      <w:pPr>
-        <w:pStyle w:val="ListParagraph"/>
-        <w:widowControl/>
-        <w:spacing w:after="40"/>
-      </w:pPr>
-      <w:r>
-        <w:t>CouchDB (port 5984) — A document-oriented database that exposes an HTTP API. Default configurations may allow unauthenticated read and write access to all databases.</w:t>
-      </w:r>
-    </w:p>
-    <w:p>
-      <w:pPr>
-        <w:pStyle w:val="ListParagraph"/>
-        <w:widowControl/>
-        <w:spacing w:after="40"/>
-      </w:pPr>
-      <w:r>
-        <w:t>MySQL (port 3306) — One of the most widely used databases. Exposed MySQL servers are continuously targeted by automated brute-force tools attempting common usernames and passwords.</w:t>
+        <w:t>MongoDB (port 27017): NoSQL databases are frequently deployed without authentication. Tens of thousands of exposed MongoDB instances have been ransomed after attackers deleted the data and demanded payment for its return.</w:t>
+      </w:r>
+    </w:p>
+    <w:p>
+      <w:pPr>
+        <w:pStyle w:val="ListParagraph"/>
+        <w:widowControl/>
+        <w:spacing w:after="40"/>
+      </w:pPr>
+      <w:r>
+        <w:t>Redis (port 6379): An in-memory data store often used for caching and session management. Default Redis installations have no authentication, and an exposed instance can be exploited for remote code execution via crafted commands.</w:t>
+      </w:r>
+    </w:p>
+    <w:p>
+      <w:pPr>
+        <w:pStyle w:val="ListParagraph"/>
+        <w:widowControl/>
+        <w:spacing w:after="40"/>
+      </w:pPr>
+      <w:r>
+        <w:t>Elasticsearch (port 9200): A search and analytics engine that often contains indexed copies of sensitive business data. Exposed Elasticsearch clusters are a leading cause of large-scale data leaks.</w:t>
+      </w:r>
+    </w:p>
+    <w:p>
+      <w:pPr>
+        <w:pStyle w:val="ListParagraph"/>
+        <w:widowControl/>
+        <w:spacing w:after="40"/>
+      </w:pPr>
+      <w:r>
+        <w:t>PostgreSQL (port 5432): A relational database that, if internet-facing, is subject to brute-force password attacks and exploitation of known vulnerabilities.</w:t>
+      </w:r>
+    </w:p>
+    <w:p>
+      <w:pPr>
+        <w:pStyle w:val="ListParagraph"/>
+        <w:widowControl/>
+        <w:spacing w:after="40"/>
+      </w:pPr>
+      <w:r>
+        <w:t>Microsoft SQL Server (port 1433): MSSQL exposed to the internet is a common target for credential stuffing and exploitation. The xp_cmdshell stored procedure can be abused for direct operating system command execution.</w:t>
+      </w:r>
+    </w:p>
+    <w:p>
+      <w:pPr>
+        <w:pStyle w:val="ListParagraph"/>
+        <w:widowControl/>
+        <w:spacing w:after="40"/>
+      </w:pPr>
+      <w:r>
+        <w:t>CouchDB (port 5984): A document-oriented database that exposes an HTTP API. Default configurations may allow unauthenticated read and write access to all databases.</w:t>
+      </w:r>
+    </w:p>
+    <w:p>
+      <w:pPr>
+        <w:pStyle w:val="ListParagraph"/>
+        <w:widowControl/>
+        <w:spacing w:after="40"/>
+      </w:pPr>
+      <w:r>
+        <w:t>MySQL (port 3306): One of the most widely used databases. Exposed MySQL servers are continuously targeted by automated brute-force tools attempting common usernames and passwords.</w:t>
       </w:r>
     </w:p>
     <w:p>
@@ -5109,37 +5109,37 @@
         <w:spacing w:after="40"/>
       </w:pPr>
       <w:r>
-        <w:t>DDoS Mitigation — The CDN absorbs volumetric attacks that would overwhelm your origin server, maintaining availability during an attack.</w:t>
-      </w:r>
-    </w:p>
-    <w:p>
-      <w:pPr>
-        <w:pStyle w:val="ListParagraph"/>
-        <w:widowControl/>
-        <w:spacing w:after="40"/>
-      </w:pPr>
-      <w:r>
-        <w:t>Origin Masking — The CDN hides your actual server IP address, making it significantly harder for attackers to target your infrastructure directly.</w:t>
-      </w:r>
-    </w:p>
-    <w:p>
-      <w:pPr>
-        <w:pStyle w:val="ListParagraph"/>
-        <w:widowControl/>
-        <w:spacing w:after="40"/>
-      </w:pPr>
-      <w:r>
-        <w:t>Web Application Firewall (WAF) — Many CDN providers include a WAF that filters common web attacks (SQL injection, cross-site scripting) before they reach your application.</w:t>
-      </w:r>
-    </w:p>
-    <w:p>
-      <w:pPr>
-        <w:pStyle w:val="ListParagraph"/>
-        <w:widowControl/>
-        <w:spacing w:after="40"/>
-      </w:pPr>
-      <w:r>
-        <w:t>Performance — Content is served from edge locations geographically close to the user, reducing latency and improving page load times.</w:t>
+        <w:t>DDoS Mitigation: The CDN absorbs volumetric attacks that would overwhelm your origin server, maintaining availability during an attack.</w:t>
+      </w:r>
+    </w:p>
+    <w:p>
+      <w:pPr>
+        <w:pStyle w:val="ListParagraph"/>
+        <w:widowControl/>
+        <w:spacing w:after="40"/>
+      </w:pPr>
+      <w:r>
+        <w:t>Origin Masking: The CDN hides your actual server IP address, making it significantly harder for attackers to target your infrastructure directly.</w:t>
+      </w:r>
+    </w:p>
+    <w:p>
+      <w:pPr>
+        <w:pStyle w:val="ListParagraph"/>
+        <w:widowControl/>
+        <w:spacing w:after="40"/>
+      </w:pPr>
+      <w:r>
+        <w:t>Web Application Firewall (WAF): Many CDN providers include a WAF that filters common web attacks (SQL injection, cross-site scripting) before they reach your application.</w:t>
+      </w:r>
+    </w:p>
+    <w:p>
+      <w:pPr>
+        <w:pStyle w:val="ListParagraph"/>
+        <w:widowControl/>
+        <w:spacing w:after="40"/>
+      </w:pPr>
+      <w:r>
+        <w:t>Performance: Content is served from edge locations geographically close to the user, reducing latency and improving page load times.</w:t>
       </w:r>
     </w:p>
     <w:p>
@@ -5238,7 +5238,7 @@
         <w:t xml:space="preserve">RDP Exposure (Port 3389): </w:t>
       </w:r>
       <w:r>
-        <w:t>The Remote Desktop Protocol is the single most exploited initial access vector for ransomware. The scanner checks whether port 3389 is open on every discovered IP address — not only the IP your domain name resolves to, but also subdomain IPs and any verified origin servers found behind a CDN (see Origin IP Discovery below). If RDP is open on any of these, the headline ‘RDP Exposed’ finding is raised and the specific IP(s) are listed. An exposed RDP service is rated as a critical finding because automated attack tools continuously scan the entire internet for open RDP, and compromised RDP credentials are bought and sold on criminal marketplaces.</w:t>
+        <w:t>The Remote Desktop Protocol is the single most exploited initial access vector for ransomware. The scanner checks whether port 3389 is open on every discovered IP address, not only the IP your domain name resolves to, but also subdomain IPs and any verified origin servers found behind a CDN (see Origin IP Discovery below). If RDP is open on any of these, the headline ‘RDP Exposed’ finding is raised and the specific IP(s) are listed. An exposed RDP service is rated as a critical finding because automated attack tools continuously scan the entire internet for open RDP, and compromised RDP credentials are bought and sold on criminal marketplaces.</w:t>
       </w:r>
     </w:p>
     <w:p>
@@ -5299,7 +5299,7 @@
         <w:t xml:space="preserve">VPN Gateway Detection: </w:t>
       </w:r>
       <w:r>
-        <w:t>The scanner identifies known VPN and remote access gateways by checking for characteristic ports, HTTP response headers, and TLS certificate attributes associated with common VPN solutions. Detected platforms include Citrix Gateway (NetScaler), Fortinet FortiGate, Pulse Secure (now Ivanti Connect Secure), Palo Alto GlobalProtect, Cisco AnyConnect, SonicWall, and WireGuard. To avoid false positives, a vendor is only matched when a genuine vendor marker is returned over an HTTP 200 response that also passes a body-sanity check — a loose substring appearing in any response (such as a CDN challenge page or single-page-app shell) is not sufficient. This gate is applied uniformly to all of the supported gateways, including Microsoft RDS Web, which additionally requires genuine RDWeb tokens.</w:t>
+        <w:t>The scanner identifies known VPN and remote access gateways by checking for characteristic ports, HTTP response headers, and TLS certificate attributes associated with common VPN solutions. Detected platforms include Citrix Gateway (NetScaler), Fortinet FortiGate, Pulse Secure (now Ivanti Connect Secure), Palo Alto GlobalProtect, Cisco AnyConnect, SonicWall, and WireGuard. To avoid false positives, a vendor is only matched when a genuine vendor marker is returned over an HTTP 200 response that also passes a body-sanity check, a loose substring appearing in any response (such as a CDN challenge page or single-page-app shell) is not sufficient. This gate is applied uniformly to all of the supported gateways, including Microsoft RDS Web, which additionally requires genuine RDWeb tokens.</w:t>
       </w:r>
     </w:p>
     <w:p>
@@ -5425,7 +5425,7 @@
         <w:spacing w:after="80"/>
       </w:pPr>
       <w:r>
-        <w:t>When a domain sits behind a CDN or WAF such as Cloudflare, it resolves only to the provider’s edge IP addresses. The organisation’s real server — the ‘origin’ — is hidden. This is good for DDoS protection, but it also means a scan of the domain name alone never sees services running directly on the origin (RDP, databases, admin panels), because those ports are closed on the CDN edge. Attackers routinely locate the origin and connect to it directly, bypassing the CDN entirely.</w:t>
+        <w:t>When a domain sits behind a CDN or WAF such as Cloudflare, it resolves only to the provider’s edge IP addresses. The organisation’s real server, the ‘origin’, is hidden. This is good for DDoS protection, but it also means a scan of the domain name alone never sees services running directly on the origin (RDP, databases, admin panels), because those ports are closed on the CDN edge. Attackers routinely locate the origin and connect to it directly, bypassing the CDN entirely.</w:t>
       </w:r>
     </w:p>
     <w:p>
@@ -5440,7 +5440,7 @@
         <w:t xml:space="preserve">How the scanner finds the origin: </w:t>
       </w:r>
       <w:r>
-        <w:t>Candidate origin IPs are gathered from historical DNS records (via SecurityTrails — the pre-CDN origin is usually still in the history). Each candidate is then automatically verified: the scanner opens a TLS connection to the candidate IP presenting the target domain name and checks that the certificate it serves actually covers that domain. Only IPs that pass this certificate match are treated as confirmed origins and added to the scan — so an exposed service on the real server surfaces in the report even though the domain is CDN-fronted.</w:t>
+        <w:t>Candidate origin IPs are gathered from historical DNS records (via SecurityTrails, the pre-CDN origin is usually still in the history). Each candidate is then automatically verified: the scanner opens a TLS connection to the candidate IP presenting the target domain name and checks that the certificate it serves actually covers that domain. Only IPs that pass this certificate match are treated as confirmed origins and added to the scan, so an exposed service on the real server surfaces in the report even though the domain is CDN-fronted.</w:t>
       </w:r>
     </w:p>
     <w:p>
@@ -5455,7 +5455,7 @@
         <w:t xml:space="preserve">Verified vs candidate: </w:t>
       </w:r>
       <w:r>
-        <w:t>Confirmed origins are labelled ‘verified’ and are scanned in full. IPs that appear in historical DNS but do not currently serve the domain’s certificate are listed as ‘candidate (unverified)’ and are deliberately NOT scanned — they may since have been reassigned to an unrelated third party, and scanning them would be both inaccurate and inappropriate. Both lists appear in the report’s Origin IP Discovery card for transparency.</w:t>
+        <w:t>Confirmed origins are labelled ‘verified’ and are scanned in full. IPs that appear in historical DNS but do not currently serve the domain’s certificate are listed as ‘candidate (unverified)’ and are deliberately NOT scanned, they may since have been reassigned to an unrelated third party, and scanning them would be both inaccurate and inappropriate. Both lists appear in the report’s Origin IP Discovery card for transparency.</w:t>
       </w:r>
     </w:p>
     <w:p>
@@ -5471,7 +5471,7 @@
         <w:t xml:space="preserve">NOTE: </w:t>
       </w:r>
       <w:r>
-        <w:t>This check is fully automated and requires no broker or analyst confirmation. The certificate match is the proof of ownership, so the scanner can act on a discovered origin on its own — while still never actively scanning an IP it cannot tie back to the target domain.</w:t>
+        <w:t>This check is fully automated and requires no broker or analyst confirmation. The certificate match is the proof of ownership, so the scanner can act on a discovered origin on its own, while still never actively scanning an IP it cannot tie back to the target domain.</w:t>
       </w:r>
     </w:p>
     <w:p>
@@ -5523,7 +5523,7 @@
         <w:spacing w:after="80"/>
       </w:pPr>
       <w:r>
-        <w:t>For insurance underwriting this category is arguably the most impactful. A company may have perfect TLS and DNS configurations, but if employee credentials are circulating on dark-web markets or the domain's IP is blacklisted for spam, the residual risk is material. Exposure findings often correlate directly with the likelihood of a future claim — particularly credential-stuffing attacks, business-email compromise, and ransomware intrusions.</w:t>
+        <w:t>For insurance underwriting this category is arguably the most impactful. A company may have perfect TLS and DNS configurations, but if employee credentials are circulating on dark-web markets or the domain's IP is blacklisted for spam, the residual risk is material. Exposure findings often correlate directly with the likelihood of a future claim, particularly credential-stuffing attacks, business-email compromise, and ransomware intrusions.</w:t>
       </w:r>
     </w:p>
     <w:p>
@@ -5591,7 +5591,7 @@
         <w:t xml:space="preserve">Why it matters for insurance: </w:t>
       </w:r>
       <w:r>
-        <w:t>Credential exposure is one of the strongest predictors of future compromise. If employee passwords leaked in a breach and were never rotated, attackers can use credential-stuffing tools to gain access to corporate systems. Breaches that include passwords, security questions, or phone numbers are especially dangerous because they enable multi-vector attacks — password reuse, SIM-swapping, and social-engineering of help desks.</w:t>
+        <w:t>Credential exposure is one of the strongest predictors of future compromise. If employee passwords leaked in a breach and were never rotated, attackers can use credential-stuffing tools to gain access to corporate systems. Breaches that include passwords, security questions, or phone numbers are especially dangerous because they enable multi-vector attacks, password reuse, SIM-swapping, and social-engineering of help desks.</w:t>
       </w:r>
     </w:p>
     <w:p>
@@ -5606,7 +5606,7 @@
         <w:t xml:space="preserve">Scoring: </w:t>
       </w:r>
       <w:r>
-        <w:t>The score starts at 100 and is reduced based on the number of breaches found. A single breach results in a moderate penalty; multiple breaches with password exposure result in steeper deductions. The recency of breaches is also considered — a breach from 2024 is weighted more heavily than one from 2015 because credentials are more likely to still be valid.</w:t>
+        <w:t>The score starts at 100 and is reduced based on the number of breaches found. A single breach results in a moderate penalty; multiple breaches with password exposure result in steeper deductions. The recency of breaches is also considered, a breach from 2024 is weighted more heavily than one from 2015 because credentials are more likely to still be valid.</w:t>
       </w:r>
     </w:p>
     <w:p>
@@ -5625,27 +5625,27 @@
         <w:spacing w:after="40"/>
       </w:pPr>
       <w:r>
-        <w:t>Domain found in 3 known data breach(es) — this is a typical result for established businesses. The breach names, dates, and exposed data types are listed in the report.</w:t>
-      </w:r>
-    </w:p>
-    <w:p>
-      <w:pPr>
-        <w:pStyle w:val="ListParagraph"/>
-        <w:widowControl/>
-        <w:spacing w:after="40"/>
-      </w:pPr>
-      <w:r>
-        <w:t>Data classes exposed: Email addresses, Passwords, Names, Phone numbers — the more sensitive data classes present, the higher the risk to the organisation.</w:t>
-      </w:r>
-    </w:p>
-    <w:p>
-      <w:pPr>
-        <w:pStyle w:val="ListParagraph"/>
-        <w:widowControl/>
-        <w:spacing w:after="40"/>
-      </w:pPr>
-      <w:r>
-        <w:t>Most recent breach: 2024-01-15 — recent breaches are flagged prominently because the exposed credentials may still be in active use.</w:t>
+        <w:t>Domain found in 3 known data breach(es), this is a typical result for established businesses. The breach names, dates, and exposed data types are listed in the report.</w:t>
+      </w:r>
+    </w:p>
+    <w:p>
+      <w:pPr>
+        <w:pStyle w:val="ListParagraph"/>
+        <w:widowControl/>
+        <w:spacing w:after="40"/>
+      </w:pPr>
+      <w:r>
+        <w:t>Data classes exposed: Email addresses, Passwords, Names, Phone numbers, the more sensitive data classes present, the higher the risk to the organisation.</w:t>
+      </w:r>
+    </w:p>
+    <w:p>
+      <w:pPr>
+        <w:pStyle w:val="ListParagraph"/>
+        <w:widowControl/>
+        <w:spacing w:after="40"/>
+      </w:pPr>
+      <w:r>
+        <w:t>Most recent breach: 2024-01-15, recent breaches are flagged prominently because the exposed credentials may still be in active use.</w:t>
       </w:r>
     </w:p>
     <w:p>
@@ -5661,7 +5661,7 @@
         <w:t xml:space="preserve">NOTE: </w:t>
       </w:r>
       <w:r>
-        <w:t>HIBP only reports breaches where the domain's email addresses appeared. It does not indicate whether specific individuals' passwords were exposed — that detail comes from the Dehashed checker (Section 4.6.6). HIBP provides the breadth view; Dehashed provides the depth.</w:t>
+        <w:t>HIBP only reports breaches where the domain's email addresses appeared. It does not indicate whether specific individuals' passwords were exposed, that detail comes from the Dehashed checker (Section 4.6.6). HIBP provides the breadth view; Dehashed provides the depth.</w:t>
       </w:r>
     </w:p>
     <w:p>
@@ -5722,7 +5722,7 @@
         <w:t xml:space="preserve">How it works: </w:t>
       </w:r>
       <w:r>
-        <w:t>For IP-based checks, the scanner reverses the IP address octets and performs DNS A-record lookups against four major blacklists: Spamhaus ZEN (zen.spamhaus.org), SpamCop (bl.spamcop.net), Barracuda (b.barracudacentral.org), and UCEProtect (dnsbl-1.uceprotect.net). For domain-based checks, it queries Spamhaus DBL (dbl.spamhaus.org) and URIBL (uribl.com). A bare DNS resolution is not by itself treated as a listing: the scanner validates each reply against the list's documented return codes and only counts a genuine listing code (typically 127.0.0.2 and above). Error, blocked, and refused replies — Spamhaus open-resolver / rate-limit codes in the 127.255.255.x range and the URIBL 127.0.0.1 query-refused code — are explicitly rejected, so an infrastructure response is never mistaken for a blacklisting.</w:t>
+        <w:t>For IP-based checks, the scanner reverses the IP address octets and performs DNS A-record lookups against four major blacklists: Spamhaus ZEN (zen.spamhaus.org), SpamCop (bl.spamcop.net), Barracuda (b.barracudacentral.org), and UCEProtect (dnsbl-1.uceprotect.net). For domain-based checks, it queries Spamhaus DBL (dbl.spamhaus.org) and URIBL (uribl.com). A bare DNS resolution is not by itself treated as a listing: the scanner validates each reply against the list's documented return codes and only counts a genuine listing code (typically 127.0.0.2 and above). Error, blocked, and refused replies, Spamhaus open-resolver / rate-limit codes in the 127.255.255.x range and the URIBL 127.0.0.1 query-refused code, are explicitly rejected, so an infrastructure response is never mistaken for a blacklisting.</w:t>
       </w:r>
     </w:p>
     <w:p>
@@ -5737,7 +5737,7 @@
         <w:t xml:space="preserve">Why it matters for insurance: </w:t>
       </w:r>
       <w:r>
-        <w:t>A blacklisted IP or domain signals a history of compromise or abuse. Even if the current owner is legitimate, a listing on Spamhaus or Barracuda means the infrastructure has been used to send spam or distribute malware — either by the current tenant or a previous one. Blacklisting also destroys email deliverability, which can be a business-continuity issue for companies that rely on email for client communication.</w:t>
+        <w:t>A blacklisted IP or domain signals a history of compromise or abuse. Even if the current owner is legitimate, a listing on Spamhaus or Barracuda means the infrastructure has been used to send spam or distribute malware, either by the current tenant or a previous one. Blacklisting also destroys email deliverability, which can be a business-continuity issue for companies that rely on email for client communication.</w:t>
       </w:r>
     </w:p>
     <w:p>
@@ -5771,27 +5771,27 @@
         <w:spacing w:after="40"/>
       </w:pPr>
       <w:r>
-        <w:t>Domain/IP listed on 1 blacklist(s): zen.spamhaus.org — this is the most common single listing and indicates the IP has been flagged for spam or malware activity.</w:t>
-      </w:r>
-    </w:p>
-    <w:p>
-      <w:pPr>
-        <w:pStyle w:val="ListParagraph"/>
-        <w:widowControl/>
-        <w:spacing w:after="40"/>
-      </w:pPr>
-      <w:r>
-        <w:t>Listed on dnsbl-1.uceprotect.net — UCEProtect listings often indicate the IP sits on a range with a poor sending reputation or has been an open relay.</w:t>
-      </w:r>
-    </w:p>
-    <w:p>
-      <w:pPr>
-        <w:pStyle w:val="ListParagraph"/>
-        <w:widowControl/>
-        <w:spacing w:after="40"/>
-      </w:pPr>
-      <w:r>
-        <w:t>No listings found — this is the desired result and confirms the domain's infrastructure has a clean reputation.</w:t>
+        <w:t>Domain/IP listed on 1 blacklist(s): zen.spamhaus.org, this is the most common single listing and indicates the IP has been flagged for spam or malware activity.</w:t>
+      </w:r>
+    </w:p>
+    <w:p>
+      <w:pPr>
+        <w:pStyle w:val="ListParagraph"/>
+        <w:widowControl/>
+        <w:spacing w:after="40"/>
+      </w:pPr>
+      <w:r>
+        <w:t>Listed on dnsbl-1.uceprotect.net: UCEProtect listings often indicate the IP sits on a range with a poor sending reputation or has been an open relay.</w:t>
+      </w:r>
+    </w:p>
+    <w:p>
+      <w:pPr>
+        <w:pStyle w:val="ListParagraph"/>
+        <w:widowControl/>
+        <w:spacing w:after="40"/>
+      </w:pPr>
+      <w:r>
+        <w:t>No listings found, this is the desired result and confirms the domain's infrastructure has a clean reputation.</w:t>
       </w:r>
     </w:p>
     <w:p>
@@ -5823,7 +5823,7 @@
         <w:t xml:space="preserve">NOTE: </w:t>
       </w:r>
       <w:r>
-        <w:t>Shared-hosting environments can produce false positives: another tenant on the same IP may have caused the listing. The scanner reports the finding regardless because the risk to the client is real — they share the reputational damage.</w:t>
+        <w:t>Shared-hosting environments can produce false positives: another tenant on the same IP may have caused the listing. The scanner reports the finding regardless because the risk to the client is real, they share the reputational damage.</w:t>
       </w:r>
     </w:p>
     <w:p>
@@ -5867,7 +5867,7 @@
         <w:t xml:space="preserve">How it works: </w:t>
       </w:r>
       <w:r>
-        <w:t>HTTPS GET requests are sent to each path with a four-second timeout and redirects disabled. Up to 15 paths are probed concurrently using a thread pool. Only an HTTP 200 response that also passes a body-sanity check counts as an exposure — confirming the path is directly accessible and is serving real content rather than a generic landing or error page. HTTP 401 and 403 responses are treated as PROTECTED (access-controlled) and are NOT counted as findings: a server that returns 403 on /.env or /wp-admin is enforcing access control, which is the desired posture. This 200-only, body-checked approach mirrors the dependency-manifest probe and prevents WAF/CDN-defended sites from being penalised for blocking the probe.</w:t>
+        <w:t>HTTPS GET requests are sent to each path with a four-second timeout and redirects disabled. Up to 15 paths are probed concurrently using a thread pool. Only an HTTP 200 response that also passes a body-sanity check counts as an exposure, confirming the path is directly accessible and is serving real content rather than a generic landing or error page. HTTP 401 and 403 responses are treated as PROTECTED (access-controlled) and are NOT counted as findings: a server that returns 403 on /.env or /wp-admin is enforcing access control, which is the desired posture. This 200-only, body-checked approach mirrors the dependency-manifest probe and prevents WAF/CDN-defended sites from being penalised for blocking the probe.</w:t>
       </w:r>
     </w:p>
     <w:p>
@@ -5916,37 +5916,37 @@
         <w:spacing w:after="40"/>
       </w:pPr>
       <w:r>
-        <w:t>/.env — HTTP 200 (CRITICAL): The environment file is publicly readable. This typically exposes database host, username, password, API keys, and application secrets.</w:t>
-      </w:r>
-    </w:p>
-    <w:p>
-      <w:pPr>
-        <w:pStyle w:val="ListParagraph"/>
-        <w:widowControl/>
-        <w:spacing w:after="40"/>
-      </w:pPr>
-      <w:r>
-        <w:t>/wp-admin — HTTP 200: The WordPress administration panel is accessible from the public internet without IP restriction.</w:t>
-      </w:r>
-    </w:p>
-    <w:p>
-      <w:pPr>
-        <w:pStyle w:val="ListParagraph"/>
-        <w:widowControl/>
-        <w:spacing w:after="40"/>
-      </w:pPr>
-      <w:r>
-        <w:t>/server-status — HTTP 200 (MEDIUM): Apache mod_status is enabled, leaking active connections, client IPs, and request URLs.</w:t>
-      </w:r>
-    </w:p>
-    <w:p>
-      <w:pPr>
-        <w:pStyle w:val="ListParagraph"/>
-        <w:widowControl/>
-        <w:spacing w:after="40"/>
-      </w:pPr>
-      <w:r>
-        <w:t>/.git/HEAD — HTTP 200 (CRITICAL): The Git repository metadata is publicly readable, allowing an attacker to reconstruct the source tree. A path that instead returns 401/403 is reported as protected and does not appear as a finding.</w:t>
+        <w:t>/.env, HTTP 200 (CRITICAL): The environment file is publicly readable. This typically exposes database host, username, password, API keys, and application secrets.</w:t>
+      </w:r>
+    </w:p>
+    <w:p>
+      <w:pPr>
+        <w:pStyle w:val="ListParagraph"/>
+        <w:widowControl/>
+        <w:spacing w:after="40"/>
+      </w:pPr>
+      <w:r>
+        <w:t>/wp-admin, HTTP 200: The WordPress administration panel is accessible from the public internet without IP restriction.</w:t>
+      </w:r>
+    </w:p>
+    <w:p>
+      <w:pPr>
+        <w:pStyle w:val="ListParagraph"/>
+        <w:widowControl/>
+        <w:spacing w:after="40"/>
+      </w:pPr>
+      <w:r>
+        <w:t>/server-status, HTTP 200 (MEDIUM): Apache mod_status is enabled, leaking active connections, client IPs, and request URLs.</w:t>
+      </w:r>
+    </w:p>
+    <w:p>
+      <w:pPr>
+        <w:pStyle w:val="ListParagraph"/>
+        <w:widowControl/>
+        <w:spacing w:after="40"/>
+      </w:pPr>
+      <w:r>
+        <w:t>/.git/HEAD, HTTP 200 (CRITICAL): The Git repository metadata is publicly readable, allowing an attacker to reconstruct the source tree. A path that instead returns 401/403 is reported as protected and does not appear as a finding.</w:t>
       </w:r>
     </w:p>
     <w:p>
@@ -5962,7 +5962,7 @@
         <w:t xml:space="preserve">WARNING: </w:t>
       </w:r>
       <w:r>
-        <w:t>An exposed .env file is one of the most critical findings the scanner can produce. It should be treated as an active compromise — all secrets in that file must be rotated immediately.</w:t>
+        <w:t>An exposed .env file is one of the most critical findings the scanner can produce. It should be treated as an active compromise: all secrets in that file must be rotated immediately.</w:t>
       </w:r>
     </w:p>
     <w:p>
@@ -6035,10 +6035,10 @@
         <w:rPr>
           <w:b/>
         </w:rPr>
-        <w:t xml:space="preserve">Phase 3 — Subdomain Takeover Detection: </w:t>
-      </w:r>
-      <w:r>
-        <w:t>For every discovered subdomain, the scanner checks the CNAME record to determine whether it points to a third-party cloud service. If the CNAME target matches one of 28 known takeover signatures (GitHub Pages, AWS S3, Heroku, Azure Web Sites, Azure Blob, Azure Traffic Manager, Netlify, Vercel, Shopify, Ghost, Surge, Bitbucket, WordPress.com, Pantheon, Unbounce, Zendesk, Fastly, Fly.io, Render, and others), the scanner checks whether the target is dangling — meaning the CNAME points to a service endpoint that no longer exists. A dangling CNAME is confirmed by either NXDOMAIN resolution or an HTTP response matching the service's known 'not configured' fingerprint (e.g., 'There isn't a GitHub Pages site here' or 'NoSuchBucket' for S3). A confirmed dangling CNAME means an attacker can claim the endpoint and serve arbitrary content on the organisation's subdomain.</w:t>
+        <w:t xml:space="preserve">Phase 3, Subdomain Takeover Detection: </w:t>
+      </w:r>
+      <w:r>
+        <w:t>For every discovered subdomain, the scanner checks the CNAME record to determine whether it points to a third-party cloud service. If the CNAME target matches one of 28 known takeover signatures (GitHub Pages, AWS S3, Heroku, Azure Web Sites, Azure Blob, Azure Traffic Manager, Netlify, Vercel, Shopify, Ghost, Surge, Bitbucket, WordPress.com, Pantheon, Unbounce, Zendesk, Fastly, Fly.io, Render, and others), the scanner checks whether the target is dangling, meaning the CNAME points to a service endpoint that no longer exists. A dangling CNAME is confirmed by either NXDOMAIN resolution or an HTTP response matching the service's known 'not configured' fingerprint (e.g., 'There isn't a GitHub Pages site here' or 'NoSuchBucket' for S3). A confirmed dangling CNAME means an attacker can claim the endpoint and serve arbitrary content on the organisation's subdomain.</w:t>
       </w:r>
     </w:p>
     <w:p>
@@ -6053,7 +6053,7 @@
         <w:t xml:space="preserve">Why it matters for insurance: </w:t>
       </w:r>
       <w:r>
-        <w:t>Forgotten subdomains are one of the most common entry points in real-world breaches. A staging server with default credentials, a dev environment with debug mode enabled, or a decommissioned app with unpatched vulnerabilities — all are discovered by attackers using the same techniques this scanner employs. Subdomain takeover is particularly dangerous because it allows an attacker to host phishing pages on a legitimate subdomain (e.g., login.staging.example.com), bypassing email security filters and SSL certificate warnings that would normally alert users.</w:t>
+        <w:t>Forgotten subdomains are one of the most common entry points in real-world breaches. A staging server with default credentials, a dev environment with debug mode enabled, or a decommissioned app with unpatched vulnerabilities, all are discovered by attackers using the same techniques this scanner employs. Subdomain takeover is particularly dangerous because it allows an attacker to host phishing pages on a legitimate subdomain (e.g., login.staging.example.com), bypassing email security filters and SSL certificate warnings that would normally alert users.</w:t>
       </w:r>
     </w:p>
     <w:p>
@@ -6068,7 +6068,7 @@
         <w:t xml:space="preserve">Scoring: </w:t>
       </w:r>
       <w:r>
-        <w:t>The subdomain checker carries a 2% weight in the overall score. Risky subdomains (containing keywords like dev, staging, admin, backup) each incur a penalty. Confirmed subdomain takeover vulnerabilities carry the heaviest penalty — a single takeover-vulnerable subdomain can significantly reduce the score because it represents an immediately exploitable issue.</w:t>
+        <w:t>The subdomain checker carries a 2% weight in the overall score. Risky subdomains (containing keywords like dev, staging, admin, backup) each incur a penalty. Confirmed subdomain takeover vulnerabilities carry the heaviest penalty, a single takeover-vulnerable subdomain can significantly reduce the score because it represents an immediately exploitable issue.</w:t>
       </w:r>
     </w:p>
     <w:p>
@@ -6097,17 +6097,17 @@
         <w:spacing w:after="40"/>
       </w:pPr>
       <w:r>
-        <w:t>SUBDOMAIN TAKEOVER: old-blog.example.com CNAME points to example.github.io — endpoint unclaimed. An attacker can register this GitHub Pages repository and serve content on the subdomain.</w:t>
-      </w:r>
-    </w:p>
-    <w:p>
-      <w:pPr>
-        <w:pStyle w:val="ListParagraph"/>
-        <w:widowControl/>
-        <w:spacing w:after="40"/>
-      </w:pPr>
-      <w:r>
-        <w:t>vpn.example.com, owa.example.com — internal service subdomains are publicly resolvable, revealing the organisation's internal infrastructure topology.</w:t>
+        <w:t>SUBDOMAIN TAKEOVER: old-blog.example.com CNAME points to example.github.io, endpoint unclaimed. An attacker can register this GitHub Pages repository and serve content on the subdomain.</w:t>
+      </w:r>
+    </w:p>
+    <w:p>
+      <w:pPr>
+        <w:pStyle w:val="ListParagraph"/>
+        <w:widowControl/>
+        <w:spacing w:after="40"/>
+      </w:pPr>
+      <w:r>
+        <w:t>vpn.example.com, owa.example.com, internal service subdomains are publicly resolvable, revealing the organisation's internal infrastructure topology.</w:t>
       </w:r>
     </w:p>
     <w:p>
@@ -6123,7 +6123,7 @@
         <w:t xml:space="preserve">WARNING: </w:t>
       </w:r>
       <w:r>
-        <w:t>Subdomain takeover vulnerabilities should be treated as CRITICAL. The remediation is simple — remove the dangling CNAME record from DNS — but the risk of phishing or malware hosting is immediate.</w:t>
+        <w:t>Subdomain takeover vulnerabilities should be treated as CRITICAL. The remediation is simple, remove the dangling CNAME record from DNS, but the risk of phishing or malware hosting is immediate.</w:t>
       </w:r>
     </w:p>
     <w:p>
@@ -6199,7 +6199,7 @@
         <w:t xml:space="preserve">Why it matters for insurance: </w:t>
       </w:r>
       <w:r>
-        <w:t>Unpatched vulnerabilities with public exploits are the single most common initial access vector in ransomware attacks. A CVE that is listed in CISA KEV is not a theoretical risk — it is being actively exploited by threat actors right now. EPSS scores above 0.5 (50% exploitation probability in 30 days) demand immediate attention. For underwriters, this checker provides the clearest view of whether the organisation keeps its internet-facing infrastructure patched.</w:t>
+        <w:t>Unpatched vulnerabilities with public exploits are the single most common initial access vector in ransomware attacks. A CVE that is listed in CISA KEV is not a theoretical risk, it is being actively exploited by threat actors right now. EPSS scores above 0.5 (50% exploitation probability in 30 days) demand immediate attention. For underwriters, this checker provides the clearest view of whether the organisation keeps its internet-facing infrastructure patched.</w:t>
       </w:r>
     </w:p>
     <w:p>
@@ -6214,7 +6214,7 @@
         <w:t xml:space="preserve">Scoring: </w:t>
       </w:r>
       <w:r>
-        <w:t>Scoring is per-IP and based on the severity and exploitability of discovered CVEs. Critical CVEs (CVSS 9.0+) carry the heaviest penalty, especially when combined with CISA KEV status or a weaponized exploit. High CVEs (CVSS 7.0-8.9) carry moderate penalties. The EPSS probability acts as a multiplier — a medium-severity CVE with 80% EPSS is scored more harshly than a high-severity CVE with 1% EPSS. The Shodan checker is one of the highest-weighted components in the overall score calculation.</w:t>
+        <w:t>Scoring is per-IP and based on the severity and exploitability of discovered CVEs. Critical CVEs (CVSS 9.0+) carry the heaviest penalty, especially when combined with CISA KEV status or a weaponized exploit. High CVEs (CVSS 7.0-8.9) carry moderate penalties. The EPSS probability acts as a multiplier, a medium-severity CVE with 80% EPSS is scored more harshly than a high-severity CVE with 1% EPSS. The Shodan checker is one of the highest-weighted components in the overall score calculation.</w:t>
       </w:r>
     </w:p>
     <w:p>
@@ -6259,7 +6259,7 @@
         <w:spacing w:after="40"/>
       </w:pPr>
       <w:r>
-        <w:t>CVE-2024-XXXXX — CVSS 9.8 (CRITICAL) — CISA KEV: Yes — EPSS: 94.2% — Exploit: weaponized. This is the worst-case scenario: a critical vulnerability with a public weaponized exploit that is known to be actively exploited.</w:t>
+        <w:t>CVE-2024-XXXXX, CVSS 9.8 (CRITICAL), CISA KEV: Yes, EPSS: 94.2%, Exploit: weaponized. This is the worst-case scenario: a critical vulnerability with a public weaponized exploit that is known to be actively exploited.</w:t>
       </w:r>
     </w:p>
     <w:p>
@@ -6295,7 +6295,7 @@
         <w:t xml:space="preserve">WARNING: </w:t>
       </w:r>
       <w:r>
-        <w:t>Any CVE with CISA KEV status should be treated as requiring immediate patching. These are not theoretical vulnerabilities — they are confirmed to be in active exploitation by ransomware groups, nation-state actors, or criminal organisations.</w:t>
+        <w:t>Any CVE with CISA KEV status should be treated as requiring immediate patching. These are not theoretical vulnerabilities, they are confirmed to be in active exploitation by ransomware groups, nation-state actors, or criminal organisations.</w:t>
       </w:r>
     </w:p>
     <w:p>
@@ -6373,7 +6373,7 @@
         <w:t xml:space="preserve">What it checks: </w:t>
       </w:r>
       <w:r>
-        <w:t>Dehashed is a paid, credit-based API that searches aggregated credential leak databases for entries associated with the target domain. Unlike HIBP (which reports breaches at the domain level), Dehashed returns individual credential records — including email addresses, passwords (plaintext or hashed), usernames, names, and IP addresses. This checker is toggleable in the scanner UI because it consumes API credits.</w:t>
+        <w:t>Dehashed is a paid, credit-based API that searches aggregated credential leak databases for entries associated with the target domain. Unlike HIBP (which reports breaches at the domain level), Dehashed returns individual credential records, including email addresses, passwords (plaintext or hashed), usernames, names, and IP addresses. This checker is toggleable in the scanner UI because it consumes API credits.</w:t>
       </w:r>
     </w:p>
     <w:p>
@@ -6400,10 +6400,10 @@
         <w:rPr>
           <w:b/>
         </w:rPr>
-        <w:t xml:space="preserve">Phase 3 — Credential Type Parsing: </w:t>
-      </w:r>
-      <w:r>
-        <w:t>For every record that contains a password or hashed_password field, the scanner classifies the credential type. Plaintext passwords are identified when the password field contains a readable string that does not match any known hash pattern. Hashed passwords are identified using regex patterns for seven hash types: bcrypt ($2a$/$2b$/$2y$ prefix), argon2 ($argon2i$/$argon2d$/$argon2id$ prefix), scrypt ($s0$ prefix), SHA-512 (128 hex characters), SHA-256 (64 hex characters), SHA-1 (40 hex characters), and MD5/NTLM (32 hex characters). Hash types are further classified as weak (MD5, SHA-1, NTLM — easily cracked) or strong (bcrypt, argon2, scrypt, SHA-256, SHA-512 — computationally expensive to crack). The scanner also splits findings into corporate email addresses (matching the target domain) versus personal email addresses (Gmail, Yahoo, etc.).</w:t>
+        <w:t xml:space="preserve">Phase 3, Credential Type Parsing: </w:t>
+      </w:r>
+      <w:r>
+        <w:t>For every record that contains a password or hashed_password field, the scanner classifies the credential type. Plaintext passwords are identified when the password field contains a readable string that does not match any known hash pattern. Hashed passwords are identified using regex patterns for seven hash types: bcrypt ($2a$/$2b$/$2y$ prefix), argon2 ($argon2i$/$argon2d$/$argon2id$ prefix), scrypt ($s0$ prefix), SHA-512 (128 hex characters), SHA-256 (64 hex characters), SHA-1 (40 hex characters), and MD5/NTLM (32 hex characters). Hash types are further classified as weak (MD5, SHA-1, NTLM, easily cracked) or strong (bcrypt, argon2, scrypt, SHA-256, SHA-512, computationally expensive to crack). The scanner also splits findings into corporate email addresses (matching the target domain) versus personal email addresses (Gmail, Yahoo, etc.).</w:t>
       </w:r>
     </w:p>
     <w:p>
@@ -6457,17 +6457,17 @@
         <w:spacing w:after="40"/>
       </w:pPr>
       <w:r>
-        <w:t>Corporate vs personal split: 18 corporate emails (@example.com), 5 personal emails (Gmail, Yahoo) — corporate addresses represent direct risk to the organisation.</w:t>
-      </w:r>
-    </w:p>
-    <w:p>
-      <w:pPr>
-        <w:pStyle w:val="ListParagraph"/>
-        <w:widowControl/>
-        <w:spacing w:after="40"/>
-      </w:pPr>
-      <w:r>
-        <w:t>Breach sources: Collection #1, LinkedIn 2012, Adobe, Exploit.in, Anti Public Combo List — multiple sources increase the likelihood that credentials overlap with active accounts.</w:t>
+        <w:t>Corporate vs personal split: 18 corporate emails (@example.com), 5 personal emails (Gmail, Yahoo), corporate addresses represent direct risk to the organisation.</w:t>
+      </w:r>
+    </w:p>
+    <w:p>
+      <w:pPr>
+        <w:pStyle w:val="ListParagraph"/>
+        <w:widowControl/>
+        <w:spacing w:after="40"/>
+      </w:pPr>
+      <w:r>
+        <w:t>Breach sources: Collection #1, LinkedIn 2012, Adobe, Exploit.in, Anti Public Combo List, multiple sources increase the likelihood that credentials overlap with active accounts.</w:t>
       </w:r>
     </w:p>
     <w:p>
@@ -6528,7 +6528,7 @@
         <w:t xml:space="preserve">What it checks: </w:t>
       </w:r>
       <w:r>
-        <w:t>Hudson Rock's free OSINT API checks whether employee devices associated with the domain are CURRENTLY infected with infostealer malware — specifically Raccoon Stealer, RedLine Stealer, Vidar, and similar credential-harvesting trojans. This is not historical data: it reflects active, ongoing compromise.</w:t>
+        <w:t>Hudson Rock's free OSINT API checks whether employee devices associated with the domain are CURRENTLY infected with infostealer malware, specifically Raccoon Stealer, RedLine Stealer, Vidar, and similar credential-harvesting trojans. This is not historical data: it reflects active, ongoing compromise.</w:t>
       </w:r>
     </w:p>
     <w:p>
@@ -6558,7 +6558,7 @@
         <w:t xml:space="preserve">Why it matters for insurance: </w:t>
       </w:r>
       <w:r>
-        <w:t>An active infostealer infection is the single most critical credential finding the scanner can produce. Unlike a historical breach where passwords may have been rotated, an infostealer is exfiltrating credentials in real time — every new password the user sets is immediately captured. Infostealers harvest saved browser passwords, session cookies (enabling session hijacking that bypasses MFA), autofill data, crypto wallets, and VPN configurations. This data is sold on dark-web markets within hours of collection.</w:t>
+        <w:t>An active infostealer infection is the single most critical credential finding the scanner can produce. Unlike a historical breach where passwords may have been rotated, an infostealer is exfiltrating credentials in real time, every new password the user sets is immediately captured. Infostealers harvest saved browser passwords, session cookies (enabling session hijacking that bypasses MFA), autofill data, crypto wallets, and VPN configurations. This data is sold on dark-web markets within hours of collection.</w:t>
       </w:r>
     </w:p>
     <w:p>
@@ -6592,37 +6592,37 @@
         <w:spacing w:after="40"/>
       </w:pPr>
       <w:r>
-        <w:t>CRITICAL: 2 employee device(s) infected with infostealer malware — credentials are actively being sold on dark web markets. Immediate incident response required.</w:t>
-      </w:r>
-    </w:p>
-    <w:p>
-      <w:pPr>
-        <w:pStyle w:val="ListParagraph"/>
-        <w:widowControl/>
-        <w:spacing w:after="40"/>
-      </w:pPr>
-      <w:r>
-        <w:t>3 user account(s) compromised via infostealer — force password resets and enable MFA for affected accounts.</w:t>
-      </w:r>
-    </w:p>
-    <w:p>
-      <w:pPr>
-        <w:pStyle w:val="ListParagraph"/>
-        <w:widowControl/>
-        <w:spacing w:after="40"/>
-      </w:pPr>
-      <w:r>
-        <w:t>5 third-party exposure(s) detected — review supply chain partners and shared credential access.</w:t>
-      </w:r>
-    </w:p>
-    <w:p>
-      <w:pPr>
-        <w:pStyle w:val="ListParagraph"/>
-        <w:widowControl/>
-        <w:spacing w:after="40"/>
-      </w:pPr>
-      <w:r>
-        <w:t>No infostealer infections detected — this is the desired result and indicates no currently active credential theft.</w:t>
+        <w:t>CRITICAL: 2 employee device(s) infected with infostealer malware; credentials are actively being sold on dark web markets. Immediate incident response required.</w:t>
+      </w:r>
+    </w:p>
+    <w:p>
+      <w:pPr>
+        <w:pStyle w:val="ListParagraph"/>
+        <w:widowControl/>
+        <w:spacing w:after="40"/>
+      </w:pPr>
+      <w:r>
+        <w:t>3 user account(s) compromised via infostealer, force password resets and enable MFA for affected accounts.</w:t>
+      </w:r>
+    </w:p>
+    <w:p>
+      <w:pPr>
+        <w:pStyle w:val="ListParagraph"/>
+        <w:widowControl/>
+        <w:spacing w:after="40"/>
+      </w:pPr>
+      <w:r>
+        <w:t>5 third-party exposure(s) detected, review supply chain partners and shared credential access.</w:t>
+      </w:r>
+    </w:p>
+    <w:p>
+      <w:pPr>
+        <w:pStyle w:val="ListParagraph"/>
+        <w:widowControl/>
+        <w:spacing w:after="40"/>
+      </w:pPr>
+      <w:r>
+        <w:t>No infostealer infections detected, this is the desired result and indicates no currently active credential theft.</w:t>
       </w:r>
     </w:p>
     <w:p>
@@ -6655,7 +6655,7 @@
         <w:t xml:space="preserve">TIP: </w:t>
       </w:r>
       <w:r>
-        <w:t>Hudson Rock data is real-time. If a rescan shows the same finding weeks later, it means the infection has not been remediated — escalate the urgency.</w:t>
+        <w:t>Hudson Rock data is real-time. If a rescan shows the same finding weeks later, it means the infection has not been remediated, escalate the urgency.</w:t>
       </w:r>
     </w:p>
     <w:p>
@@ -6714,7 +6714,7 @@
         <w:t xml:space="preserve">Why it matters for insurance: </w:t>
       </w:r>
       <w:r>
-        <w:t>Dark web mentions indicate that the domain's data, credentials, or infrastructure is being discussed or traded in criminal communities. This is a leading indicator of imminent attack — if credentials appear on a dark web marketplace, credential-stuffing attacks typically follow within days. Paste site mentions may indicate data dumps where exfiltrated information has been publicly shared. For underwriters, dark web exposure is one of the strongest predictors of a future claim.</w:t>
+        <w:t>Dark web mentions indicate that the domain's data, credentials, or infrastructure is being discussed or traded in criminal communities. This is a leading indicator of imminent attack, if credentials appear on a dark web marketplace, credential-stuffing attacks typically follow within days. Paste site mentions may indicate data dumps where exfiltrated information has been publicly shared. For underwriters, dark web exposure is one of the strongest predictors of a future claim.</w:t>
       </w:r>
     </w:p>
     <w:p>
@@ -6748,27 +6748,27 @@
         <w:spacing w:after="40"/>
       </w:pPr>
       <w:r>
-        <w:t>3 dark web mention(s) found — credentials or data may be actively traded on criminal forums.</w:t>
-      </w:r>
-    </w:p>
-    <w:p>
-      <w:pPr>
-        <w:pStyle w:val="ListParagraph"/>
-        <w:widowControl/>
-        <w:spacing w:after="40"/>
-      </w:pPr>
-      <w:r>
-        <w:t>8 paste site mention(s) — data has been shared on public paste sites (Pastebin, etc.).</w:t>
-      </w:r>
-    </w:p>
-    <w:p>
-      <w:pPr>
-        <w:pStyle w:val="ListParagraph"/>
-        <w:widowControl/>
-        <w:spacing w:after="40"/>
-      </w:pPr>
-      <w:r>
-        <w:t>12 reference(s) found in dark web and leak databases — the domain appears in multiple breach compilations.</w:t>
+        <w:t>3 dark web mention(s) found, credentials or data may be actively traded on criminal forums.</w:t>
+      </w:r>
+    </w:p>
+    <w:p>
+      <w:pPr>
+        <w:pStyle w:val="ListParagraph"/>
+        <w:widowControl/>
+        <w:spacing w:after="40"/>
+      </w:pPr>
+      <w:r>
+        <w:t>8 paste site mention(s), data has been shared on public paste sites (Pastebin, etc.).</w:t>
+      </w:r>
+    </w:p>
+    <w:p>
+      <w:pPr>
+        <w:pStyle w:val="ListParagraph"/>
+        <w:widowControl/>
+        <w:spacing w:after="40"/>
+      </w:pPr>
+      <w:r>
+        <w:t>12 reference(s) found in dark web and leak databases, the domain appears in multiple breach compilations.</w:t>
       </w:r>
     </w:p>
     <w:p>
@@ -6794,7 +6794,7 @@
         <w:t xml:space="preserve">NOTE: </w:t>
       </w:r>
       <w:r>
-        <w:t>IntelX uses the free tier by default (40 results per search, approximately 500 credits per day). The results represent a sample of available intelligence — commercial IntelX subscriptions would return more comprehensive results.</w:t>
+        <w:t>IntelX uses the free tier by default (40 results per search, approximately 500 credits per day). The results represent a sample of available intelligence, commercial IntelX subscriptions would return more comprehensive results.</w:t>
       </w:r>
     </w:p>
     <w:p>
@@ -6839,7 +6839,7 @@
         <w:t xml:space="preserve">What it checks: </w:t>
       </w:r>
       <w:r>
-        <w:t>The Credential Risk Assessment is an aggregate classifier that combines data from all four credential intelligence sources — Dehashed, HIBP, Hudson Rock, and IntelX — to produce a single risk classification: CRITICAL, HIGH, MEDIUM, or LOW. It is not a separate API call but rather a synthesis layer that interprets the combined findings.</w:t>
+        <w:t>The Credential Risk Assessment is an aggregate classifier that combines data from all four credential intelligence sources, Dehashed, HIBP, Hudson Rock, and IntelX, to produce a single risk classification: CRITICAL, HIGH, MEDIUM, or LOW. It is not a separate API call but rather a synthesis layer that interprets the combined findings.</w:t>
       </w:r>
     </w:p>
     <w:p>
@@ -6869,7 +6869,7 @@
         <w:t xml:space="preserve">Counting password-bearing records: </w:t>
       </w:r>
       <w:r>
-        <w:t>Where the assessment reports an exposed-credential count, it counts the records (mailboxes) that actually carry a password — the plaintext- and hashed-password subset from the Dehashed credential breakdown — rather than treating a single 'passwords present' indicator as if it were a count. The figure is therefore phrased so the reader can see both the total exposure and how much of it is directly loginable (for example, one mailbox carrying a password across thirteen breach-exposure records). Email addresses are lower-cased and trimmed before the unique-mailbox tally so that the same address in different letter cases is not double-counted.</w:t>
+        <w:t>Where the assessment reports an exposed-credential count, it counts the records (mailboxes) that actually carry a password, the plaintext- and hashed-password subset from the Dehashed credential breakdown, rather than treating a single 'passwords present' indicator as if it were a count. The figure is therefore phrased so the reader can see both the total exposure and how much of it is directly loginable (for example, one mailbox carrying a password across thirteen breach-exposure records). Email addresses are lower-cased and trimmed before the unique-mailbox tally so that the same address in different letter cases is not double-counted.</w:t>
       </w:r>
     </w:p>
     <w:p>
@@ -6884,7 +6884,7 @@
         <w:t xml:space="preserve">Risk levels and their meanings: </w:t>
       </w:r>
       <w:r>
-        <w:t>CRITICAL — Active infostealer infection detected or credentials being actively traded on the dark web. Immediate incident response required: isolate devices, force all password resets, enable MFA, engage forensics. HIGH — Recent breach (2023+) with password exposure, or dark web mentions detected. Force password resets for identified accounts, enable MFA, implement continuous monitoring. MEDIUM — Historical credential exposure without active compromise indicators. Review affected accounts, enforce MFA, monitor for credential-stuffing attempts. LOW — No active compromise or significant credential exposure detected.</w:t>
+        <w:t>CRITICAL: Active infostealer infection detected or credentials being actively traded on the dark web. Immediate incident response required: isolate devices, force all password resets, enable MFA, engage forensics. HIGH: Recent breach (2023+) with password exposure, or dark web mentions detected. Force password resets for identified accounts, enable MFA, implement continuous monitoring. MEDIUM: Historical credential exposure without active compromise indicators. Review affected accounts, enforce MFA, monitor for credential-stuffing attempts. LOW: No active compromise or significant credential exposure detected.</w:t>
       </w:r>
     </w:p>
     <w:p>
@@ -6948,7 +6948,7 @@
         <w:spacing w:after="40"/>
       </w:pPr>
       <w:r>
-        <w:t>A list of risk factors — human-readable explanations of why the risk level was assigned (e.g., 'ACTIVE INFOSTEALER: 2 employee device(s) currently infected — credentials are being exfiltrated in real-time').</w:t>
+        <w:t>A list of risk factors, human-readable explanations of why the risk level was assigned (e.g., 'ACTIVE INFOSTEALER: 2 employee device(s) currently infected, credentials are being exfiltrated in real-time').</w:t>
       </w:r>
     </w:p>
     <w:p>
@@ -7035,7 +7035,7 @@
         <w:t xml:space="preserve">How it works: </w:t>
       </w:r>
       <w:r>
-        <w:t>A single GET request is sent to the VirusTotal v3 domains endpoint with the API key in the header. The response includes last_analysis_stats (counts of malicious, suspicious, harmless, and undetected verdicts), total_votes (community malicious vs harmless votes), categories (how vendors classify the domain — e.g., 'business', 'phishing', 'malware'), popularity_ranks (Alexa, Cisco Umbrella), and last_analysis_results (per-engine verdict details). The scanner extracts flagging engines — any engine that returned 'malicious' or 'suspicious' — and lists them by name with their specific verdict.</w:t>
+        <w:t>A single GET request is sent to the VirusTotal v3 domains endpoint with the API key in the header. The response includes last_analysis_stats (counts of malicious, suspicious, harmless, and undetected verdicts), total_votes (community malicious vs harmless votes), categories (how vendors classify the domain, e.g., 'business', 'phishing', 'malware'), popularity_ranks (Alexa, Cisco Umbrella), and last_analysis_results (per-engine verdict details). The scanner extracts flagging engines, any engine that returned 'malicious' or 'suspicious', and lists them by name with their specific verdict.</w:t>
       </w:r>
     </w:p>
     <w:p>
@@ -7050,7 +7050,7 @@
         <w:t xml:space="preserve">Why it matters for insurance: </w:t>
       </w:r>
       <w:r>
-        <w:t>VirusTotal is the industry standard for domain reputation checking. If multiple security engines flag a domain as malicious, it means the domain has been associated with malware distribution, phishing, command-and-control infrastructure, or other criminal activity. Even a single malicious flag from a reputable engine is cause for investigation. Category classifications like 'phishing' or 'malware' from vendors indicate the domain has been actively blacklisted by endpoint security products — meaning employees at other companies may be blocked from visiting the domain entirely.</w:t>
+        <w:t>VirusTotal is the industry standard for domain reputation checking. If multiple security engines flag a domain as malicious, it means the domain has been associated with malware distribution, phishing, command-and-control infrastructure, or other criminal activity. Even a single malicious flag from a reputable engine is cause for investigation. Category classifications like 'phishing' or 'malware' from vendors indicate the domain has been actively blacklisted by endpoint security products, meaning employees at other companies may be blocked from visiting the domain entirely.</w:t>
       </w:r>
     </w:p>
     <w:p>
@@ -7065,7 +7065,7 @@
         <w:t xml:space="preserve">Scoring: </w:t>
       </w:r>
       <w:r>
-        <w:t>Malicious flags carry heavy penalties. A single malicious flag is a significant finding; multiple malicious flags indicate confirmed malicious activity. Suspicious flags carry lighter penalties. The scanner also checks category classifications for keywords like 'malware', 'phishing', 'spam', and 'scam' — these carry additional penalties. The VirusTotal weight in the overall score is 5%. The free API tier allows 4 requests per minute and 500 per day.</w:t>
+        <w:t>Malicious flags carry heavy penalties. A single malicious flag is a significant finding; multiple malicious flags indicate confirmed malicious activity. Suspicious flags carry lighter penalties. The scanner also checks category classifications for keywords like 'malware', 'phishing', 'spam', and 'scam', these carry additional penalties. The VirusTotal weight in the overall score is 5%. The free API tier allows 4 requests per minute and 500 per day.</w:t>
       </w:r>
     </w:p>
     <w:p>
@@ -7084,27 +7084,27 @@
         <w:spacing w:after="40"/>
       </w:pPr>
       <w:r>
-        <w:t>CRITICAL: 3 security engine(s) flagged this domain as MALICIOUS — the flagging engines are listed by name (e.g., Fortinet, Kaspersky, ESET) with their specific verdicts.</w:t>
-      </w:r>
-    </w:p>
-    <w:p>
-      <w:pPr>
-        <w:pStyle w:val="ListParagraph"/>
-        <w:widowControl/>
-        <w:spacing w:after="40"/>
-      </w:pPr>
-      <w:r>
-        <w:t>1 security engine(s) flagged this domain as suspicious — a single suspicious flag may be a false positive but warrants investigation.</w:t>
-      </w:r>
-    </w:p>
-    <w:p>
-      <w:pPr>
-        <w:pStyle w:val="ListParagraph"/>
-        <w:widowControl/>
-        <w:spacing w:after="40"/>
-      </w:pPr>
-      <w:r>
-        <w:t>Categories: Fortinet classifies the domain as 'phishing' — this means Fortinet endpoint products will block access to the domain for their customers.</w:t>
+        <w:t>CRITICAL: 3 security engine(s) flagged this domain as MALICIOUS; the flagging engines are listed by name (e.g., Fortinet, Kaspersky, ESET) with their specific verdicts.</w:t>
+      </w:r>
+    </w:p>
+    <w:p>
+      <w:pPr>
+        <w:pStyle w:val="ListParagraph"/>
+        <w:widowControl/>
+        <w:spacing w:after="40"/>
+      </w:pPr>
+      <w:r>
+        <w:t>1 security engine(s) flagged this domain as suspicious, a single suspicious flag may be a false positive but warrants investigation.</w:t>
+      </w:r>
+    </w:p>
+    <w:p>
+      <w:pPr>
+        <w:pStyle w:val="ListParagraph"/>
+        <w:widowControl/>
+        <w:spacing w:after="40"/>
+      </w:pPr>
+      <w:r>
+        <w:t>Categories: Fortinet classifies the domain as 'phishing', this means Fortinet endpoint products will block access to the domain for their customers.</w:t>
       </w:r>
     </w:p>
     <w:p>
@@ -7124,7 +7124,7 @@
         <w:spacing w:after="40"/>
       </w:pPr>
       <w:r>
-        <w:t>0 malicious, 0 suspicious, 68 harmless, 4 undetected — a clean result indicating no security engines have flagged the domain.</w:t>
+        <w:t>0 malicious, 0 suspicious, 68 harmless, 4 undetected, a clean result indicating no security engines have flagged the domain.</w:t>
       </w:r>
     </w:p>
     <w:p>
@@ -7186,7 +7186,7 @@
         <w:t xml:space="preserve">What it checks: </w:t>
       </w:r>
       <w:r>
-        <w:t>The scanner generates lookalike domain permutations and checks which ones are registered and actively resolving via DNS. These lookalike domains can be used for phishing attacks targeting the organisation's employees, clients, and partners. The scanner employs several generation techniques: character omission, adjacent character swap, character duplication, ASCII homoglyph substitution (visually similar characters like 'o' and '0', 'l' and '1'), adjacent-keyboard typos (fat-finger errors), TLD variants (e.g., .com to .net, .co, .io, .co.za), dot insertion, and hyphen insertion. It also generates a bounded set of IDN / homoglyph candidates — internationalised-domain lookalikes that substitute Unicode characters resembling Latin letters (e.g. a Cyrillic 'а' for an ASCII 'a') and are registered in their punycode (xn--) form. These are the hardest lookalikes for a human to spot in an address bar.</w:t>
+        <w:t>The scanner generates lookalike domain permutations and checks which ones are registered and actively resolving via DNS. These lookalike domains can be used for phishing attacks targeting the organisation's employees, clients, and partners. The scanner employs several generation techniques: character omission, adjacent character swap, character duplication, ASCII homoglyph substitution (visually similar characters like 'o' and '0', 'l' and '1'), adjacent-keyboard typos (fat-finger errors), TLD variants (e.g., .com to .net, .co, .io, .co.za), dot insertion, and hyphen insertion. It also generates a bounded set of IDN / homoglyph candidates, internationalised-domain lookalikes that substitute Unicode characters resembling Latin letters (e.g. a Cyrillic 'а' for an ASCII 'a') and are registered in their punycode (xn--) form. These are the hardest lookalikes for a human to spot in an address bar.</w:t>
       </w:r>
     </w:p>
     <w:p>
@@ -7201,7 +7201,7 @@
         <w:t xml:space="preserve">How it works: </w:t>
       </w:r>
       <w:r>
-        <w:t>First, the domain is split into its name and TLD components (handling multi-part TLDs like .co.za). The permutation engine generates all variants using the techniques above. For ASCII homoglyph substitution, the scanner uses a mapping of visually similar characters (a/4/@, b/d/6, e/3, i/1/l/!, o/0, s/5/$, etc.). IDN / homoglyph candidates are built by swapping a Latin letter for a confusable Unicode character and encoding the result to its punycode (xn--) label, which is what actually appears in DNS; this set is deliberately bounded to keep the permutation space manageable. For keyboard typos, it uses an adjacency map of QWERTY keyboard neighbours. TLD variants are checked across 17 common TLDs including .com, .net, .org, .co, .dev, .online, .io, .info, .co.za, and .africa. Each generated permutation is checked via DNS resolution — if it resolves, the domain is registered and active. Resolved domains are further checked for SSL certificates, which indicate the lookalike is actively being used (possibly for phishing with a convincing HTTPS connection). Each permutation includes a visual similarity percentage.</w:t>
+        <w:t>First, the domain is split into its name and TLD components (handling multi-part TLDs like .co.za). The permutation engine generates all variants using the techniques above. For ASCII homoglyph substitution, the scanner uses a mapping of visually similar characters (a/4/@, b/d/6, e/3, i/1/l/!, o/0, s/5/$, etc.). IDN / homoglyph candidates are built by swapping a Latin letter for a confusable Unicode character and encoding the result to its punycode (xn--) label, which is what actually appears in DNS; this set is deliberately bounded to keep the permutation space manageable. For keyboard typos, it uses an adjacency map of QWERTY keyboard neighbours. TLD variants are checked across 17 common TLDs including .com, .net, .org, .co, .dev, .online, .io, .info, .co.za, and .africa. Each generated permutation is checked via DNS resolution, if it resolves, the domain is registered and active. Resolved domains are further checked for SSL certificates, which indicate the lookalike is actively being used (possibly for phishing with a convincing HTTPS connection). Each permutation includes a visual similarity percentage.</w:t>
       </w:r>
     </w:p>
     <w:p>
@@ -7260,17 +7260,17 @@
         <w:spacing w:after="40"/>
       </w:pPr>
       <w:r>
-        <w:t>3 of 7 lookalike domains have active SSL certificates — these are the highest-risk variants as they can serve convincing HTTPS phishing pages.</w:t>
-      </w:r>
-    </w:p>
-    <w:p>
-      <w:pPr>
-        <w:pStyle w:val="ListParagraph"/>
-        <w:widowControl/>
-        <w:spacing w:after="40"/>
-      </w:pPr>
-      <w:r>
-        <w:t>No lookalike domains resolving — this is uncommon for popular domains but indicates low typosquatting risk.</w:t>
+        <w:t>3 of 7 lookalike domains have active SSL certificates, these are the highest-risk variants as they can serve convincing HTTPS phishing pages.</w:t>
+      </w:r>
+    </w:p>
+    <w:p>
+      <w:pPr>
+        <w:pStyle w:val="ListParagraph"/>
+        <w:widowControl/>
+        <w:spacing w:after="40"/>
+      </w:pPr>
+      <w:r>
+        <w:t>No lookalike domains resolving, this is uncommon for popular domains but indicates low typosquatting risk.</w:t>
       </w:r>
     </w:p>
     <w:p>
@@ -7303,7 +7303,7 @@
         <w:t xml:space="preserve">NOTE: </w:t>
       </w:r>
       <w:r>
-        <w:t>Not every resolved lookalike domain is malicious — some may be legitimately owned by other businesses or parked by domain speculators. The scanner flags them as potential risks for investigation, not confirmed threats.</w:t>
+        <w:t>Not every resolved lookalike domain is malicious, some may be legitimately owned by other businesses or parked by domain speculators. The scanner flags them as potential risks for investigation, not confirmed threats.</w:t>
       </w:r>
     </w:p>
     <w:p>
@@ -7319,7 +7319,7 @@
         <w:t xml:space="preserve">WARNING: </w:t>
       </w:r>
       <w:r>
-        <w:t>Lookalike domains with SSL certificates that were recently issued (within the last 30 days) are the most suspicious — they suggest someone is actively setting up infrastructure for an attack.</w:t>
+        <w:t>Lookalike domains with SSL certificates that were recently issued (within the last 30 days) are the most suspicious, they suggest someone is actively setting up infrastructure for an attack.</w:t>
       </w:r>
     </w:p>
     <w:p>
@@ -7387,7 +7387,7 @@
         <w:t xml:space="preserve">Why it matters for insurance: </w:t>
       </w:r>
       <w:r>
-        <w:t>Under aggregator-liability theory a breach at a declared supplier can be imputed back to the insured. The Lloyd's Talbot mrcourier case is the canonical precedent — Talbot's insured was held liable for downstream losses originating at an undeclared supplier. Surfacing declared siblings during underwriting lets the broker price the civil-liability channel explicitly and prevents the 'undeclared supplier' blind spot that has empirically driven multi-percentile claim jumps.</w:t>
+        <w:t>Under aggregator-liability theory a breach at a declared supplier can be imputed back to the insured. The Lloyd's Talbot mrcourier case is the canonical precedent: Talbot's insured was held liable for downstream losses originating at an undeclared supplier. Surfacing declared siblings during underwriting lets the broker price the civil-liability channel explicitly and prevents the 'undeclared supplier' blind spot that has empirically driven multi-percentile claim jumps.</w:t>
       </w:r>
     </w:p>
     <w:p>
@@ -7418,7 +7418,7 @@
         <w:t xml:space="preserve">NOTE: </w:t>
       </w:r>
       <w:r>
-        <w:t>v1.0 is broker-declared only. v1.1 (deferred) adds auto-discovery via cert SAN, WHOIS registrant match, and analytics-ID correlation — the broker confirms auto-detected siblings via the same pre-flight UI used for regulatory flags.</w:t>
+        <w:t>v1.0 is broker-declared only. v1.1 (deferred) adds auto-discovery via cert SAN, WHOIS registrant match, and analytics-ID correlation, the broker confirms auto-detected siblings via the same pre-flight UI used for regulatory flags.</w:t>
       </w:r>
     </w:p>
     <w:p>
@@ -7477,7 +7477,7 @@
         <w:t xml:space="preserve">Why it matters for insurance: </w:t>
       </w:r>
       <w:r>
-        <w:t>Exposed lockfiles eliminate the reconnaissance step from a ransomware-via-vulnerable-dependency attack. The attacker downloads package-lock.json, feeds it to OSV.dev, and receives a working list of CVEs with public exploits — no scanning, no fingerprinting required. Patchstack 2024 data shows 11.6% of WordPress plugin CVEs are actively exploited; the same pattern applies to npm/Composer/PyPI.</w:t>
+        <w:t>Exposed lockfiles eliminate the reconnaissance step from a ransomware-via-vulnerable-dependency attack. The attacker downloads package-lock.json, feeds it to OSV.dev, and receives a working list of CVEs with public exploits, no scanning, no fingerprinting required. Patchstack 2024 data shows 11.6% of WordPress plugin CVEs are actively exploited; the same pattern applies to npm/Composer/PyPI.</w:t>
       </w:r>
     </w:p>
     <w:p>
@@ -7551,7 +7551,7 @@
         <w:t xml:space="preserve">Why it matters for insurance: </w:t>
       </w:r>
       <w:r>
-        <w:t>Every external script runs with the same privileges as the insured's own code — it can read forms, intercept payment fields, and exfiltrate data. SRI hashes pin each script to a known good version, so an upstream CDN hijack (Magecart 2018, polyfill.io 2024) cannot silently replace the script. Polyfill.io alone compromised 100,000+ sites including Hulu, Mercedes-Benz, WarnerBros, and JSTOR. This is the single biggest predictor of card-skimming and form-skimming breaches.</w:t>
+        <w:t>Every external script runs with the same privileges as the insured's own code, it can read forms, intercept payment fields, and exfiltrate data. SRI hashes pin each script to a known good version, so an upstream CDN hijack (Magecart 2018, polyfill.io 2024) cannot silently replace the script. Polyfill.io alone compromised 100,000+ sites including Hulu, Mercedes-Benz, WarnerBros, and JSTOR. This is the single biggest predictor of card-skimming and form-skimming breaches.</w:t>
       </w:r>
     </w:p>
     <w:p>
@@ -7610,7 +7610,7 @@
         <w:t xml:space="preserve">Why it matters for insurance: </w:t>
       </w:r>
       <w:r>
-        <w:t>Every vendor in the SPF chain is implicitly authorised to send mail as the insured. A compromise at any single vendor (Mailchimp 2022/2023, Constant Contact 2021, Microsoft Storm-0558 2023) becomes a phishing path directly into the insured's customer base. The risk is dramatically larger when DMARC policy is 'none' or absent — CISA BOD 18-01 cohort data shows DMARC p=reject reduces phishing inbox success from 69% to 14% (~80% relative reduction).</w:t>
+        <w:t>Every vendor in the SPF chain is implicitly authorised to send mail as the insured. A compromise at any single vendor (Mailchimp 2022/2023, Constant Contact 2021, Microsoft Storm-0558 2023) becomes a phishing path directly into the insured's customer base. The risk is dramatically larger when DMARC policy is 'none' or absent: CISA BOD 18-01 cohort data shows DMARC p=reject reduces phishing inbox success from 69% to 14% (~80% relative reduction).</w:t>
       </w:r>
     </w:p>
     <w:p>
@@ -7641,7 +7641,7 @@
         <w:t xml:space="preserve">NOTE: </w:t>
       </w:r>
       <w:r>
-        <w:t>A vendor of 'unknown' (not on the classification list) is still counted but separately flagged — broker should review whether the unknown include is legitimate or a stale configuration artefact.</w:t>
+        <w:t>A vendor of 'unknown' (not on the classification list) is still counted but separately flagged, broker should review whether the unknown include is legitimate or a stale configuration artefact.</w:t>
       </w:r>
     </w:p>
     <w:p>
@@ -7655,7 +7655,7 @@
           <w:color w:val="003366"/>
           <w:sz w:val="26"/>
         </w:rPr>
-        <w:t>4.6.16  CMS Plugin Surface — WordPress (S-10)</w:t>
+        <w:t>4.6.16  CMS Plugin Surface: WordPress (S-10)</w:t>
       </w:r>
     </w:p>
     <w:p>
@@ -7685,7 +7685,7 @@
         <w:t xml:space="preserve">Why it matters for insurance: </w:t>
       </w:r>
       <w:r>
-        <w:t>Patchstack 2024 reported 7,633 WordPress vulnerabilities, 96% of which were in plugins; 11.6% are actively exploited in the wild. For SA SMEs this is the dominant external ransomware entry vector per the Sophos State of Ransomware SA 2024 report (69% of SA orgs hit, malicious email + exploitation as top root causes). Readable version strings are directly CVE-chainable — the attacker reads the version from readme.txt and goes straight to the CVE database.</w:t>
+        <w:t>Patchstack 2024 reported 7,633 WordPress vulnerabilities, 96% of which were in plugins; 11.6% are actively exploited in the wild. For SA SMEs this is the dominant external ransomware entry vector per the Sophos State of Ransomware SA 2024 report (69% of SA orgs hit, malicious email + exploitation as top root causes). Readable version strings are directly CVE-chainable, the attacker reads the version from readme.txt and goes straight to the CVE database.</w:t>
       </w:r>
     </w:p>
     <w:p>
@@ -7744,7 +7744,7 @@
         <w:t xml:space="preserve">How it works: </w:t>
       </w:r>
       <w:r>
-        <w:t>The database is loaded once per process and indexed by vendor key. Each match has a date, severity (critical/high/medium/low), and exposure_class (e.g. session_tokens, customer_email_lists, mailbox_content). Each match's penalty decays linearly with age over a 5-year lookback window — full SEVERITY_PENALTY at age=0, zero at LOOKBACK_DAYS. Five years is empirically supported because customer-key rotation post-disclosure is typically incomplete years after the incident (Ponemon Third-Party Risk 2023).</w:t>
+        <w:t>The database is loaded once per process and indexed by vendor key. Each match has a date, severity (critical/high/medium/low), and exposure_class (e.g. session_tokens, customer_email_lists, mailbox_content). Each match's penalty decays linearly with age over a 5-year lookback window, full SEVERITY_PENALTY at age=0, zero at LOOKBACK_DAYS. Five years is empirically supported because customer-key rotation post-disclosure is typically incomplete years after the incident (Ponemon Third-Party Risk 2023).</w:t>
       </w:r>
     </w:p>
     <w:p>
@@ -7759,7 +7759,7 @@
         <w:t xml:space="preserve">Why it matters for insurance: </w:t>
       </w:r>
       <w:r>
-        <w:t>This is the strongest broker-narrative signal in the supply-chain layer: 'your supplier was breached N months ago — have credentials been rotated?'. Case anchors include MOVEit Cl0p 2023 (2,700+ orgs / USD 12-15B aggregate economic impact via ONE vendor breach), Polyfill.io 2024 (100,000+ sites compromised), Storm-0558 (25 orgs incl. US State Department via ONE forged Microsoft key), and the Mailchimp 0ktapus cluster 2022-2023 (668 customer accounts across 3 incidents → downstream phishing at Trezor, DigitalOcean, WooCommerce).</w:t>
+        <w:t>This is the strongest broker-narrative signal in the supply-chain layer: 'your supplier was breached N months ago, have credentials been rotated?'. Case anchors include MOVEit Cl0p 2023 (2,700+ orgs / USD 12-15B aggregate economic impact via ONE vendor breach), Polyfill.io 2024 (100,000+ sites compromised), Storm-0558 (25 orgs incl. US State Department via ONE forged Microsoft key), and the Mailchimp 0ktapus cluster 2022-2023 (668 customer accounts across 3 incidents → downstream phishing at Trezor, DigitalOcean, WooCommerce).</w:t>
       </w:r>
     </w:p>
     <w:p>
@@ -7774,7 +7774,7 @@
         <w:t xml:space="preserve">Scoring: </w:t>
       </w:r>
       <w:r>
-        <w:t>Penalty per match = SEVERITY_PENALTY (critical=25, high=15, medium=8, low=3) × linear age decay. Contributes up to +0.04 to the vulnerability uplift in the financial model. The catastrophe-tail percentiles (P75-P99.6) move naturally through the Monte Carlo as the vulnerability uplift shifts the entire distribution rightward — no separate tail-widening is applied on top (an earlier iteration did exactly that and was removed during the 2026-05-27 design review to avoid double-counting the same signal).</w:t>
+        <w:t>Penalty per match = SEVERITY_PENALTY (critical=25, high=15, medium=8, low=3) × linear age decay. Contributes up to +0.04 to the vulnerability uplift in the financial model. The catastrophe-tail percentiles (P75-P99.6) move naturally through the Monte Carlo as the vulnerability uplift shifts the entire distribution rightward, no separate tail-widening is applied on top (an earlier iteration did exactly that and was removed during the 2026-05-27 design review to avoid double-counting the same signal).</w:t>
       </w:r>
     </w:p>
     <w:p>
@@ -7790,7 +7790,7 @@
         <w:t xml:space="preserve">WARNING: </w:t>
       </w:r>
       <w:r>
-        <w:t>Editorial discipline: vendor_breaches.json follows the same rules as darkweb_providers.py — only CONFIRMED public-record incidents are added, each with a citable source field. The broker can defend each row in a FAIS audit.</w:t>
+        <w:t>Editorial discipline: vendor_breaches.json follows the same rules as darkweb_providers.py, only CONFIRMED public-record incidents are added, each with a citable source field. The broker can defend each row in a FAIS audit.</w:t>
       </w:r>
     </w:p>
     <w:p>
@@ -7835,7 +7835,7 @@
         <w:t xml:space="preserve">What it checks: </w:t>
       </w:r>
       <w:r>
-        <w:t>A reporting-only cross-correlation that joins four independent credential signals already gathered elsewhere in the scan into a single rotate-now verdict: (1) the breached-credential corpus from Dehashed (4.6.6); (2) the recency of that exposure, dated from IntelX, HIBP-enriched breach dates, and — most reliably — the infostealer infection date; (3) active theft from Hudson Rock infostealer infections (4.6.7); and (4) active circulation / trading from IntelX leak, paste, and dark-web mentions (4.6.8). It is the credential analogue of the Third-Party Cross-Correlation card (4.6.19) and follows the same design pattern.</w:t>
+        <w:t>A reporting-only cross-correlation that joins four independent credential signals already gathered elsewhere in the scan into a single rotate-now verdict: (1) the breached-credential corpus from Dehashed (4.6.6); (2) the recency of that exposure, dated from IntelX, HIBP-enriched breach dates, and, most reliably, the infostealer infection date; (3) active theft from Hudson Rock infostealer infections (4.6.7); and (4) active circulation / trading from IntelX leak, paste, and dark-web mentions (4.6.8). It is the credential analogue of the Third-Party Cross-Correlation card (4.6.19) and follows the same design pattern.</w:t>
       </w:r>
     </w:p>
     <w:p>
@@ -7862,10 +7862,10 @@
         <w:rPr>
           <w:b/>
         </w:rPr>
-        <w:t xml:space="preserve">Active vs re-circulated — the date-anchor discipline: </w:t>
-      </w:r>
-      <w:r>
-        <w:t>Aggregator / combo-list sources (e.g. ALIEN TXTBASE) are flagged as re-packaged historical data: a recent OBSERVED date on a combo list is re-circulation, not fresh theft, and on its own does not qualify as 'genuinely recent'. Only the infostealer infection date — a point-in-time malware capture — is treated as a reliable freshness anchor. This prevents a recycled compilation from inflating the verdict to CRITICAL.</w:t>
+        <w:t xml:space="preserve">Active vs re-circulated, the date-anchor discipline: </w:t>
+      </w:r>
+      <w:r>
+        <w:t>Aggregator / combo-list sources (e.g. ALIEN TXTBASE) are flagged as re-packaged historical data: a recent OBSERVED date on a combo list is re-circulation, not fresh theft, and on its own does not qualify as 'genuinely recent'. Only the infostealer infection date, a point-in-time malware capture, is treated as a reliable freshness anchor. This prevents a recycled compilation from inflating the verdict to CRITICAL.</w:t>
       </w:r>
     </w:p>
     <w:p>
@@ -7880,7 +7880,7 @@
         <w:t xml:space="preserve">Password-bearing records are counted, not assumed: </w:t>
       </w:r>
       <w:r>
-        <w:t>The card reports the breached-record total AND, separately, how many of those records actually carry a password — e.g. '13 leaked credential records (2 with passwords)'. Only the plaintext- and hashed-password subset (from Dehashed's credential breakdown) is counted as 'with passwords'; the remaining records are breach-exposure rows (email appeared in a breach) with no credential attached. This distinction is deliberate: tagging the full corpus as 'with passwords' would overstate the rotate-now severity that underwriters act on.</w:t>
+        <w:t>The card reports the breached-record total AND, separately, how many of those records actually carry a password, e.g. '13 leaked credential records (2 with passwords)'. Only the plaintext- and hashed-password subset (from Dehashed's credential breakdown) is counted as 'with passwords'; the remaining records are breach-exposure rows (email appeared in a breach) with no credential attached. This distinction is deliberate: tagging the full corpus as 'with passwords' would overstate the rotate-now severity that underwriters act on.</w:t>
       </w:r>
     </w:p>
     <w:p>
@@ -7895,7 +7895,7 @@
         <w:t xml:space="preserve">Why it matters for insurance: </w:t>
       </w:r>
       <w:r>
-        <w:t>This card answers the single question an underwriter cares about for credentials — 'is someone able to log in right now?' — by separating live, date-proven exposure from old or recycled data. A HIGH or CRITICAL verdict justifies a forced-reset + MFA remediation condition before binding; a MEDIUM/LOW verdict on aged-only exposure provides assurance that the credential risk is largely historical.</w:t>
+        <w:t>This card answers the single question an underwriter cares about for credentials, 'is someone able to log in right now?', by separating live, date-proven exposure from old or recycled data. A HIGH or CRITICAL verdict justifies a forced-reset + MFA remediation condition before binding; a MEDIUM/LOW verdict on aged-only exposure provides assurance that the credential risk is largely historical.</w:t>
       </w:r>
     </w:p>
     <w:p>
@@ -7985,7 +7985,7 @@
         <w:t xml:space="preserve">Scoring: </w:t>
       </w:r>
       <w:r>
-        <w:t>REPORTING-ONLY. The cross-correlation deliberately does NOT carry its own scoring weight, RSI factor, or financial-impact uplift. The underlying signals it joins — Hudson Rock infostealer harvest (via credential_risk), S-4 SPF vendor surface, S-5 known-breach matches — each already contribute to RSI and financial impact through their own channels. Adding a separate weight here would double-count the same data without empirical justification (no public evidence that the correlation itself increases breach cost beyond what each signal individually drives). The correlation's value is QUALITATIVE: tell the broker which specific vendors to rotate at, with confidence backed by three independent sources. Credential rotation is cheap (R0–R3,600 per vendor) — the value is in the specificity of the rotate-list, not in a phantom RSI reduction.</w:t>
+        <w:t>REPORTING-ONLY. The cross-correlation deliberately does NOT carry its own scoring weight, RSI factor, or financial-impact uplift. The underlying signals it joins, Hudson Rock infostealer harvest (via credential_risk), S-4 SPF vendor surface, S-5 known-breach matches, each already contribute to RSI and financial impact through their own channels. Adding a separate weight here would double-count the same data without empirical justification (no public evidence that the correlation itself increases breach cost beyond what each signal individually drives). The correlation's value is QUALITATIVE: tell the broker which specific vendors to rotate at, with confidence backed by three independent sources. Credential rotation is cheap (R0–R3,600 per vendor), the value is in the specificity of the rotate-list, not in a phantom RSI reduction.</w:t>
       </w:r>
     </w:p>
     <w:p>
@@ -8001,7 +8001,7 @@
         <w:t xml:space="preserve">NOTE: </w:t>
       </w:r>
       <w:r>
-        <w:t>Surface coverage: this finding is explicitly rendered in ALL six broker-facing surfaces — HTML cat-card (Exposure &amp; Reputation), top recommendations block (auto via RECOMMENDATIONS), PDF body cat_third_party_correlation, PDF Broker Summary spotlight row, PDF Executive Deck Slide 4 Supply-Chain Exposure (7th card), Executive Deck Slide 7 Next Steps (promoted to Step 1 when critical). The verification harness asserts the signal appears in all rendered outputs.</w:t>
+        <w:t>Surface coverage: this finding is explicitly rendered in ALL six broker-facing surfaces: HTML cat-card (Exposure &amp; Reputation), top recommendations block (auto via RECOMMENDATIONS), PDF body cat_third_party_correlation, PDF Broker Summary spotlight row, PDF Executive Deck Slide 4 Supply-Chain Exposure (7th card), Executive Deck Slide 7 Next Steps (promoted to Step 1 when critical). The verification harness asserts the signal appears in all rendered outputs.</w:t>
       </w:r>
     </w:p>
     <w:p>
@@ -8017,7 +8017,7 @@
         <w:t xml:space="preserve">WARNING: </w:t>
       </w:r>
       <w:r>
-        <w:t>Soft-correlation caveat: the free Hudson Rock endpoint returns aggregate counts only, not per-vendor names. The 'suspected vendors' list is therefore the intersection of S-4 detected vendors and S-5 breach database — it identifies the highest-probability candidates, NOT a confirmed mapping. Brokers should treat the rotate-list as priority targets, not as definitive attribution. A v1.2 enhancement to fetch per-vendor data from a richer Hudson Rock endpoint would tighten the attribution.</w:t>
+        <w:t>Soft-correlation caveat: the free Hudson Rock endpoint returns aggregate counts only, not per-vendor names. The 'suspected vendors' list is therefore the intersection of S-4 detected vendors and S-5 breach database, it identifies the highest-probability candidates, NOT a confirmed mapping. Brokers should treat the rotate-list as priority targets, not as definitive attribution. A v1.2 enhancement to fetch per-vendor data from a richer Hudson Rock endpoint would tighten the attribution.</w:t>
       </w:r>
     </w:p>
     <w:p>
@@ -8031,16 +8031,16 @@
           <w:color w:val="003366"/>
           <w:sz w:val="26"/>
         </w:rPr>
-        <w:t>4.6.20  Section Summary — Interpreting Exposure Results</w:t>
-      </w:r>
-    </w:p>
-    <w:p>
-      <w:pPr>
-        <w:widowControl/>
-        <w:spacing w:after="80"/>
-      </w:pPr>
-      <w:r>
-        <w:t>The seventeen checkers in this section work together to provide a 360-degree view of a domain's exposure and reputation profile — including the six supply-chain signals (4.6.12-17) that close the historical gap between observed posture and supplier-chain risk. When interpreting results, consider the following priority framework:</w:t>
+        <w:t>4.6.20  Section Summary: Interpreting Exposure Results</w:t>
+      </w:r>
+    </w:p>
+    <w:p>
+      <w:pPr>
+        <w:widowControl/>
+        <w:spacing w:after="80"/>
+      </w:pPr>
+      <w:r>
+        <w:t>The seventeen checkers in this section work together to provide a 360-degree view of a domain's exposure and reputation profile, including the six supply-chain signals (4.6.12-17) that close the historical gap between observed posture and supplier-chain risk. When interpreting results, consider the following priority framework:</w:t>
       </w:r>
     </w:p>
     <w:p>
@@ -8177,7 +8177,7 @@
         <w:spacing w:after="80"/>
       </w:pPr>
       <w:r>
-        <w:t>The scanner maintains a curated end-of-life (EOL) software signature table — refreshed against endoflife.date — that is checked against every detected component. It spans the server-side and runtime stacks most commonly exposed in response headers: PHP, Node.js, Python, OpenSSL, Apache httpd, nginx, Microsoft IIS, Apache Tomcat/Coyote, and ASP.NET. Only branches that are genuinely past their vendor security-EOL date are listed (for example PHP 8.0 and below, OpenSSL 1.1.1 and below, or nginx 1.18 and below); still-supported branches are intentionally absent so they are not flagged.</w:t>
+        <w:t>The scanner maintains a curated end-of-life (EOL) software signature table, refreshed against endoflife.date, that is checked against every detected component. It spans the server-side and runtime stacks most commonly exposed in response headers: PHP, Node.js, Python, OpenSSL, Apache httpd, nginx, Microsoft IIS, Apache Tomcat/Coyote, and ASP.NET. Only branches that are genuinely past their vendor security-EOL date are listed (for example PHP 8.0 and below, OpenSSL 1.1.1 and below, or nginx 1.18 and below); still-supported branches are intentionally absent so they are not flagged.</w:t>
       </w:r>
     </w:p>
     <w:p>
@@ -8202,7 +8202,7 @@
         <w:t xml:space="preserve">WARNING: </w:t>
       </w:r>
       <w:r>
-        <w:t>End-of-life software is permanently unpatched. Unlike a missing patch on supported software, there is no fix coming — the vendor has stopped releasing security updates. Attackers specifically target EOL software because exploitation is guaranteed to succeed indefinitely. A single EOL component can undermine every other security control.</w:t>
+        <w:t>End-of-life software is permanently unpatched. Unlike a missing patch on supported software, there is no fix coming, the vendor has stopped releasing security updates. Attackers specifically target EOL software because exploitation is guaranteed to succeed indefinitely. A single EOL component can undermine every other security control.</w:t>
       </w:r>
     </w:p>
     <w:p>
@@ -8272,7 +8272,7 @@
         <w:spacing w:after="80"/>
       </w:pPr>
       <w:r>
-        <w:t>The WHOIS checker queries domain registration data to extract the registrar, creation date, expiry date, domain age, and whether WHOIS privacy protection is enabled. This information serves as a business maturity proxy — older domains generally belong to more established organisations, while very young domains are statistically more likely to be associated with fraud, phishing, or recently created shell companies.</w:t>
+        <w:t>The WHOIS checker queries domain registration data to extract the registrar, creation date, expiry date, domain age, and whether WHOIS privacy protection is enabled. This information serves as a business maturity proxy, older domains generally belong to more established organisations, while very young domains are statistically more likely to be associated with fraud, phishing, or recently created shell companies.</w:t>
       </w:r>
     </w:p>
     <w:p>
@@ -8295,37 +8295,37 @@
         <w:spacing w:after="40"/>
       </w:pPr>
       <w:r>
-        <w:t>Domain age under 1 year — flagged as a risk factor. New domains lack reputation history and are disproportionately used in scam operations.</w:t>
-      </w:r>
-    </w:p>
-    <w:p>
-      <w:pPr>
-        <w:pStyle w:val="ListParagraph"/>
-        <w:widowControl/>
-        <w:spacing w:after="40"/>
-      </w:pPr>
-      <w:r>
-        <w:t>Domain age over 5 years — positive trust signal. Long-standing domains indicate business continuity and established operations.</w:t>
-      </w:r>
-    </w:p>
-    <w:p>
-      <w:pPr>
-        <w:pStyle w:val="ListParagraph"/>
-        <w:widowControl/>
-        <w:spacing w:after="40"/>
-      </w:pPr>
-      <w:r>
-        <w:t>Domain expiry within 90 days — warning flag. A domain that is about to expire may indicate neglected infrastructure or a business in decline.</w:t>
-      </w:r>
-    </w:p>
-    <w:p>
-      <w:pPr>
-        <w:pStyle w:val="ListParagraph"/>
-        <w:widowControl/>
-        <w:spacing w:after="40"/>
-      </w:pPr>
-      <w:r>
-        <w:t>WHOIS privacy enabled — neutral for most organisations. However, for businesses that are legally required to publish contact details (e.g. financial services providers), hidden WHOIS data may raise regulatory questions.</w:t>
+        <w:t>Domain age under 1 year, flagged as a risk factor. New domains lack reputation history and are disproportionately used in scam operations.</w:t>
+      </w:r>
+    </w:p>
+    <w:p>
+      <w:pPr>
+        <w:pStyle w:val="ListParagraph"/>
+        <w:widowControl/>
+        <w:spacing w:after="40"/>
+      </w:pPr>
+      <w:r>
+        <w:t>Domain age over 5 years, positive trust signal. Long-standing domains indicate business continuity and established operations.</w:t>
+      </w:r>
+    </w:p>
+    <w:p>
+      <w:pPr>
+        <w:pStyle w:val="ListParagraph"/>
+        <w:widowControl/>
+        <w:spacing w:after="40"/>
+      </w:pPr>
+      <w:r>
+        <w:t>Domain expiry within 90 days, warning flag. A domain that is about to expire may indicate neglected infrastructure or a business in decline.</w:t>
+      </w:r>
+    </w:p>
+    <w:p>
+      <w:pPr>
+        <w:pStyle w:val="ListParagraph"/>
+        <w:widowControl/>
+        <w:spacing w:after="40"/>
+      </w:pPr>
+      <w:r>
+        <w:t>WHOIS privacy enabled, neutral for most organisations. However, for businesses that are legally required to publish contact details (e.g. financial services providers), hidden WHOIS data may raise regulatory questions.</w:t>
       </w:r>
     </w:p>
     <w:p>
@@ -8341,7 +8341,7 @@
         <w:t xml:space="preserve">NOTE: </w:t>
       </w:r>
       <w:r>
-        <w:t>Domain age is one input into the overall risk model. A young domain does not automatically mean the organisation is untrustworthy — it simply increases the weight given to other risk indicators.</w:t>
+        <w:t>Domain age is one input into the overall risk model. A young domain does not automatically mean the organisation is untrustworthy, it simply increases the weight given to other risk indicators.</w:t>
       </w:r>
     </w:p>
     <w:p>
@@ -8387,37 +8387,37 @@
         <w:spacing w:after="40"/>
       </w:pPr>
       <w:r>
-        <w:t>Associated domains — other domains that share the same IP address, name server, or MX record. A high associated domain count (50+) indicates shared hosting, which means the domain shares an IP with many unrelated websites. Shared hosting increases risk because a compromise on any co-hosted site can affect neighbours.</w:t>
-      </w:r>
-    </w:p>
-    <w:p>
-      <w:pPr>
-        <w:pStyle w:val="ListParagraph"/>
-        <w:widowControl/>
-        <w:spacing w:after="40"/>
-      </w:pPr>
-      <w:r>
-        <w:t>Historical DNS changes — frequent changes to A records or NS records may indicate infrastructure instability or a recent migration.</w:t>
-      </w:r>
-    </w:p>
-    <w:p>
-      <w:pPr>
-        <w:pStyle w:val="ListParagraph"/>
-        <w:widowControl/>
-        <w:spacing w:after="40"/>
-      </w:pPr>
-      <w:r>
-        <w:t>MX record analysis — identifies the email provider (Google Workspace, Microsoft 365, self-hosted). Self-hosted mail servers require more operational security than managed providers.</w:t>
-      </w:r>
-    </w:p>
-    <w:p>
-      <w:pPr>
-        <w:pStyle w:val="ListParagraph"/>
-        <w:widowControl/>
-        <w:spacing w:after="40"/>
-      </w:pPr>
-      <w:r>
-        <w:t>NS record analysis — identifies DNS hosting provider. Single NS provider without redundancy is a resilience concern.</w:t>
+        <w:t>Associated domains, other domains that share the same IP address, name server, or MX record. A high associated domain count (50+) indicates shared hosting, which means the domain shares an IP with many unrelated websites. Shared hosting increases risk because a compromise on any co-hosted site can affect neighbours.</w:t>
+      </w:r>
+    </w:p>
+    <w:p>
+      <w:pPr>
+        <w:pStyle w:val="ListParagraph"/>
+        <w:widowControl/>
+        <w:spacing w:after="40"/>
+      </w:pPr>
+      <w:r>
+        <w:t>Historical DNS changes, frequent changes to A records or NS records may indicate infrastructure instability or a recent migration.</w:t>
+      </w:r>
+    </w:p>
+    <w:p>
+      <w:pPr>
+        <w:pStyle w:val="ListParagraph"/>
+        <w:widowControl/>
+        <w:spacing w:after="40"/>
+      </w:pPr>
+      <w:r>
+        <w:t>MX record analysis, identifies the email provider (Google Workspace, Microsoft 365, self-hosted). Self-hosted mail servers require more operational security than managed providers.</w:t>
+      </w:r>
+    </w:p>
+    <w:p>
+      <w:pPr>
+        <w:pStyle w:val="ListParagraph"/>
+        <w:widowControl/>
+        <w:spacing w:after="40"/>
+      </w:pPr>
+      <w:r>
+        <w:t>NS record analysis, identifies DNS hosting provider. Single NS provider without redundancy is a resilience concern.</w:t>
       </w:r>
     </w:p>
     <w:p>
@@ -8496,47 +8496,47 @@
         <w:spacing w:after="40"/>
       </w:pPr>
       <w:r>
-        <w:t>Data collection — Does the policy describe what personal information is collected and the lawful basis for processing?</w:t>
-      </w:r>
-    </w:p>
-    <w:p>
-      <w:pPr>
-        <w:pStyle w:val="ListParagraph"/>
-        <w:widowControl/>
-        <w:spacing w:after="40"/>
-      </w:pPr>
-      <w:r>
-        <w:t>Data retention — Does the policy state how long data is kept and the criteria used to determine retention periods?</w:t>
-      </w:r>
-    </w:p>
-    <w:p>
-      <w:pPr>
-        <w:pStyle w:val="ListParagraph"/>
-        <w:widowControl/>
-        <w:spacing w:after="40"/>
-      </w:pPr>
-      <w:r>
-        <w:t>Data subject rights — Does the policy inform individuals of their rights to access, correct, and delete their personal information?</w:t>
-      </w:r>
-    </w:p>
-    <w:p>
-      <w:pPr>
-        <w:pStyle w:val="ListParagraph"/>
-        <w:widowControl/>
-        <w:spacing w:after="40"/>
-      </w:pPr>
-      <w:r>
-        <w:t>Information officer — Does the policy name or reference an information officer or data protection officer, as required by POPIA Section 55?</w:t>
-      </w:r>
-    </w:p>
-    <w:p>
-      <w:pPr>
-        <w:pStyle w:val="ListParagraph"/>
-        <w:widowControl/>
-        <w:spacing w:after="40"/>
-      </w:pPr>
-      <w:r>
-        <w:t>Cross-border transfers — Does the policy address whether personal information is transferred outside South Africa, and the safeguards applied?</w:t>
+        <w:t>Data collection: Does the policy describe what personal information is collected and the lawful basis for processing?</w:t>
+      </w:r>
+    </w:p>
+    <w:p>
+      <w:pPr>
+        <w:pStyle w:val="ListParagraph"/>
+        <w:widowControl/>
+        <w:spacing w:after="40"/>
+      </w:pPr>
+      <w:r>
+        <w:t>Data retention: Does the policy state how long data is kept and the criteria used to determine retention periods?</w:t>
+      </w:r>
+    </w:p>
+    <w:p>
+      <w:pPr>
+        <w:pStyle w:val="ListParagraph"/>
+        <w:widowControl/>
+        <w:spacing w:after="40"/>
+      </w:pPr>
+      <w:r>
+        <w:t>Data subject rights: Does the policy inform individuals of their rights to access, correct, and delete their personal information?</w:t>
+      </w:r>
+    </w:p>
+    <w:p>
+      <w:pPr>
+        <w:pStyle w:val="ListParagraph"/>
+        <w:widowControl/>
+        <w:spacing w:after="40"/>
+      </w:pPr>
+      <w:r>
+        <w:t>Information officer: Does the policy name or reference an information officer or data protection officer, as required by POPIA Section 55?</w:t>
+      </w:r>
+    </w:p>
+    <w:p>
+      <w:pPr>
+        <w:pStyle w:val="ListParagraph"/>
+        <w:widowControl/>
+        <w:spacing w:after="40"/>
+      </w:pPr>
+      <w:r>
+        <w:t>Cross-border transfers: Does the policy address whether personal information is transferred outside South Africa, and the safeguards applied?</w:t>
       </w:r>
     </w:p>
     <w:p>
@@ -8561,7 +8561,7 @@
         <w:t xml:space="preserve">WARNING: </w:t>
       </w:r>
       <w:r>
-        <w:t>Under POPIA, processing personal information without adequate transparency (including a compliant privacy policy) can result in fines of up to R10 million or imprisonment. This is not a theoretical risk — the South African Information Regulator has begun issuing enforcement notices. A missing or incomplete privacy policy is a compliance gap that should be addressed immediately.</w:t>
+        <w:t>Under POPIA, processing personal information without adequate transparency (including a compliant privacy policy) can result in fines of up to R10 million or imprisonment. This is not a theoretical risk, the South African Information Regulator has begun issuing enforcement notices. A missing or incomplete privacy policy is a compliance gap that should be addressed immediately.</w:t>
       </w:r>
     </w:p>
     <w:p>
@@ -8611,27 +8611,27 @@
         <w:spacing w:after="40"/>
       </w:pPr>
       <w:r>
-        <w:t>security.txt — The scanner checks for a machine-readable security contact file at /.well-known/security.txt, as defined by RFC 9116. This file tells security researchers how to report vulnerabilities responsibly. Its presence indicates the organisation has a Vulnerability Disclosure Policy (VDP), which is a hallmark of mature security practices.</w:t>
-      </w:r>
-    </w:p>
-    <w:p>
-      <w:pPr>
-        <w:pStyle w:val="ListParagraph"/>
-        <w:widowControl/>
-        <w:spacing w:after="40"/>
-      </w:pPr>
-      <w:r>
-        <w:t>PGP key — If security.txt references a PGP encryption key, it shows the organisation can receive encrypted vulnerability reports, adding another layer of operational maturity.</w:t>
-      </w:r>
-    </w:p>
-    <w:p>
-      <w:pPr>
-        <w:pStyle w:val="ListParagraph"/>
-        <w:widowControl/>
-        <w:spacing w:after="40"/>
-      </w:pPr>
-      <w:r>
-        <w:t>robots.txt — While primarily an SEO file, robots.txt can reveal hidden directories or admin paths through its Disallow rules. The scanner checks whether it exists and whether it inadvertently exposes sensitive paths.</w:t>
+        <w:t>security.txt: The scanner checks for a machine-readable security contact file at /.well-known/security.txt, as defined by RFC 9116. This file tells security researchers how to report vulnerabilities responsibly. Its presence indicates the organisation has a Vulnerability Disclosure Policy (VDP), which is a hallmark of mature security practices.</w:t>
+      </w:r>
+    </w:p>
+    <w:p>
+      <w:pPr>
+        <w:pStyle w:val="ListParagraph"/>
+        <w:widowControl/>
+        <w:spacing w:after="40"/>
+      </w:pPr>
+      <w:r>
+        <w:t>PGP key: If security.txt references a PGP encryption key, it shows the organisation can receive encrypted vulnerability reports, adding another layer of operational maturity.</w:t>
+      </w:r>
+    </w:p>
+    <w:p>
+      <w:pPr>
+        <w:pStyle w:val="ListParagraph"/>
+        <w:widowControl/>
+        <w:spacing w:after="40"/>
+      </w:pPr>
+      <w:r>
+        <w:t>robots.txt: While primarily an SEO file, robots.txt can reveal hidden directories or admin paths through its Disallow rules. The scanner checks whether it exists and whether it inadvertently exposes sensitive paths.</w:t>
       </w:r>
     </w:p>
     <w:p>
@@ -8802,97 +8802,97 @@
         <w:spacing w:after="40"/>
       </w:pPr>
       <w:r>
-        <w:t>S19a — Encryption in Transit: TLS configuration and certificate validity (from the SSL checker). POPIA Section 19 requires appropriate technical measures to secure personal information.</w:t>
-      </w:r>
-    </w:p>
-    <w:p>
-      <w:pPr>
-        <w:pStyle w:val="ListParagraph"/>
-        <w:widowControl/>
-        <w:spacing w:after="40"/>
-      </w:pPr>
-      <w:r>
-        <w:t>S19b — Security Headers: HTTP security headers that prevent XSS, clickjacking, and MIME-type attacks.</w:t>
-      </w:r>
-    </w:p>
-    <w:p>
-      <w:pPr>
-        <w:pStyle w:val="ListParagraph"/>
-        <w:widowControl/>
-        <w:spacing w:after="40"/>
-      </w:pPr>
-      <w:r>
-        <w:t>S19c — Web Application Security: Secure website configuration and WAF protection.</w:t>
-      </w:r>
-    </w:p>
-    <w:p>
-      <w:pPr>
-        <w:pStyle w:val="ListParagraph"/>
-        <w:widowControl/>
-        <w:spacing w:after="40"/>
-      </w:pPr>
-      <w:r>
-        <w:t>S19d — Network Access Control: Restriction of remote access services (RDP, VPN) and closure of high-risk network ports.</w:t>
-      </w:r>
-    </w:p>
-    <w:p>
-      <w:pPr>
-        <w:pStyle w:val="ListParagraph"/>
-        <w:widowControl/>
-        <w:spacing w:after="40"/>
-      </w:pPr>
-      <w:r>
-        <w:t>S19e — Email Security: SPF, DMARC, and DKIM configuration to prevent phishing and email impersonation.</w:t>
-      </w:r>
-    </w:p>
-    <w:p>
-      <w:pPr>
-        <w:pStyle w:val="ListParagraph"/>
-        <w:widowControl/>
-        <w:spacing w:after="40"/>
-      </w:pPr>
-      <w:r>
-        <w:t>S20a — Privacy Policy: Published privacy policy covering all POPIA-required sections.</w:t>
-      </w:r>
-    </w:p>
-    <w:p>
-      <w:pPr>
-        <w:pStyle w:val="ListParagraph"/>
-        <w:widowControl/>
-        <w:spacing w:after="40"/>
-      </w:pPr>
-      <w:r>
-        <w:t>S20b — Data Minimisation: No unnecessary exposure of sensitive files or admin interfaces.</w:t>
-      </w:r>
-    </w:p>
-    <w:p>
-      <w:pPr>
-        <w:pStyle w:val="ListParagraph"/>
-        <w:widowControl/>
-        <w:spacing w:after="40"/>
-      </w:pPr>
-      <w:r>
-        <w:t>S21a — Software Currency: All software components actively maintained with no end-of-life versions.</w:t>
-      </w:r>
-    </w:p>
-    <w:p>
-      <w:pPr>
-        <w:pStyle w:val="ListParagraph"/>
-        <w:widowControl/>
-        <w:spacing w:after="40"/>
-      </w:pPr>
-      <w:r>
-        <w:t>S22a — Breach History: Historical data breach exposure and notification readiness.</w:t>
-      </w:r>
-    </w:p>
-    <w:p>
-      <w:pPr>
-        <w:pStyle w:val="ListParagraph"/>
-        <w:widowControl/>
-        <w:spacing w:after="40"/>
-      </w:pPr>
-      <w:r>
-        <w:t>S22b — Credential Exposure: Leaked credentials in public breach databases (Dehashed).</w:t>
+        <w:t>S19a, Encryption in Transit: TLS configuration and certificate validity (from the SSL checker). POPIA Section 19 requires appropriate technical measures to secure personal information.</w:t>
+      </w:r>
+    </w:p>
+    <w:p>
+      <w:pPr>
+        <w:pStyle w:val="ListParagraph"/>
+        <w:widowControl/>
+        <w:spacing w:after="40"/>
+      </w:pPr>
+      <w:r>
+        <w:t>S19b, Security Headers: HTTP security headers that prevent XSS, clickjacking, and MIME-type attacks.</w:t>
+      </w:r>
+    </w:p>
+    <w:p>
+      <w:pPr>
+        <w:pStyle w:val="ListParagraph"/>
+        <w:widowControl/>
+        <w:spacing w:after="40"/>
+      </w:pPr>
+      <w:r>
+        <w:t>S19c, Web Application Security: Secure website configuration and WAF protection.</w:t>
+      </w:r>
+    </w:p>
+    <w:p>
+      <w:pPr>
+        <w:pStyle w:val="ListParagraph"/>
+        <w:widowControl/>
+        <w:spacing w:after="40"/>
+      </w:pPr>
+      <w:r>
+        <w:t>S19d, Network Access Control: Restriction of remote access services (RDP, VPN) and closure of high-risk network ports.</w:t>
+      </w:r>
+    </w:p>
+    <w:p>
+      <w:pPr>
+        <w:pStyle w:val="ListParagraph"/>
+        <w:widowControl/>
+        <w:spacing w:after="40"/>
+      </w:pPr>
+      <w:r>
+        <w:t>S19e, Email Security: SPF, DMARC, and DKIM configuration to prevent phishing and email impersonation.</w:t>
+      </w:r>
+    </w:p>
+    <w:p>
+      <w:pPr>
+        <w:pStyle w:val="ListParagraph"/>
+        <w:widowControl/>
+        <w:spacing w:after="40"/>
+      </w:pPr>
+      <w:r>
+        <w:t>S20a, Privacy Policy: Published privacy policy covering all POPIA-required sections.</w:t>
+      </w:r>
+    </w:p>
+    <w:p>
+      <w:pPr>
+        <w:pStyle w:val="ListParagraph"/>
+        <w:widowControl/>
+        <w:spacing w:after="40"/>
+      </w:pPr>
+      <w:r>
+        <w:t>S20b, Data Minimisation: No unnecessary exposure of sensitive files or admin interfaces.</w:t>
+      </w:r>
+    </w:p>
+    <w:p>
+      <w:pPr>
+        <w:pStyle w:val="ListParagraph"/>
+        <w:widowControl/>
+        <w:spacing w:after="40"/>
+      </w:pPr>
+      <w:r>
+        <w:t>S21a, Software Currency: All software components actively maintained with no end-of-life versions.</w:t>
+      </w:r>
+    </w:p>
+    <w:p>
+      <w:pPr>
+        <w:pStyle w:val="ListParagraph"/>
+        <w:widowControl/>
+        <w:spacing w:after="40"/>
+      </w:pPr>
+      <w:r>
+        <w:t>S22a, Breach History: Historical data breach exposure and notification readiness.</w:t>
+      </w:r>
+    </w:p>
+    <w:p>
+      <w:pPr>
+        <w:pStyle w:val="ListParagraph"/>
+        <w:widowControl/>
+        <w:spacing w:after="40"/>
+      </w:pPr>
+      <w:r>
+        <w:t>S22b, Credential Exposure: Leaked credentials in public breach databases (Dehashed).</w:t>
       </w:r>
     </w:p>
     <w:p>
@@ -8938,97 +8938,97 @@
         <w:spacing w:after="40"/>
       </w:pPr>
       <w:r>
-        <w:t>Req 2a — Default Credentials: Checks for exposed admin panels that may use default or guessable credentials.</w:t>
-      </w:r>
-    </w:p>
-    <w:p>
-      <w:pPr>
-        <w:pStyle w:val="ListParagraph"/>
-        <w:widowControl/>
-        <w:spacing w:after="40"/>
-      </w:pPr>
-      <w:r>
-        <w:t>Req 2b — System Hardening: Security headers and information disclosure controls.</w:t>
-      </w:r>
-    </w:p>
-    <w:p>
-      <w:pPr>
-        <w:pStyle w:val="ListParagraph"/>
-        <w:widowControl/>
-        <w:spacing w:after="40"/>
-      </w:pPr>
-      <w:r>
-        <w:t>Req 2c — Security Policies: Presence of documented security policies (security.txt).</w:t>
-      </w:r>
-    </w:p>
-    <w:p>
-      <w:pPr>
-        <w:pStyle w:val="ListParagraph"/>
-        <w:widowControl/>
-        <w:spacing w:after="40"/>
-      </w:pPr>
-      <w:r>
-        <w:t>Req 4a — TLS Configuration: Strong TLS encryption for cardholder data transmission.</w:t>
-      </w:r>
-    </w:p>
-    <w:p>
-      <w:pPr>
-        <w:pStyle w:val="ListParagraph"/>
-        <w:widowControl/>
-        <w:spacing w:after="40"/>
-      </w:pPr>
-      <w:r>
-        <w:t>Req 4b — HTTPS Enforcement: All endpoints handling sensitive data served exclusively over HTTPS.</w:t>
-      </w:r>
-    </w:p>
-    <w:p>
-      <w:pPr>
-        <w:pStyle w:val="ListParagraph"/>
-        <w:widowControl/>
-        <w:spacing w:after="40"/>
-      </w:pPr>
-      <w:r>
-        <w:t>Req 6a — Patch Management: Software versions current with no known vulnerabilities.</w:t>
-      </w:r>
-    </w:p>
-    <w:p>
-      <w:pPr>
-        <w:pStyle w:val="ListParagraph"/>
-        <w:widowControl/>
-        <w:spacing w:after="40"/>
-      </w:pPr>
-      <w:r>
-        <w:t>Req 6b — Secure Coding: Secure application headers and web application protection.</w:t>
-      </w:r>
-    </w:p>
-    <w:p>
-      <w:pPr>
-        <w:pStyle w:val="ListParagraph"/>
-        <w:widowControl/>
-        <w:spacing w:after="40"/>
-      </w:pPr>
-      <w:r>
-        <w:t>Req 8a — Payment Security: PCI-compliant payment processing (third-party vs. self-hosted).</w:t>
-      </w:r>
-    </w:p>
-    <w:p>
-      <w:pPr>
-        <w:pStyle w:val="ListParagraph"/>
-        <w:widowControl/>
-        <w:spacing w:after="40"/>
-      </w:pPr>
-      <w:r>
-        <w:t>Req 11a — Vulnerability Scanning: External vulnerability scan results from Shodan CVE analysis.</w:t>
-      </w:r>
-    </w:p>
-    <w:p>
-      <w:pPr>
-        <w:pStyle w:val="ListParagraph"/>
-        <w:widowControl/>
-        <w:spacing w:after="40"/>
-      </w:pPr>
-      <w:r>
-        <w:t>Req 11b — Threat Monitoring: VirusTotal reputation and DNSBL blacklist monitoring.</w:t>
+        <w:t>Req 2a, Default Credentials: Checks for exposed admin panels that may use default or guessable credentials.</w:t>
+      </w:r>
+    </w:p>
+    <w:p>
+      <w:pPr>
+        <w:pStyle w:val="ListParagraph"/>
+        <w:widowControl/>
+        <w:spacing w:after="40"/>
+      </w:pPr>
+      <w:r>
+        <w:t>Req 2b, System Hardening: Security headers and information disclosure controls.</w:t>
+      </w:r>
+    </w:p>
+    <w:p>
+      <w:pPr>
+        <w:pStyle w:val="ListParagraph"/>
+        <w:widowControl/>
+        <w:spacing w:after="40"/>
+      </w:pPr>
+      <w:r>
+        <w:t>Req 2c, Security Policies: Presence of documented security policies (security.txt).</w:t>
+      </w:r>
+    </w:p>
+    <w:p>
+      <w:pPr>
+        <w:pStyle w:val="ListParagraph"/>
+        <w:widowControl/>
+        <w:spacing w:after="40"/>
+      </w:pPr>
+      <w:r>
+        <w:t>Req 4a, TLS Configuration: Strong TLS encryption for cardholder data transmission.</w:t>
+      </w:r>
+    </w:p>
+    <w:p>
+      <w:pPr>
+        <w:pStyle w:val="ListParagraph"/>
+        <w:widowControl/>
+        <w:spacing w:after="40"/>
+      </w:pPr>
+      <w:r>
+        <w:t>Req 4b, HTTPS Enforcement: All endpoints handling sensitive data served exclusively over HTTPS.</w:t>
+      </w:r>
+    </w:p>
+    <w:p>
+      <w:pPr>
+        <w:pStyle w:val="ListParagraph"/>
+        <w:widowControl/>
+        <w:spacing w:after="40"/>
+      </w:pPr>
+      <w:r>
+        <w:t>Req 6a, Patch Management: Software versions current with no known vulnerabilities.</w:t>
+      </w:r>
+    </w:p>
+    <w:p>
+      <w:pPr>
+        <w:pStyle w:val="ListParagraph"/>
+        <w:widowControl/>
+        <w:spacing w:after="40"/>
+      </w:pPr>
+      <w:r>
+        <w:t>Req 6b, Secure Coding: Secure application headers and web application protection.</w:t>
+      </w:r>
+    </w:p>
+    <w:p>
+      <w:pPr>
+        <w:pStyle w:val="ListParagraph"/>
+        <w:widowControl/>
+        <w:spacing w:after="40"/>
+      </w:pPr>
+      <w:r>
+        <w:t>Req 8a, Payment Security: PCI-compliant payment processing (third-party vs. self-hosted).</w:t>
+      </w:r>
+    </w:p>
+    <w:p>
+      <w:pPr>
+        <w:pStyle w:val="ListParagraph"/>
+        <w:widowControl/>
+        <w:spacing w:after="40"/>
+      </w:pPr>
+      <w:r>
+        <w:t>Req 11a, Vulnerability Scanning: External vulnerability scan results from Shodan CVE analysis.</w:t>
+      </w:r>
+    </w:p>
+    <w:p>
+      <w:pPr>
+        <w:pStyle w:val="ListParagraph"/>
+        <w:widowControl/>
+        <w:spacing w:after="40"/>
+      </w:pPr>
+      <w:r>
+        <w:t>Req 11b, Threat Monitoring: VirusTotal reputation and DNSBL blacklist monitoring.</w:t>
       </w:r>
     </w:p>
     <w:p>
@@ -9074,87 +9074,87 @@
         <w:spacing w:after="40"/>
       </w:pPr>
       <w:r>
-        <w:t>A.8a — Asset Inventory: Technology stack detection and external IP enumeration.</w:t>
-      </w:r>
-    </w:p>
-    <w:p>
-      <w:pPr>
-        <w:pStyle w:val="ListParagraph"/>
-        <w:widowControl/>
-        <w:spacing w:after="40"/>
-      </w:pPr>
-      <w:r>
-        <w:t>A.8b — Attack Surface: Subdomain discovery and attack surface mapping.</w:t>
-      </w:r>
-    </w:p>
-    <w:p>
-      <w:pPr>
-        <w:pStyle w:val="ListParagraph"/>
-        <w:widowControl/>
-        <w:spacing w:after="40"/>
-      </w:pPr>
-      <w:r>
-        <w:t>A.12a — Network Security: Open port analysis, DNS infrastructure, and service hardening.</w:t>
-      </w:r>
-    </w:p>
-    <w:p>
-      <w:pPr>
-        <w:pStyle w:val="ListParagraph"/>
-        <w:widowControl/>
-        <w:spacing w:after="40"/>
-      </w:pPr>
-      <w:r>
-        <w:t>A.12b — Remote Access: RDP, VPN, and remote access protocol security.</w:t>
-      </w:r>
-    </w:p>
-    <w:p>
-      <w:pPr>
-        <w:pStyle w:val="ListParagraph"/>
-        <w:widowControl/>
-        <w:spacing w:after="40"/>
-      </w:pPr>
-      <w:r>
-        <w:t>A.12c — Malware and Reputation: DNSBL blacklisting and VirusTotal malware detection.</w:t>
-      </w:r>
-    </w:p>
-    <w:p>
-      <w:pPr>
-        <w:pStyle w:val="ListParagraph"/>
-        <w:widowControl/>
-        <w:spacing w:after="40"/>
-      </w:pPr>
-      <w:r>
-        <w:t>A.12d — DDoS Resilience: WAF detection and CDN/cloud infrastructure.</w:t>
-      </w:r>
-    </w:p>
-    <w:p>
-      <w:pPr>
-        <w:pStyle w:val="ListParagraph"/>
-        <w:widowControl/>
-        <w:spacing w:after="40"/>
-      </w:pPr>
-      <w:r>
-        <w:t>A.14a — Encryption Standards: SSL/TLS configuration and certificate management.</w:t>
-      </w:r>
-    </w:p>
-    <w:p>
-      <w:pPr>
-        <w:pStyle w:val="ListParagraph"/>
-        <w:widowControl/>
-        <w:spacing w:after="40"/>
-      </w:pPr>
-      <w:r>
-        <w:t>A.14b — Application Security: HTTP security headers and web application hardening.</w:t>
-      </w:r>
-    </w:p>
-    <w:p>
-      <w:pPr>
-        <w:pStyle w:val="ListParagraph"/>
-        <w:widowControl/>
-        <w:spacing w:after="40"/>
-      </w:pPr>
-      <w:r>
-        <w:t>A.14c — Payment and Data Handling: Secure payment processing and information disclosure controls.</w:t>
+        <w:t>A.8a, Asset Inventory: Technology stack detection and external IP enumeration.</w:t>
+      </w:r>
+    </w:p>
+    <w:p>
+      <w:pPr>
+        <w:pStyle w:val="ListParagraph"/>
+        <w:widowControl/>
+        <w:spacing w:after="40"/>
+      </w:pPr>
+      <w:r>
+        <w:t>A.8b, Attack Surface: Subdomain discovery and attack surface mapping.</w:t>
+      </w:r>
+    </w:p>
+    <w:p>
+      <w:pPr>
+        <w:pStyle w:val="ListParagraph"/>
+        <w:widowControl/>
+        <w:spacing w:after="40"/>
+      </w:pPr>
+      <w:r>
+        <w:t>A.12a, Network Security: Open port analysis, DNS infrastructure, and service hardening.</w:t>
+      </w:r>
+    </w:p>
+    <w:p>
+      <w:pPr>
+        <w:pStyle w:val="ListParagraph"/>
+        <w:widowControl/>
+        <w:spacing w:after="40"/>
+      </w:pPr>
+      <w:r>
+        <w:t>A.12b, Remote Access: RDP, VPN, and remote access protocol security.</w:t>
+      </w:r>
+    </w:p>
+    <w:p>
+      <w:pPr>
+        <w:pStyle w:val="ListParagraph"/>
+        <w:widowControl/>
+        <w:spacing w:after="40"/>
+      </w:pPr>
+      <w:r>
+        <w:t>A.12c, Malware and Reputation: DNSBL blacklisting and VirusTotal malware detection.</w:t>
+      </w:r>
+    </w:p>
+    <w:p>
+      <w:pPr>
+        <w:pStyle w:val="ListParagraph"/>
+        <w:widowControl/>
+        <w:spacing w:after="40"/>
+      </w:pPr>
+      <w:r>
+        <w:t>A.12d, DDoS Resilience: WAF detection and CDN/cloud infrastructure.</w:t>
+      </w:r>
+    </w:p>
+    <w:p>
+      <w:pPr>
+        <w:pStyle w:val="ListParagraph"/>
+        <w:widowControl/>
+        <w:spacing w:after="40"/>
+      </w:pPr>
+      <w:r>
+        <w:t>A.14a, Encryption Standards: SSL/TLS configuration and certificate management.</w:t>
+      </w:r>
+    </w:p>
+    <w:p>
+      <w:pPr>
+        <w:pStyle w:val="ListParagraph"/>
+        <w:widowControl/>
+        <w:spacing w:after="40"/>
+      </w:pPr>
+      <w:r>
+        <w:t>A.14b, Application Security: HTTP security headers and web application hardening.</w:t>
+      </w:r>
+    </w:p>
+    <w:p>
+      <w:pPr>
+        <w:pStyle w:val="ListParagraph"/>
+        <w:widowControl/>
+        <w:spacing w:after="40"/>
+      </w:pPr>
+      <w:r>
+        <w:t>A.14c, Payment and Data Handling: Secure payment processing and information disclosure controls.</w:t>
       </w:r>
     </w:p>
     <w:p>
@@ -9177,7 +9177,7 @@
         <w:spacing w:after="80"/>
       </w:pPr>
       <w:r>
-        <w:t>NIST CSF 2.0 is the United States' voluntary cybersecurity framework, widely adopted globally. Version 2.0 (released February 2024) added a sixth function — Govern — to the original five. The framework organises cybersecurity activities into six core functions: Govern, Identify, Protect, Detect, Respond, and Recover.</w:t>
+        <w:t>NIST CSF 2.0 is the United States' voluntary cybersecurity framework, widely adopted globally. Version 2.0 (released February 2024) added a sixth function, Govern, to the original five. The framework organises cybersecurity activities into six core functions: Govern, Identify, Protect, Detect, Respond, and Recover.</w:t>
       </w:r>
     </w:p>
     <w:p>
@@ -9200,137 +9200,137 @@
         <w:spacing w:after="40"/>
       </w:pPr>
       <w:r>
-        <w:t>GOVERN — GV.1 Security Policy: Documented cybersecurity governance (security.txt).</w:t>
-      </w:r>
-    </w:p>
-    <w:p>
-      <w:pPr>
-        <w:pStyle w:val="ListParagraph"/>
-        <w:widowControl/>
-        <w:spacing w:after="40"/>
-      </w:pPr>
-      <w:r>
-        <w:t>GOVERN — GV.2 Privacy Governance: Privacy policy and data protection compliance.</w:t>
-      </w:r>
-    </w:p>
-    <w:p>
-      <w:pPr>
-        <w:pStyle w:val="ListParagraph"/>
-        <w:widowControl/>
-        <w:spacing w:after="40"/>
-      </w:pPr>
-      <w:r>
-        <w:t>IDENTIFY — ID.1 Asset Discovery: Technology stack and external IP inventory.</w:t>
-      </w:r>
-    </w:p>
-    <w:p>
-      <w:pPr>
-        <w:pStyle w:val="ListParagraph"/>
-        <w:widowControl/>
-        <w:spacing w:after="40"/>
-      </w:pPr>
-      <w:r>
-        <w:t>IDENTIFY — ID.2 Attack Surface Mapping: Subdomain discovery and information disclosure.</w:t>
-      </w:r>
-    </w:p>
-    <w:p>
-      <w:pPr>
-        <w:pStyle w:val="ListParagraph"/>
-        <w:widowControl/>
-        <w:spacing w:after="40"/>
-      </w:pPr>
-      <w:r>
-        <w:t>PROTECT — PR.1 Encryption and TLS: Data-in-transit protection.</w:t>
-      </w:r>
-    </w:p>
-    <w:p>
-      <w:pPr>
-        <w:pStyle w:val="ListParagraph"/>
-        <w:widowControl/>
-        <w:spacing w:after="40"/>
-      </w:pPr>
-      <w:r>
-        <w:t>PROTECT — PR.2 Security Headers and Hardening: HTTP hardening and web application security.</w:t>
-      </w:r>
-    </w:p>
-    <w:p>
-      <w:pPr>
-        <w:pStyle w:val="ListParagraph"/>
-        <w:widowControl/>
-        <w:spacing w:after="40"/>
-      </w:pPr>
-      <w:r>
-        <w:t>PROTECT — PR.3 Perimeter Defence: WAF, firewall rules, and remote access controls.</w:t>
-      </w:r>
-    </w:p>
-    <w:p>
-      <w:pPr>
-        <w:pStyle w:val="ListParagraph"/>
-        <w:widowControl/>
-        <w:spacing w:after="40"/>
-      </w:pPr>
-      <w:r>
-        <w:t>PROTECT — PR.4 Email Authentication: SPF, DMARC, DKIM, and MTA-STS.</w:t>
-      </w:r>
-    </w:p>
-    <w:p>
-      <w:pPr>
-        <w:pStyle w:val="ListParagraph"/>
-        <w:widowControl/>
-        <w:spacing w:after="40"/>
-      </w:pPr>
-      <w:r>
-        <w:t>DETECT — DE.1 Vulnerability Detection: Shodan CVE analysis and version-based vulnerability scanning.</w:t>
-      </w:r>
-    </w:p>
-    <w:p>
-      <w:pPr>
-        <w:pStyle w:val="ListParagraph"/>
-        <w:widowControl/>
-        <w:spacing w:after="40"/>
-      </w:pPr>
-      <w:r>
-        <w:t>DETECT — DE.2 Threat Intelligence: VirusTotal, DNSBL, and exposed admin detection.</w:t>
-      </w:r>
-    </w:p>
-    <w:p>
-      <w:pPr>
-        <w:pStyle w:val="ListParagraph"/>
-        <w:widowControl/>
-        <w:spacing w:after="40"/>
-      </w:pPr>
-      <w:r>
-        <w:t>RESPOND — RS.1 Breach Response: Historical breach exposure and credential leak monitoring.</w:t>
-      </w:r>
-    </w:p>
-    <w:p>
-      <w:pPr>
-        <w:pStyle w:val="ListParagraph"/>
-        <w:widowControl/>
-        <w:spacing w:after="40"/>
-      </w:pPr>
-      <w:r>
-        <w:t>RESPOND — RS.2 Security Disclosure: Published vulnerability disclosure policy.</w:t>
-      </w:r>
-    </w:p>
-    <w:p>
-      <w:pPr>
-        <w:pStyle w:val="ListParagraph"/>
-        <w:widowControl/>
-        <w:spacing w:after="40"/>
-      </w:pPr>
-      <w:r>
-        <w:t>RECOVER — RC.1 Infrastructure Resilience: DNS redundancy and CDN availability.</w:t>
-      </w:r>
-    </w:p>
-    <w:p>
-      <w:pPr>
-        <w:pStyle w:val="ListParagraph"/>
-        <w:widowControl/>
-        <w:spacing w:after="40"/>
-      </w:pPr>
-      <w:r>
-        <w:t>RECOVER — RC.2 Communication Recovery: Email infrastructure resilience.</w:t>
+        <w:t>GOVERN, GV.1 Security Policy: Documented cybersecurity governance (security.txt).</w:t>
+      </w:r>
+    </w:p>
+    <w:p>
+      <w:pPr>
+        <w:pStyle w:val="ListParagraph"/>
+        <w:widowControl/>
+        <w:spacing w:after="40"/>
+      </w:pPr>
+      <w:r>
+        <w:t>GOVERN, GV.2 Privacy Governance: Privacy policy and data protection compliance.</w:t>
+      </w:r>
+    </w:p>
+    <w:p>
+      <w:pPr>
+        <w:pStyle w:val="ListParagraph"/>
+        <w:widowControl/>
+        <w:spacing w:after="40"/>
+      </w:pPr>
+      <w:r>
+        <w:t>IDENTIFY, ID.1 Asset Discovery: Technology stack and external IP inventory.</w:t>
+      </w:r>
+    </w:p>
+    <w:p>
+      <w:pPr>
+        <w:pStyle w:val="ListParagraph"/>
+        <w:widowControl/>
+        <w:spacing w:after="40"/>
+      </w:pPr>
+      <w:r>
+        <w:t>IDENTIFY, ID.2 Attack Surface Mapping: Subdomain discovery and information disclosure.</w:t>
+      </w:r>
+    </w:p>
+    <w:p>
+      <w:pPr>
+        <w:pStyle w:val="ListParagraph"/>
+        <w:widowControl/>
+        <w:spacing w:after="40"/>
+      </w:pPr>
+      <w:r>
+        <w:t>PROTECT, PR.1 Encryption and TLS: Data-in-transit protection.</w:t>
+      </w:r>
+    </w:p>
+    <w:p>
+      <w:pPr>
+        <w:pStyle w:val="ListParagraph"/>
+        <w:widowControl/>
+        <w:spacing w:after="40"/>
+      </w:pPr>
+      <w:r>
+        <w:t>PROTECT, PR.2 Security Headers and Hardening: HTTP hardening and web application security.</w:t>
+      </w:r>
+    </w:p>
+    <w:p>
+      <w:pPr>
+        <w:pStyle w:val="ListParagraph"/>
+        <w:widowControl/>
+        <w:spacing w:after="40"/>
+      </w:pPr>
+      <w:r>
+        <w:t>PROTECT, PR.3 Perimeter Defence: WAF, firewall rules, and remote access controls.</w:t>
+      </w:r>
+    </w:p>
+    <w:p>
+      <w:pPr>
+        <w:pStyle w:val="ListParagraph"/>
+        <w:widowControl/>
+        <w:spacing w:after="40"/>
+      </w:pPr>
+      <w:r>
+        <w:t>PROTECT, PR.4 Email Authentication: SPF, DMARC, DKIM, and MTA-STS.</w:t>
+      </w:r>
+    </w:p>
+    <w:p>
+      <w:pPr>
+        <w:pStyle w:val="ListParagraph"/>
+        <w:widowControl/>
+        <w:spacing w:after="40"/>
+      </w:pPr>
+      <w:r>
+        <w:t>DETECT, DE.1 Vulnerability Detection: Shodan CVE analysis and version-based vulnerability scanning.</w:t>
+      </w:r>
+    </w:p>
+    <w:p>
+      <w:pPr>
+        <w:pStyle w:val="ListParagraph"/>
+        <w:widowControl/>
+        <w:spacing w:after="40"/>
+      </w:pPr>
+      <w:r>
+        <w:t>DETECT, DE.2 Threat Intelligence: VirusTotal, DNSBL, and exposed admin detection.</w:t>
+      </w:r>
+    </w:p>
+    <w:p>
+      <w:pPr>
+        <w:pStyle w:val="ListParagraph"/>
+        <w:widowControl/>
+        <w:spacing w:after="40"/>
+      </w:pPr>
+      <w:r>
+        <w:t>RESPOND, RS.1 Breach Response: Historical breach exposure and credential leak monitoring.</w:t>
+      </w:r>
+    </w:p>
+    <w:p>
+      <w:pPr>
+        <w:pStyle w:val="ListParagraph"/>
+        <w:widowControl/>
+        <w:spacing w:after="40"/>
+      </w:pPr>
+      <w:r>
+        <w:t>RESPOND, RS.2 Security Disclosure: Published vulnerability disclosure policy.</w:t>
+      </w:r>
+    </w:p>
+    <w:p>
+      <w:pPr>
+        <w:pStyle w:val="ListParagraph"/>
+        <w:widowControl/>
+        <w:spacing w:after="40"/>
+      </w:pPr>
+      <w:r>
+        <w:t>RECOVER, RC.1 Infrastructure Resilience: DNS redundancy and CDN availability.</w:t>
+      </w:r>
+    </w:p>
+    <w:p>
+      <w:pPr>
+        <w:pStyle w:val="ListParagraph"/>
+        <w:widowControl/>
+        <w:spacing w:after="40"/>
+      </w:pPr>
+      <w:r>
+        <w:t>RECOVER, RC.2 Communication Recovery: Email infrastructure resilience.</w:t>
       </w:r>
     </w:p>
     <w:p>
@@ -9353,7 +9353,7 @@
         <w:spacing w:after="80"/>
       </w:pPr>
       <w:r>
-        <w:t>The scanner uses a hybrid scoring approach for compliance assessment. Each sub-control (e.g. 'S19a — Encryption in Transit') receives a score of 0 to 100 derived from the checker or checkers that feed into it. If a sub-control is fed by multiple checkers, the scores are averaged. Each sub-control also carries a weight (typically 0.6 to 1.2) reflecting its relative importance within the framework. The framework's overall percentage is then the weighted average of all its sub-control scores.</w:t>
+        <w:t>The scanner uses a hybrid scoring approach for compliance assessment. Each sub-control (e.g. 'S19a: Encryption in Transit') receives a score of 0 to 100 derived from the checker or checkers that feed into it. If a sub-control is fed by multiple checkers, the scores are averaged. Each sub-control also carries a weight (typically 0.6 to 1.2) reflecting its relative importance within the framework. The framework's overall percentage is then the weighted average of all its sub-control scores.</w:t>
       </w:r>
     </w:p>
     <w:p>
@@ -9376,46 +9376,46 @@
         <w:spacing w:after="40"/>
       </w:pPr>
       <w:r>
-        <w:t>PASS (score 70 or above) — The control meets the expected standard based on external evidence.</w:t>
-      </w:r>
-    </w:p>
-    <w:p>
-      <w:pPr>
-        <w:pStyle w:val="ListParagraph"/>
-        <w:widowControl/>
-        <w:spacing w:after="40"/>
-      </w:pPr>
-      <w:r>
-        <w:t>PARTIAL (score 40 to 69) — The control is partially implemented but has gaps.</w:t>
-      </w:r>
-    </w:p>
-    <w:p>
-      <w:pPr>
-        <w:pStyle w:val="ListParagraph"/>
-        <w:widowControl/>
-        <w:spacing w:after="40"/>
-      </w:pPr>
-      <w:r>
-        <w:t>FAIL (score below 40) — The control is absent or critically deficient.</w:t>
-      </w:r>
-    </w:p>
-    <w:p>
-      <w:pPr>
-        <w:pStyle w:val="ListParagraph"/>
-        <w:widowControl/>
-        <w:spacing w:after="40"/>
-      </w:pPr>
-      <w:r>
-        <w:t>NO_DATA — The checker(s) feeding this control did not return data (e.g. paid API not configured, checker timed out). The control is excluded from the weighted average so it does not unfairly penalise the score.</w:t>
-      </w:r>
-    </w:p>
-    <w:p>
-      <w:pPr>
-        <w:widowControl/>
-        <w:spacing w:after="80"/>
-      </w:pPr>
-      <w:r>
-        <w:t>Because this is an external-only assessment (no internal network access, no agent installed, no interviews), the scanner typically covers 60 to 80 percent of each framework's controls. Controls that require internal assessment — such as access management policies, backup procedures, or physical security — cannot be evaluated externally and are marked as NO_DATA.</w:t>
+        <w:t>PASS (score 70 or above): The control meets the expected standard based on external evidence.</w:t>
+      </w:r>
+    </w:p>
+    <w:p>
+      <w:pPr>
+        <w:pStyle w:val="ListParagraph"/>
+        <w:widowControl/>
+        <w:spacing w:after="40"/>
+      </w:pPr>
+      <w:r>
+        <w:t>PARTIAL (score 40 to 69): The control is partially implemented but has gaps.</w:t>
+      </w:r>
+    </w:p>
+    <w:p>
+      <w:pPr>
+        <w:pStyle w:val="ListParagraph"/>
+        <w:widowControl/>
+        <w:spacing w:after="40"/>
+      </w:pPr>
+      <w:r>
+        <w:t>FAIL (score below 40): The control is absent or critically deficient.</w:t>
+      </w:r>
+    </w:p>
+    <w:p>
+      <w:pPr>
+        <w:pStyle w:val="ListParagraph"/>
+        <w:widowControl/>
+        <w:spacing w:after="40"/>
+      </w:pPr>
+      <w:r>
+        <w:t>NO_DATA: The checker(s) feeding this control did not return data (e.g. paid API not configured, checker timed out). The control is excluded from the weighted average so it does not unfairly penalise the score.</w:t>
+      </w:r>
+    </w:p>
+    <w:p>
+      <w:pPr>
+        <w:widowControl/>
+        <w:spacing w:after="80"/>
+      </w:pPr>
+      <w:r>
+        <w:t>Because this is an external-only assessment (no internal network access, no agent installed, no interviews), the scanner typically covers 60 to 80 percent of each framework's controls. Controls that require internal assessment, such as access management policies, backup procedures, or physical security, cannot be evaluated externally and are marked as NO_DATA.</w:t>
       </w:r>
     </w:p>
     <w:p>
@@ -9431,7 +9431,7 @@
         <w:t xml:space="preserve">WARNING: </w:t>
       </w:r>
       <w:r>
-        <w:t>The compliance percentages in this report are estimates based on externally observable evidence. They are not a substitute for a formal compliance audit. A PASS status on an external scan does not guarantee full compliance with the framework — internal controls must also be assessed. Use these results as a starting point and gap analysis tool, not as a certification claim.</w:t>
+        <w:t>The compliance percentages in this report are estimates based on externally observable evidence. They are not a substitute for a formal compliance audit. A PASS status on an external scan does not guarantee full compliance with the framework, internal controls must also be assessed. Use these results as a starting point and gap analysis tool, not as a certification claim.</w:t>
       </w:r>
     </w:p>
     <w:p>
@@ -9480,7 +9480,7 @@
         <w:spacing w:after="80"/>
       </w:pPr>
       <w:r>
-        <w:t>These analytics are designed to be used by insurance brokers, underwriters, and risk managers. They convert technical scan data into the language of insurance — probability, loss magnitude, confidence intervals, and risk reduction ROI.</w:t>
+        <w:t>These analytics are designed to be used by insurance brokers, underwriters, and risk managers. They convert technical scan data into the language of insurance, probability, loss magnitude, confidence intervals, and risk reduction ROI.</w:t>
       </w:r>
     </w:p>
     <w:p>
@@ -9544,7 +9544,7 @@
         <w:rPr>
           <w:b/>
         </w:rPr>
-        <w:t xml:space="preserve">Priority 1 — Critical signals (strongest ransomware indicators): </w:t>
+        <w:t xml:space="preserve">Priority 1, Critical signals (strongest ransomware indicators): </w:t>
       </w:r>
       <w:r/>
     </w:p>
@@ -9575,19 +9575,19 @@
         <w:spacing w:after="40"/>
       </w:pPr>
       <w:r>
-        <w:t>CISA KEV CVEs (Known Exploited Vulnerabilities): +0.08 per KEV CVE, capped at +0.20. These are vulnerabilities that CISA has confirmed are actively being exploited in the wild — they are not theoretical risks.</w:t>
-      </w:r>
-    </w:p>
-    <w:p>
-      <w:pPr>
-        <w:widowControl/>
-        <w:spacing w:after="80"/>
-      </w:pPr>
-      <w:r>
-        <w:rPr>
-          <w:b/>
-        </w:rPr>
-        <w:t xml:space="preserve">Priority 2 — High-impact signals: </w:t>
+        <w:t>CISA KEV CVEs (Known Exploited Vulnerabilities): +0.08 per KEV CVE, capped at +0.20. These are vulnerabilities that CISA has confirmed are actively being exploited in the wild, they are not theoretical risks.</w:t>
+      </w:r>
+    </w:p>
+    <w:p>
+      <w:pPr>
+        <w:widowControl/>
+        <w:spacing w:after="80"/>
+      </w:pPr>
+      <w:r>
+        <w:rPr>
+          <w:b/>
+        </w:rPr>
+        <w:t xml:space="preserve">Priority 2, High-impact signals: </w:t>
       </w:r>
       <w:r/>
     </w:p>
@@ -9640,7 +9640,7 @@
         <w:rPr>
           <w:b/>
         </w:rPr>
-        <w:t xml:space="preserve">Priority 3 — Contributing factors (hygiene indicators): </w:t>
+        <w:t xml:space="preserve">Priority 3, Contributing factors (hygiene indicators): </w:t>
       </w:r>
       <w:r/>
     </w:p>
@@ -9714,7 +9714,7 @@
         <w:spacing w:after="80"/>
       </w:pPr>
       <w:r>
-        <w:t>To prevent score inflation from stacking many moderate findings, the RSI applies a diminishing returns function above 0.50. Below 0.50, the score is linear (each factor adds its full value). Above 0.50, each additional increment contributes progressively less — the score approaches 1.0 asymptotically but never reaches it from moderate findings alone. This means an RSI above 0.75 requires genuinely critical issues (exposed RDP, KEV CVEs, active compromise), not just an accumulation of minor hygiene gaps.</w:t>
+        <w:t>To prevent score inflation from stacking many moderate findings, the RSI applies a diminishing returns function above 0.50. Below 0.50, the score is linear (each factor adds its full value). Above 0.50, each additional increment contributes progressively less, the score approaches 1.0 asymptotically but never reaches it from moderate findings alone. This means an RSI above 0.75 requires genuinely critical issues (exposed RDP, KEV CVEs, active compromise), not just an accumulation of minor hygiene gaps.</w:t>
       </w:r>
     </w:p>
     <w:p>
@@ -9813,7 +9813,7 @@
         <w:t xml:space="preserve">NOTE: </w:t>
       </w:r>
       <w:r>
-        <w:t>The RSI measures susceptibility to ransomware attack, not the probability of one occurring. An RSI of 0.60 does not mean there is a 60% chance of ransomware — it means the external attack surface has 60% of the observable characteristics that ransomware operators look for when selecting targets.</w:t>
+        <w:t>The RSI measures susceptibility to ransomware attack, not the probability of one occurring. An RSI of 0.60 does not mean there is a 60% chance of ransomware, it means the external attack surface has 60% of the observable characteristics that ransomware operators look for when selecting targets.</w:t>
       </w:r>
     </w:p>
     <w:p>
@@ -9836,7 +9836,7 @@
         <w:spacing w:after="80"/>
       </w:pPr>
       <w:r>
-        <w:t>The Data Breach Index is a 0 to 100 score that measures historical breach exposure and resilience. Unlike the RSI (where higher is worse), a higher DBI score is better — it indicates lower historical exposure and a more favourable breach profile. The DBI uses data from Have I Been Pwned (HIBP) breach records and Dehashed credential leak databases.</w:t>
+        <w:t>The Data Breach Index is a 0 to 100 score that measures historical breach exposure and resilience. Unlike the RSI (where higher is worse), a higher DBI score is better, it indicates lower historical exposure and a more favourable breach profile. The DBI uses data from Have I Been Pwned (HIBP) breach records and Dehashed credential leak databases.</w:t>
       </w:r>
     </w:p>
     <w:p>
@@ -9880,7 +9880,7 @@
         <w:t xml:space="preserve">2. Recency (maximum 20 points): </w:t>
       </w:r>
       <w:r>
-        <w:t>Measures how recently the most recent breach occurred. A breach within the last year scores 0 points — this is a current, active risk. A breach between one and three years ago scores 10 points. No breach in the last three years (or no breaches at all) scores the full 20 points. Recent breaches weigh more heavily because the compromised data is more likely to still be in active circulation.</w:t>
+        <w:t>Measures how recently the most recent breach occurred. A breach within the last year scores 0 points, this is a current, active risk. A breach between one and three years ago scores 10 points. No breach in the last three years (or no breaches at all) scores the full 20 points. Recent breaches weigh more heavily because the compromised data is more likely to still be in active circulation.</w:t>
       </w:r>
     </w:p>
     <w:p>
@@ -9895,7 +9895,7 @@
         <w:t xml:space="preserve">3. Data Severity (maximum 15 points): </w:t>
       </w:r>
       <w:r>
-        <w:t>Evaluates what types of data were exposed. If breaches included passwords, credit card numbers, bank account numbers, social security numbers, or financial data, the score is 0 points — these are the most damaging data classes. If only email addresses were exposed, the score is 10 points. No data exposed at all scores the full 15 points.</w:t>
+        <w:t>Evaluates what types of data were exposed. If breaches included passwords, credit card numbers, bank account numbers, social security numbers, or financial data, the score is 0 points, these are the most damaging data classes. If only email addresses were exposed, the score is 10 points. No data exposed at all scores the full 15 points.</w:t>
       </w:r>
     </w:p>
     <w:p>
@@ -10005,7 +10005,7 @@
         <w:t xml:space="preserve">TIP: </w:t>
       </w:r>
       <w:r>
-        <w:t>A low DBI score does not mean a breach is inevitable — it means the organisation's historical exposure is high, which increases the probability of credential reuse attacks, phishing using leaked data, and repeat incidents. The most effective remediation is a forced password reset combined with mandatory multi-factor authentication.</w:t>
+        <w:t>A low DBI score does not mean a breach is inevitable, it means the organisation's historical exposure is high, which increases the probability of credential reuse attacks, phishing using leaked data, and repeat incidents. The most effective remediation is a forced password reset combined with mandatory multi-factor authentication.</w:t>
       </w:r>
     </w:p>
     <w:p>
@@ -10077,17 +10077,17 @@
         <w:spacing w:after="40"/>
       </w:pPr>
       <w:r>
-        <w:t>Revenue scaling with graduated elasticity — smaller organisations experience proportionally higher costs relative to revenue, while larger organisations benefit from economies of scale in incident response. The elasticity curve ensures that a R10 million-revenue company is not assigned the same absolute loss as a R500 million enterprise.</w:t>
-      </w:r>
-    </w:p>
-    <w:p>
-      <w:pPr>
-        <w:pStyle w:val="ListParagraph"/>
-        <w:widowControl/>
-        <w:spacing w:after="40"/>
-      </w:pPr>
-      <w:r>
-        <w:t>Industry multiplier with graduated severity — high-risk industries (financial services, healthcare, legal) receive a graduated uplift reflecting their higher regulatory exposure, data sensitivity, and historical claims frequency.</w:t>
+        <w:t>Revenue scaling with graduated elasticity, smaller organisations experience proportionally higher costs relative to revenue, while larger organisations benefit from economies of scale in incident response. The elasticity curve ensures that a R10 million-revenue company is not assigned the same absolute loss as a R500 million enterprise.</w:t>
+      </w:r>
+    </w:p>
+    <w:p>
+      <w:pPr>
+        <w:pStyle w:val="ListParagraph"/>
+        <w:widowControl/>
+        <w:spacing w:after="40"/>
+      </w:pPr>
+      <w:r>
+        <w:t>Industry multiplier with graduated severity, high-risk industries (financial services, healthcare, legal) receive a graduated uplift reflecting their higher regulatory exposure, data sensitivity, and historical claims frequency.</w:t>
       </w:r>
     </w:p>
     <w:p>
@@ -10146,17 +10146,17 @@
         <w:spacing w:after="40"/>
       </w:pPr>
       <w:r>
-        <w:t>C4: Ransom/extortion — set at 10.40% of total breach magnitude, proportional to the IBM SA data decomposition. This component is only activated for ransomware-family incidents.</w:t>
-      </w:r>
-    </w:p>
-    <w:p>
-      <w:pPr>
-        <w:pStyle w:val="ListParagraph"/>
-        <w:widowControl/>
-        <w:spacing w:after="40"/>
-      </w:pPr>
-      <w:r>
-        <w:t>C5: Incident response — forensics, containment, eradication, and recovery costs. Tiered by organisation size: smaller companies face relatively higher IR costs (fewer internal resources), while larger companies benefit from retained IR relationships and internal SOC capabilities.</w:t>
+        <w:t>C4: Ransom/extortion, set at 10.40% of total breach magnitude, proportional to the IBM SA data decomposition. This component is only activated for ransomware-family incidents.</w:t>
+      </w:r>
+    </w:p>
+    <w:p>
+      <w:pPr>
+        <w:pStyle w:val="ListParagraph"/>
+        <w:widowControl/>
+        <w:spacing w:after="40"/>
+      </w:pPr>
+      <w:r>
+        <w:t>C5: Incident response, forensics, containment, eradication, and recovery costs. Tiered by organisation size: smaller companies face relatively higher IR costs (fewer internal resources), while larger companies benefit from retained IR relationships and internal SOC capabilities.</w:t>
       </w:r>
     </w:p>
     <w:p>
@@ -10449,47 +10449,47 @@
         <w:spacing w:after="40"/>
       </w:pPr>
       <w:r>
-        <w:t>Most Likely (mode) — the peak of the loss distribution; the single most probable annual loss outcome.</w:t>
-      </w:r>
-    </w:p>
-    <w:p>
-      <w:pPr>
-        <w:pStyle w:val="ListParagraph"/>
-        <w:widowControl/>
-        <w:spacing w:after="40"/>
-      </w:pPr>
-      <w:r>
-        <w:t>Median (P50) — half of all simulated outcomes fall below this figure. Reasonable anchor for premium-rating calculations.</w:t>
-      </w:r>
-    </w:p>
-    <w:p>
-      <w:pPr>
-        <w:pStyle w:val="ListParagraph"/>
-        <w:widowControl/>
-        <w:spacing w:after="40"/>
-      </w:pPr>
-      <w:r>
-        <w:t>Severe event (P99 severity) — the severity of a single severe event at the 99th percentile of the severity distribution, conditional on a severe event occurring. A cover-sizing figure (how large a severe loss could be), NOT an annual frequency. Standard reinsurance / underwriting convention; reported under the 1-in-100 cover tier.</w:t>
-      </w:r>
-    </w:p>
-    <w:p>
-      <w:pPr>
-        <w:pStyle w:val="ListParagraph"/>
-        <w:widowControl/>
-        <w:spacing w:after="40"/>
-      </w:pPr>
-      <w:r>
-        <w:t>Extreme event (P99.5 severity) — the next severity tier, aligned with the FSCA SAM (Solvency Assessment and Management) regime's catastrophe benchmark; reported under the 1-in-200 cover tier.</w:t>
-      </w:r>
-    </w:p>
-    <w:p>
-      <w:pPr>
-        <w:pStyle w:val="ListParagraph"/>
-        <w:widowControl/>
-        <w:spacing w:after="40"/>
-      </w:pPr>
-      <w:r>
-        <w:t>Catastrophic event (P99.6 severity) — the extreme severity tier and the standard SAM / reinsurance catastrophe benchmark (reported as 1-in-250), GPD-fitted from the right tail of the severity distribution.</w:t>
+        <w:t>Most Likely (mode), the peak of the loss distribution; the single most probable annual loss outcome.</w:t>
+      </w:r>
+    </w:p>
+    <w:p>
+      <w:pPr>
+        <w:pStyle w:val="ListParagraph"/>
+        <w:widowControl/>
+        <w:spacing w:after="40"/>
+      </w:pPr>
+      <w:r>
+        <w:t>Median (P50), half of all simulated outcomes fall below this figure. Reasonable anchor for premium-rating calculations.</w:t>
+      </w:r>
+    </w:p>
+    <w:p>
+      <w:pPr>
+        <w:pStyle w:val="ListParagraph"/>
+        <w:widowControl/>
+        <w:spacing w:after="40"/>
+      </w:pPr>
+      <w:r>
+        <w:t>Severe event (P99 severity), the severity of a single severe event at the 99th percentile of the severity distribution, conditional on a severe event occurring. A cover-sizing figure (how large a severe loss could be), NOT an annual frequency. Standard reinsurance / underwriting convention; reported under the 1-in-100 cover tier.</w:t>
+      </w:r>
+    </w:p>
+    <w:p>
+      <w:pPr>
+        <w:pStyle w:val="ListParagraph"/>
+        <w:widowControl/>
+        <w:spacing w:after="40"/>
+      </w:pPr>
+      <w:r>
+        <w:t>Extreme event (P99.5 severity), the next severity tier, aligned with the FSCA SAM (Solvency Assessment and Management) regime's catastrophe benchmark; reported under the 1-in-200 cover tier.</w:t>
+      </w:r>
+    </w:p>
+    <w:p>
+      <w:pPr>
+        <w:pStyle w:val="ListParagraph"/>
+        <w:widowControl/>
+        <w:spacing w:after="40"/>
+      </w:pPr>
+      <w:r>
+        <w:t>Catastrophic event (P99.6 severity), the extreme severity tier and the standard SAM / reinsurance catastrophe benchmark (reported as 1-in-250), GPD-fitted from the right tail of the severity distribution.</w:t>
       </w:r>
     </w:p>
     <w:p>
@@ -10505,7 +10505,7 @@
         <w:t xml:space="preserve">NOTE: </w:t>
       </w:r>
       <w:r>
-        <w:t>Headline consistency: wherever a single 'Estimated Annual Loss' figure is shown (the broker-summary tile, the executive deck headline, and the Attacker's-View data-impact line), it is the Median (P50) — the same value as the Median row above. It is NOT the probability-weighted mean (expected annual loss / ALE), which for a right-skewed loss distribution sits below the median and would otherwise disagree with every other headline figure.</w:t>
+        <w:t>Headline consistency: wherever a single 'Estimated Annual Loss' figure is shown (the broker-summary tile, the executive deck headline, and the Attacker's-View data-impact line), it is the Median (P50), the same value as the Median row above. It is NOT the probability-weighted mean (expected annual loss / ALE), which for a right-skewed loss distribution sits below the median and would otherwise disagree with every other headline figure.</w:t>
       </w:r>
     </w:p>
     <w:p>
@@ -11383,7 +11383,7 @@
         <w:spacing w:after="80"/>
       </w:pPr>
       <w:r>
-        <w:t>Auto-detection sources: JSE-listed company is detected from a curated list of ~50 JSE-listed entities plus a footer ticker scrape ('JSE: TICKER' pattern). Accountable institution is inferred from the FS / Legal Services / Real Estate sub-industry mapping (per FIC Act Schedule 1). B2C and PCI are inferred from consumer-facing sub-industry labels plus a broad commerce-signal pass over the homepage — payment-gateway names (incl. SA-local gateways), card-input field markers, storefront / checkout UI text, structured-data product markers, and e-commerce platform fingerprints (an e-commerce platform implies card processing, so it satisfies PCI as well as B2C). Healthcare sub-detail is keyword-classified from domain and page title (medical_scheme / pharmacy / pharma / hospital_clinic).</w:t>
+        <w:t>Auto-detection sources: JSE-listed company is detected from a curated list of ~50 JSE-listed entities plus a footer ticker scrape ('JSE: TICKER' pattern). Accountable institution is inferred from the FS / Legal Services / Real Estate sub-industry mapping (per FIC Act Schedule 1). B2C and PCI are inferred from consumer-facing sub-industry labels plus a broad commerce-signal pass over the homepage, payment-gateway names (incl. SA-local gateways), card-input field markers, storefront / checkout UI text, structured-data product markers, and e-commerce platform fingerprints (an e-commerce platform implies card processing, so it satisfies PCI as well as B2C). Healthcare sub-detail is keyword-classified from domain and page title (medical_scheme / pharmacy / pharma / hospital_clinic).</w:t>
       </w:r>
     </w:p>
     <w:p>
@@ -11633,7 +11633,7 @@
         <w:t xml:space="preserve">WARNING: </w:t>
       </w:r>
       <w:r>
-        <w:t>The breach cost anchor (R49.22 million) and component proportions are derived from IBM 2025 SA-specific data. The ransomware recovery time and vector weights use Sophos SA 2025 survey data. These are calibrated averages — actual costs will vary based on data sensitivity, regulatory jurisdiction, organisation size, and incident response readiness.</w:t>
+        <w:t>The breach cost anchor (R49.22 million) and component proportions are derived from IBM 2025 SA-specific data. The ransomware recovery time and vector weights use Sophos SA 2025 survey data. These are calibrated averages, actual costs will vary based on data sensitivity, regulatory jurisdiction, organisation size, and incident response readiness.</w:t>
       </w:r>
     </w:p>
     <w:p>
@@ -11680,27 +11680,27 @@
         <w:spacing w:after="40"/>
       </w:pPr>
       <w:r>
-        <w:t>P1 (Critical) — RSI reduction of 0.10 or more per step. These are the findings that contribute the most to ransomware susceptibility. Examples: blocking exposed RDP, firewalling exposed databases, patching CISA KEV CVEs. Address within 14 days.</w:t>
-      </w:r>
-    </w:p>
-    <w:p>
-      <w:pPr>
-        <w:pStyle w:val="ListParagraph"/>
-        <w:widowControl/>
-        <w:spacing w:after="40"/>
-      </w:pPr>
-      <w:r>
-        <w:t>P2 (High) — RSI reduction of 0.05 to 0.09 per step. Significant security improvements that should be addressed within 30 days. Examples: deploying a WAF, implementing DMARC, resetting leaked credentials.</w:t>
-      </w:r>
-    </w:p>
-    <w:p>
-      <w:pPr>
-        <w:pStyle w:val="ListParagraph"/>
-        <w:widowControl/>
-        <w:spacing w:after="40"/>
-      </w:pPr>
-      <w:r>
-        <w:t>P3 (Medium) — RSI reduction below 0.05 per step. Hygiene improvements to address within 90 days. Examples: updating EOL software, creating a security.txt file, resolving DNSBL blacklisting.</w:t>
+        <w:t>P1 (Critical): RSI reduction of 0.10 or more per step. These are the findings that contribute the most to ransomware susceptibility. Examples: blocking exposed RDP, firewalling exposed databases, patching CISA KEV CVEs. Address within 14 days.</w:t>
+      </w:r>
+    </w:p>
+    <w:p>
+      <w:pPr>
+        <w:pStyle w:val="ListParagraph"/>
+        <w:widowControl/>
+        <w:spacing w:after="40"/>
+      </w:pPr>
+      <w:r>
+        <w:t>P2 (High): RSI reduction of 0.05 to 0.09 per step. Significant security improvements that should be addressed within 30 days. Examples: deploying a WAF, implementing DMARC, resetting leaked credentials.</w:t>
+      </w:r>
+    </w:p>
+    <w:p>
+      <w:pPr>
+        <w:pStyle w:val="ListParagraph"/>
+        <w:widowControl/>
+        <w:spacing w:after="40"/>
+      </w:pPr>
+      <w:r>
+        <w:t>P3 (Medium): RSI reduction below 0.05 per step. Hygiene improvements to address within 90 days. Examples: updating EOL software, creating a security.txt file, resolving DNSBL blacklisting.</w:t>
       </w:r>
     </w:p>
     <w:p>
@@ -11723,7 +11723,7 @@
         <w:spacing w:after="80"/>
       </w:pPr>
       <w:r>
-        <w:t>Each remediation step includes an indicative cost range in South African Rand (ZAR). These are based on typical SA market rates for the type of work involved and are intended as a conversation starter for budgeting discussions — they are not project quotes. Actual costs will depend on the complexity of the environment, the service provider chosen, and whether in-house resources are available.</w:t>
+        <w:t>Each remediation step includes an indicative cost range in South African Rand (ZAR). These are based on typical SA market rates for the type of work involved and are intended as a conversation starter for budgeting discussions, they are not project quotes. Actual costs will depend on the complexity of the environment, the service provider chosen, and whether in-house resources are available.</w:t>
       </w:r>
     </w:p>
     <w:p>
@@ -11853,7 +11853,7 @@
         <w:spacing w:after="80"/>
       </w:pPr>
       <w:r>
-        <w:t>The 0.70 factor is a conservatism adjustment — it acknowledges that not all of the modelled financial benefit will materialise perfectly in practice. This prevents over-promising on savings.</w:t>
+        <w:t>The 0.70 factor is a conservatism adjustment, it acknowledges that not all of the modelled financial benefit will materialise perfectly in practice. This prevents over-promising on savings.</w:t>
       </w:r>
     </w:p>
     <w:p>
@@ -11885,7 +11885,7 @@
         <w:spacing w:after="80"/>
       </w:pPr>
       <w:r>
-        <w:t>The total potential savings figure represents the aggregate annual financial benefit of completing all remediation steps. This figure is particularly valuable for justifying cybersecurity budgets to executive management and boards — it translates security improvements into a return-on-investment narrative.</w:t>
+        <w:t>The total potential savings figure represents the aggregate annual financial benefit of completing all remediation steps. This figure is particularly valuable for justifying cybersecurity budgets to executive management and boards, it translates security improvements into a return-on-investment narrative.</w:t>
       </w:r>
     </w:p>
     <w:p>
@@ -12057,7 +12057,7 @@
         <w:spacing w:after="80"/>
       </w:pPr>
       <w:r>
-        <w:t>A four-phase narrative that walks the reader through how an attacker would exploit the findings discovered during the scan. The phases are: (1) Reconnaissance -- what an attacker can learn from publicly available information about the target, (2) Weaponisation -- how discovered vulnerabilities and leaked credentials could be combined into an attack toolkit, (3) Delivery &amp; Exploitation -- the most likely attack vectors such as phishing with leaked credentials, exploiting unpatched services, or abusing misconfigured email authentication, and (4) Impact -- the realistic business consequences including data exfiltration, ransomware deployment, business email compromise, and financial loss. Each phase references specific findings from the scan to ground the narrative in evidence.</w:t>
+        <w:t>A four-phase narrative that walks the reader through how an attacker would exploit the findings discovered during the scan. The phases are: (1) Reconnaissance, what an attacker can learn from publicly available information about the target, (2) Weaponisation, how discovered vulnerabilities and leaked credentials could be combined into an attack toolkit, (3) Delivery &amp; Exploitation, the most likely attack vectors such as phishing with leaked credentials, exploiting unpatched services, or abusing misconfigured email authentication, and (4) Impact, the realistic business consequences including data exfiltration, ransomware deployment, business email compromise, and financial loss. Each phase references specific findings from the scan to ground the narrative in evidence.</w:t>
       </w:r>
     </w:p>
     <w:p>
@@ -12213,57 +12213,57 @@
         <w:spacing w:after="40"/>
       </w:pPr>
       <w:r>
-        <w:t>Cover Page -- branded cover with target domain, scan date, and overall risk score gauge.</w:t>
-      </w:r>
-    </w:p>
-    <w:p>
-      <w:pPr>
-        <w:pStyle w:val="ListParagraph"/>
-        <w:widowControl/>
-        <w:spacing w:after="40"/>
-      </w:pPr>
-      <w:r>
-        <w:t>Executive Summary -- high-level risk posture with key metrics (overall score, critical issues, breach count, credential exposure, estimated financial impact range).</w:t>
-      </w:r>
-    </w:p>
-    <w:p>
-      <w:pPr>
-        <w:pStyle w:val="ListParagraph"/>
-        <w:widowControl/>
-        <w:spacing w:after="40"/>
-      </w:pPr>
-      <w:r>
-        <w:t>Vulnerability Posture -- simplified severity breakdown focusing on critical and high-severity findings only, with plain-language explanations.</w:t>
-      </w:r>
-    </w:p>
-    <w:p>
-      <w:pPr>
-        <w:pStyle w:val="ListParagraph"/>
-        <w:widowControl/>
-        <w:spacing w:after="40"/>
-      </w:pPr>
-      <w:r>
-        <w:t>Attacker's View -- abbreviated kill chain narrative highlighting the most impactful attack paths.</w:t>
-      </w:r>
-    </w:p>
-    <w:p>
-      <w:pPr>
-        <w:pStyle w:val="ListParagraph"/>
-        <w:widowControl/>
-        <w:spacing w:after="40"/>
-      </w:pPr>
-      <w:r>
-        <w:t>Financial Impact Summary -- RSI score, DBI score, and hybrid-model estimated loss range presented in a broker-friendly format with clear rand-value ranges.</w:t>
-      </w:r>
-    </w:p>
-    <w:p>
-      <w:pPr>
-        <w:pStyle w:val="ListParagraph"/>
-        <w:widowControl/>
-        <w:spacing w:after="40"/>
-      </w:pPr>
-      <w:r>
-        <w:t>'Why This Matters' Section -- a persuasive closing section with a call to action explaining why the client should engage further, including statistics on breach likelihood, average breach costs, and the value of proactive remediation.</w:t>
+        <w:t>Cover Page, branded cover with target domain, scan date, and overall risk score gauge.</w:t>
+      </w:r>
+    </w:p>
+    <w:p>
+      <w:pPr>
+        <w:pStyle w:val="ListParagraph"/>
+        <w:widowControl/>
+        <w:spacing w:after="40"/>
+      </w:pPr>
+      <w:r>
+        <w:t>Executive Summary, high-level risk posture with key metrics (overall score, critical issues, breach count, credential exposure, estimated financial impact range).</w:t>
+      </w:r>
+    </w:p>
+    <w:p>
+      <w:pPr>
+        <w:pStyle w:val="ListParagraph"/>
+        <w:widowControl/>
+        <w:spacing w:after="40"/>
+      </w:pPr>
+      <w:r>
+        <w:t>Vulnerability Posture, simplified severity breakdown focusing on critical and high-severity findings only, with plain-language explanations.</w:t>
+      </w:r>
+    </w:p>
+    <w:p>
+      <w:pPr>
+        <w:pStyle w:val="ListParagraph"/>
+        <w:widowControl/>
+        <w:spacing w:after="40"/>
+      </w:pPr>
+      <w:r>
+        <w:t>Attacker's View, abbreviated kill chain narrative highlighting the most impactful attack paths.</w:t>
+      </w:r>
+    </w:p>
+    <w:p>
+      <w:pPr>
+        <w:pStyle w:val="ListParagraph"/>
+        <w:widowControl/>
+        <w:spacing w:after="40"/>
+      </w:pPr>
+      <w:r>
+        <w:t>Financial Impact Summary, RSI score, DBI score, and hybrid-model estimated loss range presented in a broker-friendly format with clear rand-value ranges.</w:t>
+      </w:r>
+    </w:p>
+    <w:p>
+      <w:pPr>
+        <w:pStyle w:val="ListParagraph"/>
+        <w:widowControl/>
+        <w:spacing w:after="40"/>
+      </w:pPr>
+      <w:r>
+        <w:t>'Why This Matters' Section, a persuasive closing section with a call to action explaining why the client should engage further, including statistics on breach likelihood, average breach costs, and the value of proactive remediation.</w:t>
       </w:r>
     </w:p>
     <w:p>
@@ -12326,27 +12326,27 @@
         <w:spacing w:after="40"/>
       </w:pPr>
       <w:r>
-        <w:t>Green circle -- No issues found or the configuration meets best-practice standards. No action required.</w:t>
-      </w:r>
-    </w:p>
-    <w:p>
-      <w:pPr>
-        <w:pStyle w:val="ListParagraph"/>
-        <w:widowControl/>
-        <w:spacing w:after="40"/>
-      </w:pPr>
-      <w:r>
-        <w:t>Amber circle -- Minor issues or partial implementation detected. Improvement is recommended but the risk is moderate.</w:t>
-      </w:r>
-    </w:p>
-    <w:p>
-      <w:pPr>
-        <w:pStyle w:val="ListParagraph"/>
-        <w:widowControl/>
-        <w:spacing w:after="40"/>
-      </w:pPr>
-      <w:r>
-        <w:t>Red circle -- Significant issues found that pose a material risk. Immediate remediation is strongly recommended.</w:t>
+        <w:t>Green circle: No issues found or the configuration meets best-practice standards. No action required.</w:t>
+      </w:r>
+    </w:p>
+    <w:p>
+      <w:pPr>
+        <w:pStyle w:val="ListParagraph"/>
+        <w:widowControl/>
+        <w:spacing w:after="40"/>
+      </w:pPr>
+      <w:r>
+        <w:t>Amber circle: Minor issues or partial implementation detected. Improvement is recommended but the risk is moderate.</w:t>
+      </w:r>
+    </w:p>
+    <w:p>
+      <w:pPr>
+        <w:pStyle w:val="ListParagraph"/>
+        <w:widowControl/>
+        <w:spacing w:after="40"/>
+      </w:pPr>
+      <w:r>
+        <w:t>Red circle: Significant issues found that pose a material risk. Immediate remediation is strongly recommended.</w:t>
       </w:r>
     </w:p>
     <w:p>
@@ -12378,47 +12378,47 @@
         <w:spacing w:after="40"/>
       </w:pPr>
       <w:r>
-        <w:t>Title Bar -- contains the traffic-light indicator, the checker name, and a one-line summary of the finding (e.g., 'SPF record is valid but could be stricter').</w:t>
-      </w:r>
-    </w:p>
-    <w:p>
-      <w:pPr>
-        <w:pStyle w:val="ListParagraph"/>
-        <w:widowControl/>
-        <w:spacing w:after="40"/>
-      </w:pPr>
-      <w:r>
-        <w:t>Data Table -- key-value rows showing the raw findings. For example, an SSL checker card might show rows for certificate issuer, expiry date, protocol versions supported, and cipher suite strength.</w:t>
-      </w:r>
-    </w:p>
-    <w:p>
-      <w:pPr>
-        <w:pStyle w:val="ListParagraph"/>
-        <w:widowControl/>
-        <w:spacing w:after="40"/>
-      </w:pPr>
-      <w:r>
-        <w:t>Issues / Fallback Message -- if issues were found, they are listed here with severity indicators. If no issues were found, a positive confirmation message is displayed instead (e.g., 'No issues detected. Configuration meets recommended standards.').</w:t>
-      </w:r>
-    </w:p>
-    <w:p>
-      <w:pPr>
-        <w:pStyle w:val="ListParagraph"/>
-        <w:widowControl/>
-        <w:spacing w:after="40"/>
-      </w:pPr>
-      <w:r>
-        <w:t>'What This Means' Narrative -- a plain-language paragraph explaining the significance of the findings for a non-technical reader. This section answers the question: 'Why should I care?'</w:t>
-      </w:r>
-    </w:p>
-    <w:p>
-      <w:pPr>
-        <w:pStyle w:val="ListParagraph"/>
-        <w:widowControl/>
-        <w:spacing w:after="40"/>
-      </w:pPr>
-      <w:r>
-        <w:t>'Recommended Actions' -- numbered steps the organisation should take to address any issues found. Actions are ordered by priority (highest impact first). Each action is written as a concrete, actionable instruction rather than a vague suggestion.</w:t>
+        <w:t>Title Bar, contains the traffic-light indicator, the checker name, and a one-line summary of the finding (e.g., 'SPF record is valid but could be stricter').</w:t>
+      </w:r>
+    </w:p>
+    <w:p>
+      <w:pPr>
+        <w:pStyle w:val="ListParagraph"/>
+        <w:widowControl/>
+        <w:spacing w:after="40"/>
+      </w:pPr>
+      <w:r>
+        <w:t>Data Table, key-value rows showing the raw findings. For example, an SSL checker card might show rows for certificate issuer, expiry date, protocol versions supported, and cipher suite strength.</w:t>
+      </w:r>
+    </w:p>
+    <w:p>
+      <w:pPr>
+        <w:pStyle w:val="ListParagraph"/>
+        <w:widowControl/>
+        <w:spacing w:after="40"/>
+      </w:pPr>
+      <w:r>
+        <w:t>Issues / Fallback Message, if issues were found, they are listed here with severity indicators. If no issues were found, a positive confirmation message is displayed instead (e.g., 'No issues detected. Configuration meets recommended standards.').</w:t>
+      </w:r>
+    </w:p>
+    <w:p>
+      <w:pPr>
+        <w:pStyle w:val="ListParagraph"/>
+        <w:widowControl/>
+        <w:spacing w:after="40"/>
+      </w:pPr>
+      <w:r>
+        <w:t>'What This Means' Narrative, a plain-language paragraph explaining the significance of the findings for a non-technical reader. This section answers the question: 'Why should I care?'</w:t>
+      </w:r>
+    </w:p>
+    <w:p>
+      <w:pPr>
+        <w:pStyle w:val="ListParagraph"/>
+        <w:widowControl/>
+        <w:spacing w:after="40"/>
+      </w:pPr>
+      <w:r>
+        <w:t>'Recommended Actions', numbered steps the organisation should take to address any issues found. Actions are ordered by priority (highest impact first). Each action is written as a concrete, actionable instruction rather than a vague suggestion.</w:t>
       </w:r>
     </w:p>
     <w:p>
@@ -12485,7 +12485,7 @@
         <w:spacing w:after="80"/>
       </w:pPr>
       <w:r>
-        <w:t>The scanner surfaces leaked credentials (DeHashed), active infostealer infections (Hudson Rock, with infection dates), and dark-web / forum circulation (IntelX or replacement). Because this is sensitive personal information, it is disclosed in TIERS by audience, and the complete unmasked detail — including the actual passwords — is delivered only on request, with the client's signed consent, as an encrypted file. This exposure is already circulating in the public / criminal domain; the scanner re-surfaces it solely so the organisation can remediate (force resets, enforce MFA).</w:t>
+        <w:t>The scanner surfaces leaked credentials (DeHashed), active infostealer infections (Hudson Rock, with infection dates), and dark-web / forum circulation (IntelX or replacement). Because this is sensitive personal information, it is disclosed in TIERS by audience, and the complete unmasked detail, including the actual passwords, is delivered only on request, with the client's signed consent, as an encrypted file. This exposure is already circulating in the public / criminal domain; the scanner re-surfaces it solely so the organisation can remediate (force resets, enforce MFA).</w:t>
       </w:r>
     </w:p>
     <w:p>
@@ -12510,58 +12510,58 @@
         <w:spacing w:after="40"/>
       </w:pPr>
       <w:r>
-        <w:t>Executive Deck — counts only (number of exposed accounts, infected devices, services). No identifiers.</w:t>
-      </w:r>
-    </w:p>
-    <w:p>
-      <w:pPr>
-        <w:pStyle w:val="ListParagraph"/>
-        <w:widowControl/>
-        <w:spacing w:after="40"/>
-      </w:pPr>
-      <w:r>
-        <w:t>Broker Summary — 2-3 partially-masked example accounts / services plus summarised counts. No passwords.</w:t>
-      </w:r>
-    </w:p>
-    <w:p>
-      <w:pPr>
-        <w:pStyle w:val="ListParagraph"/>
-        <w:widowControl/>
-        <w:spacing w:after="40"/>
-      </w:pPr>
-      <w:r>
-        <w:t>Full Technical Report — enumerated, partially-masked accounts, a per-service summary, infection dates, and stealer families. No passwords.</w:t>
-      </w:r>
-    </w:p>
-    <w:p>
-      <w:pPr>
-        <w:pStyle w:val="ListParagraph"/>
-        <w:widowControl/>
-        <w:spacing w:after="40"/>
-      </w:pPr>
-      <w:r>
-        <w:t>Encrypted Credential Export (on request) — the complete list INCLUDING actual passwords, delivered as an encrypted file after signed client consent. Never stored on the scanner; generated on demand.</w:t>
-      </w:r>
-    </w:p>
-    <w:p>
-      <w:pPr>
-        <w:widowControl/>
-        <w:spacing w:after="80"/>
-      </w:pPr>
-      <w:r>
-        <w:t>Masking uses a partial reveal (first two plus last character of the local part, e.g. 'jo***n@example.com') so the organisation can recognise its own accounts — demonstrating the findings are real — while an outsider cannot reconstruct them.</w:t>
-      </w:r>
-    </w:p>
-    <w:p>
-      <w:pPr>
-        <w:widowControl/>
-        <w:spacing w:after="80"/>
-      </w:pPr>
-      <w:r>
-        <w:rPr>
-          <w:b/>
-        </w:rPr>
-        <w:t xml:space="preserve">Export file format — date-clustered, with a confidence column: </w:t>
+        <w:t>Executive Deck: counts only (number of exposed accounts, infected devices, services). No identifiers.</w:t>
+      </w:r>
+    </w:p>
+    <w:p>
+      <w:pPr>
+        <w:pStyle w:val="ListParagraph"/>
+        <w:widowControl/>
+        <w:spacing w:after="40"/>
+      </w:pPr>
+      <w:r>
+        <w:t>Broker Summary: 2-3 partially-masked example accounts / services plus summarised counts. No passwords.</w:t>
+      </w:r>
+    </w:p>
+    <w:p>
+      <w:pPr>
+        <w:pStyle w:val="ListParagraph"/>
+        <w:widowControl/>
+        <w:spacing w:after="40"/>
+      </w:pPr>
+      <w:r>
+        <w:t>Full Technical Report: enumerated, partially-masked accounts, a per-service summary, infection dates, and stealer families. No passwords.</w:t>
+      </w:r>
+    </w:p>
+    <w:p>
+      <w:pPr>
+        <w:pStyle w:val="ListParagraph"/>
+        <w:widowControl/>
+        <w:spacing w:after="40"/>
+      </w:pPr>
+      <w:r>
+        <w:t>Encrypted Credential Export (on request): the complete list INCLUDING actual passwords, delivered as an encrypted file after signed client consent. Never stored on the scanner; generated on demand.</w:t>
+      </w:r>
+    </w:p>
+    <w:p>
+      <w:pPr>
+        <w:widowControl/>
+        <w:spacing w:after="80"/>
+      </w:pPr>
+      <w:r>
+        <w:t>Masking uses a partial reveal (first two plus last character of the local part, e.g. 'jo***n@example.com') so the organisation can recognise its own accounts, demonstrating the findings are real, while an outsider cannot reconstruct them.</w:t>
+      </w:r>
+    </w:p>
+    <w:p>
+      <w:pPr>
+        <w:widowControl/>
+        <w:spacing w:after="80"/>
+      </w:pPr>
+      <w:r>
+        <w:rPr>
+          <w:b/>
+        </w:rPr>
+        <w:t xml:space="preserve">Export file format, date-clustered, with a confidence column: </w:t>
       </w:r>
       <w:r>
         <w:t>The encrypted CSV is sorted newest-first and carries the same recency clustering the dashboard shows, so the client can act on the freshest circulation first. Columns: record_type, source, date, recency_band, match_type, confidence, email, username, password, hashed_password, note. Two record types appear in the one file: 'credential' (a DeHashed leak record, which may include a password) and 'leak_reference' (an IntelX stealer-log posting that references the domain). Each credential inherits its source's breach-date guesstimate and recency band; note that this is a per-SOURCE date, not a per-record date (DeHashed records carry no reliable individual date).</w:t>
@@ -12576,10 +12576,10 @@
         <w:rPr>
           <w:b/>
         </w:rPr>
-        <w:t xml:space="preserve">The confidence column — and why it governs breach-probability decisions: </w:t>
-      </w:r>
-      <w:r>
-        <w:t>Not every hit is a stolen credential, and the confidence column makes that explicit. HIGH = a secret was actually captured (a plaintext password, or an Autofill / Passwords / credit-card store in a stealer log). MEDIUM = session data (cookies) or a hashed password. LOW = the site was merely referenced (a browser-History entry) or the domain appears in an aggregated multi-domain dump that lists thousands of sites. The distinction is decisive for underwriting: a LOW-confidence match is a MONITORING signal, not evidence of compromise, and should NOT on its own be read as raising the breach probability. To act on a low-confidence hit — or to justify any uplift to the probability of breach / RSI — request a content-fetch of the specific named dump to confirm whether a phishield credential (not just a visited URL) was actually exposed.</w:t>
+        <w:t xml:space="preserve">The confidence column, and why it governs breach-probability decisions: </w:t>
+      </w:r>
+      <w:r>
+        <w:t>Not every hit is a stolen credential, and the confidence column makes that explicit. HIGH = a secret was actually captured (a plaintext password, or an Autofill / Passwords / credit-card store in a stealer log). MEDIUM = session data (cookies) or a hashed password. LOW = the site was merely referenced (a browser-History entry) or the domain appears in an aggregated multi-domain dump that lists thousands of sites. The distinction is decisive for underwriting: a LOW-confidence match is a MONITORING signal, not evidence of compromise, and should NOT on its own be read as raising the breach probability. To act on a low-confidence hit, or to justify any uplift to the probability of breach / RSI, request a content-fetch of the specific named dump to confirm whether a phishield credential (not just a visited URL) was actually exposed.</w:t>
       </w:r>
     </w:p>
     <w:p>
@@ -12595,7 +12595,7 @@
         <w:t xml:space="preserve">NOTE: </w:t>
       </w:r>
       <w:r>
-        <w:t>Worked example: a domain may show recent (30-90 day) leak references that are ALL low-confidence (aggregated indexes plus a single browser-History entry), while its only high-confidence rows are years-old password records from a re-circulated combo list. The honest reading is 'recently CIRCULATING, but no fresh high-confidence theft' — the catastrophe model is unaffected, but the probability-of-breach input should not be inflated by the low-confidence freshness alone.</w:t>
+        <w:t>Worked example: a domain may show recent (30-90 day) leak references that are ALL low-confidence (aggregated indexes plus a single browser-History entry), while its only high-confidence rows are years-old password records from a re-circulated combo list. The honest reading is 'recently CIRCULATING, but no fresh high-confidence theft', the catastrophe model is unaffected, but the probability-of-breach input should not be inflated by the low-confidence freshness alone.</w:t>
       </w:r>
     </w:p>
     <w:p>
@@ -12618,17 +12618,17 @@
         <w:spacing w:after="40"/>
       </w:pPr>
       <w:r>
-        <w:t>1. Obtain the client's SIGNED CONSENT form and upload it — this is the authorisation gate and the FAIS / POPIA audit trail.</w:t>
-      </w:r>
-    </w:p>
-    <w:p>
-      <w:pPr>
-        <w:pStyle w:val="ListParagraph"/>
-        <w:widowControl/>
-        <w:spacing w:after="40"/>
-      </w:pPr>
-      <w:r>
-        <w:t>2. Obtain the client's age PUBLIC key (the client generates it — see below). A public key is safe to share openly.</w:t>
+        <w:t>1. Obtain the client's SIGNED CONSENT form and upload it, this is the authorisation gate and the FAIS / POPIA audit trail.</w:t>
+      </w:r>
+    </w:p>
+    <w:p>
+      <w:pPr>
+        <w:pStyle w:val="ListParagraph"/>
+        <w:widowControl/>
+        <w:spacing w:after="40"/>
+      </w:pPr>
+      <w:r>
+        <w:t>2. Obtain the client's age PUBLIC key (the client generates it, see below). A public key is safe to share openly.</w:t>
       </w:r>
     </w:p>
     <w:p>
@@ -12670,7 +12670,7 @@
         <w:rPr>
           <w:b/>
         </w:rPr>
-        <w:t xml:space="preserve">Client guide — one-time setup (age, recommended): </w:t>
+        <w:t xml:space="preserve">Client guide, one-time setup (age, recommended): </w:t>
       </w:r>
       <w:r/>
     </w:p>
@@ -12701,19 +12701,19 @@
         <w:spacing w:after="40"/>
       </w:pPr>
       <w:r>
-        <w:t>Send ONLY the public key (the 'age1...' line) to your broker. Keep key.txt (the private key) secret and backed up — without it the file cannot be opened.</w:t>
-      </w:r>
-    </w:p>
-    <w:p>
-      <w:pPr>
-        <w:widowControl/>
-        <w:spacing w:after="80"/>
-      </w:pPr>
-      <w:r>
-        <w:rPr>
-          <w:b/>
-        </w:rPr>
-        <w:t xml:space="preserve">Client guide — retrieve &amp; decrypt: </w:t>
+        <w:t>Send ONLY the public key (the 'age1...' line) to your broker. Keep key.txt (the private key) secret and backed up, without it the file cannot be opened.</w:t>
+      </w:r>
+    </w:p>
+    <w:p>
+      <w:pPr>
+        <w:widowControl/>
+        <w:spacing w:after="80"/>
+      </w:pPr>
+      <w:r>
+        <w:rPr>
+          <w:b/>
+        </w:rPr>
+        <w:t xml:space="preserve">Client guide, retrieve &amp; decrypt: </w:t>
       </w:r>
       <w:r/>
     </w:p>
@@ -12760,7 +12760,7 @@
         <w:t xml:space="preserve">WARNING: </w:t>
       </w:r>
       <w:r>
-        <w:t>The encrypted export contains live passwords — treat it like any breach dump. Decrypt only on a secure workstation, action the password resets and MFA enrolment, then securely delete the file. The scanner itself never stores passwords, and none of the rendered reports (deck, broker summary, full report) ever contain passwords.</w:t>
+        <w:t>The encrypted export contains live passwords, treat it like any breach dump. Decrypt only on a secure workstation, action the password resets and MFA enrolment, then securely delete the file. The scanner itself never stores passwords, and none of the rendered reports (deck, broker summary, full report) ever contain passwords.</w:t>
       </w:r>
     </w:p>
     <w:p>
@@ -12776,7 +12776,7 @@
         <w:t xml:space="preserve">NOTE: </w:t>
       </w:r>
       <w:r>
-        <w:t>Why public-key (age) over a shared password: with age, only the client's private key — which never leaves them — can decrypt the file, so there is no secret to intercept in transit. A shared AES passphrase is offered only as a fallback and must travel on a channel separate from the file.</w:t>
+        <w:t>Why public-key (age) over a shared password: with age, only the client's private key, which never leaves them, can decrypt the file, so there is no secret to intercept in transit. A shared AES passphrase is offered only as a fallback and must travel on a channel separate from the file.</w:t>
       </w:r>
     </w:p>
     <w:p>
@@ -13280,17 +13280,17 @@
         <w:spacing w:after="40"/>
       </w:pPr>
       <w:r>
-        <w:t>Genuine failure (error or timeout) -- the checker attempted to run but could not complete. These are flagged with a warning indicator in the report, the checker's weight is redistributed, and a WARNING recommendation is injected advising a re-scan.</w:t>
-      </w:r>
-    </w:p>
-    <w:p>
-      <w:pPr>
-        <w:pStyle w:val="ListParagraph"/>
-        <w:widowControl/>
-        <w:spacing w:after="40"/>
-      </w:pPr>
-      <w:r>
-        <w:t>Intentionally skipped (no_api_key or disabled) -- the checker was not configured to run (e.g., the Dehashed API key was not provided, or IntelX was toggled off). These are excluded from the assessable checker count entirely and do not generate a warning. The weight is still redistributed, but no warning is shown because the omission was deliberate.</w:t>
+        <w:t>Genuine failure (error or timeout), the checker attempted to run but could not complete. These are flagged with a warning indicator in the report, the checker's weight is redistributed, and a WARNING recommendation is injected advising a re-scan.</w:t>
+      </w:r>
+    </w:p>
+    <w:p>
+      <w:pPr>
+        <w:pStyle w:val="ListParagraph"/>
+        <w:widowControl/>
+        <w:spacing w:after="40"/>
+      </w:pPr>
+      <w:r>
+        <w:t>Intentionally skipped (no_api_key or disabled), the checker was not configured to run (e.g., the Dehashed API key was not provided, or IntelX was toggled off). These are excluded from the assessable checker count entirely and do not generate a warning. The weight is still redistributed, but no warning is shown because the omission was deliberate.</w:t>
       </w:r>
     </w:p>
     <w:p>
@@ -13407,7 +13407,7 @@
         <w:t xml:space="preserve">TIP: </w:t>
       </w:r>
       <w:r>
-        <w:t>A completeness of 100% means every configured checker ran successfully. If completeness drops below 80%, consider re-scanning after a short delay -- transient API issues or rate limiting may have resolved.</w:t>
+        <w:t>A completeness of 100% means every configured checker ran successfully. If completeness drops below 80%, consider re-scanning after a short delay, transient API issues or rate limiting may have resolved.</w:t>
       </w:r>
     </w:p>
     <w:p>
@@ -13440,37 +13440,37 @@
         <w:spacing w:after="40"/>
       </w:pPr>
       <w:r>
-        <w:t>Scan completeness is below 100% -- one or more checkers failed, meaning the score is based on incomplete data. The missing checkers may have detected additional risks or confirmed that certain controls are in place.</w:t>
-      </w:r>
-    </w:p>
-    <w:p>
-      <w:pPr>
-        <w:pStyle w:val="ListParagraph"/>
-        <w:widowControl/>
-        <w:spacing w:after="40"/>
-      </w:pPr>
-      <w:r>
-        <w:t>HTTPS was unreachable during the scan -- several checkers (HTTP headers, WAF detection, tech stack fingerprinting, privacy policy analysis, admin panel discovery) depend on being able to fetch the target's website over HTTPS. If the target site was temporarily down or blocking the scanner's IP, these checkers will fail. Verify that the target site is accessible before re-scanning.</w:t>
-      </w:r>
-    </w:p>
-    <w:p>
-      <w:pPr>
-        <w:pStyle w:val="ListParagraph"/>
-        <w:widowControl/>
-        <w:spacing w:after="40"/>
-      </w:pPr>
-      <w:r>
-        <w:t>Significant time has passed since the last scan -- because results reflect a point-in-time snapshot, scores can become stale as the target's infrastructure changes, new vulnerabilities are disclosed, or new breaches are reported. Regular re-scanning (monthly at minimum) is recommended.</w:t>
-      </w:r>
-    </w:p>
-    <w:p>
-      <w:pPr>
-        <w:pStyle w:val="ListParagraph"/>
-        <w:widowControl/>
-        <w:spacing w:after="40"/>
-      </w:pPr>
-      <w:r>
-        <w:t>Remediation has been applied -- after the target organisation addresses findings from a previous scan, a fresh scan should be performed to verify that remediation was effective and to update the score accordingly.</w:t>
+        <w:t>Scan completeness is below 100%, one or more checkers failed, meaning the score is based on incomplete data. The missing checkers may have detected additional risks or confirmed that certain controls are in place.</w:t>
+      </w:r>
+    </w:p>
+    <w:p>
+      <w:pPr>
+        <w:pStyle w:val="ListParagraph"/>
+        <w:widowControl/>
+        <w:spacing w:after="40"/>
+      </w:pPr>
+      <w:r>
+        <w:t>HTTPS was unreachable during the scan, several checkers (HTTP headers, WAF detection, tech stack fingerprinting, privacy policy analysis, admin panel discovery) depend on being able to fetch the target's website over HTTPS. If the target site was temporarily down or blocking the scanner's IP, these checkers will fail. Verify that the target site is accessible before re-scanning.</w:t>
+      </w:r>
+    </w:p>
+    <w:p>
+      <w:pPr>
+        <w:pStyle w:val="ListParagraph"/>
+        <w:widowControl/>
+        <w:spacing w:after="40"/>
+      </w:pPr>
+      <w:r>
+        <w:t>Significant time has passed since the last scan, because results reflect a point-in-time snapshot, scores can become stale as the target's infrastructure changes, new vulnerabilities are disclosed, or new breaches are reported. Regular re-scanning (monthly at minimum) is recommended.</w:t>
+      </w:r>
+    </w:p>
+    <w:p>
+      <w:pPr>
+        <w:pStyle w:val="ListParagraph"/>
+        <w:widowControl/>
+        <w:spacing w:after="40"/>
+      </w:pPr>
+      <w:r>
+        <w:t>Remediation has been applied, after the target organisation addresses findings from a previous scan, a fresh scan should be performed to verify that remediation was effective and to update the score accordingly.</w:t>
       </w:r>
     </w:p>
     <w:p>
@@ -13486,7 +13486,7 @@
         <w:t xml:space="preserve">NOTE: </w:t>
       </w:r>
       <w:r>
-        <w:t>The score is a risk indicator, not an absolute measure of security. A low score does not guarantee the absence of vulnerabilities -- it indicates that no significant external risks were detected by the checks performed.</w:t>
+        <w:t>The score is a risk indicator, not an absolute measure of security. A low score does not guarantee the absence of vulnerabilities, it indicates that no significant external risks were detected by the checks performed.</w:t>
       </w:r>
     </w:p>
     <w:p>
@@ -13870,7 +13870,7 @@
         <w:spacing w:after="40"/>
       </w:pPr>
       <w:r>
-        <w:t>What It Provides: Returns metadata about known data breaches affecting the target domain, including breach dates, the types of data exposed (emails, passwords, financial data, personal information), and the number of affected accounts. Does not return actual breach data -- only metadata about the breaches.</w:t>
+        <w:t>What It Provides: Returns metadata about known data breaches affecting the target domain, including breach dates, the types of data exposed (emails, passwords, financial data, personal information), and the number of affected accounts. Does not return actual breach data, only metadata about the breaches.</w:t>
       </w:r>
     </w:p>
     <w:p>
@@ -14055,7 +14055,7 @@
         <w:t xml:space="preserve">NOTE: </w:t>
       </w:r>
       <w:r>
-        <w:t>API keys are configured in the scanner's environment file. Toggling a paid API off does not affect the scan -- the checker is simply skipped and its weight is redistributed across the remaining checkers (see Section 7.2).</w:t>
+        <w:t>API keys are configured in the scanner's environment file. Toggling a paid API off does not affect the scan, the checker is simply skipped and its weight is redistributed across the remaining checkers (see Section 7.2).</w:t>
       </w:r>
     </w:p>
     <w:p>
@@ -15777,7 +15777,7 @@
         <w:rPr>
           <w:b/>
         </w:rPr>
-        <w:t>v1.0 -- April 2026</w:t>
+        <w:t>v1.0: April 2026</w:t>
       </w:r>
       <w:r>
         <w:t>Initial Release</w:t>

</xml_diff>